<commit_message>
Quitar las secciones de referencias y anexo del informe
El formato entregable las pide sólo "si es necesario", y el contenido del anexo
ya estaba cubierto: la sección 3.4 explica que el script acepta tanto el CSV como
el .xlsx, y la correspondencia entre secciones del código y del informe se
desprende de la numeración.

Corrige de paso el pie de página, que contaba la carátula en el total y mostraba
"Página 25 de 26" en la última hoja. Ahora usa el total de la sección numerada,
así que cierra en "Página 25 de 25".

El informe queda en 26 páginas y 6.139 palabras.

Co-Authored-By: Claude Opus 5 <noreply@anthropic.com>
Claude-Session: https://claude.ai/code/session_018vfs7VvBT9qprjGAATGNaL
</commit_message>
<xml_diff>
--- a/Informe TP2 - Analisis exploratorio de vinos.docx
+++ b/Informe TP2 - Analisis exploratorio de vinos.docx
@@ -100,7 +100,7 @@
     <w:sdt>
       <w:sdtPr>
         <w:alias w:val="Índice"/>
-        <w:id w:val="-1290741769"/>
+        <w:id w:val="2139840152"/>
       </w:sdtPr>
       <w:sdtEndPr/>
       <w:sdtContent>
@@ -126,7 +126,7 @@
           <w:r>
             <w:fldChar w:fldCharType="separate"/>
           </w:r>
-          <w:hyperlink w:anchor="_Toc240986648" w:history="1">
+          <w:hyperlink w:anchor="_Toc240991474" w:history="1">
             <w:r>
               <w:rPr>
                 <w:rStyle w:val="Hyperlink"/>
@@ -150,7 +150,7 @@
               <w:rPr>
                 <w:noProof/>
               </w:rPr>
-              <w:instrText xml:space="preserve"> PAGEREF _Toc240986648 \h </w:instrText>
+              <w:instrText xml:space="preserve"> PAGEREF _Toc240991474 \h </w:instrText>
             </w:r>
             <w:r>
               <w:rPr>
@@ -190,7 +190,7 @@
               <w14:ligatures w14:val="standardContextual"/>
             </w:rPr>
           </w:pPr>
-          <w:hyperlink w:anchor="_Toc240986649" w:history="1">
+          <w:hyperlink w:anchor="_Toc240991475" w:history="1">
             <w:r>
               <w:rPr>
                 <w:rStyle w:val="Hyperlink"/>
@@ -214,7 +214,7 @@
               <w:rPr>
                 <w:noProof/>
               </w:rPr>
-              <w:instrText xml:space="preserve"> PAGEREF _Toc240986649 \h </w:instrText>
+              <w:instrText xml:space="preserve"> PAGEREF _Toc240991475 \h </w:instrText>
             </w:r>
             <w:r>
               <w:rPr>
@@ -254,7 +254,7 @@
               <w14:ligatures w14:val="standardContextual"/>
             </w:rPr>
           </w:pPr>
-          <w:hyperlink w:anchor="_Toc240986650" w:history="1">
+          <w:hyperlink w:anchor="_Toc240991476" w:history="1">
             <w:r>
               <w:rPr>
                 <w:rStyle w:val="Hyperlink"/>
@@ -278,7 +278,7 @@
               <w:rPr>
                 <w:noProof/>
               </w:rPr>
-              <w:instrText xml:space="preserve"> PAGEREF _Toc240986650 \h </w:instrText>
+              <w:instrText xml:space="preserve"> PAGEREF _Toc240991476 \h </w:instrText>
             </w:r>
             <w:r>
               <w:rPr>
@@ -318,7 +318,7 @@
               <w14:ligatures w14:val="standardContextual"/>
             </w:rPr>
           </w:pPr>
-          <w:hyperlink w:anchor="_Toc240986651" w:history="1">
+          <w:hyperlink w:anchor="_Toc240991477" w:history="1">
             <w:r>
               <w:rPr>
                 <w:rStyle w:val="Hyperlink"/>
@@ -342,7 +342,7 @@
               <w:rPr>
                 <w:noProof/>
               </w:rPr>
-              <w:instrText xml:space="preserve"> PAGEREF _Toc240986651 \h </w:instrText>
+              <w:instrText xml:space="preserve"> PAGEREF _Toc240991477 \h </w:instrText>
             </w:r>
             <w:r>
               <w:rPr>
@@ -382,7 +382,7 @@
               <w14:ligatures w14:val="standardContextual"/>
             </w:rPr>
           </w:pPr>
-          <w:hyperlink w:anchor="_Toc240986652" w:history="1">
+          <w:hyperlink w:anchor="_Toc240991478" w:history="1">
             <w:r>
               <w:rPr>
                 <w:rStyle w:val="Hyperlink"/>
@@ -406,7 +406,7 @@
               <w:rPr>
                 <w:noProof/>
               </w:rPr>
-              <w:instrText xml:space="preserve"> PAGEREF _Toc240986652 \h </w:instrText>
+              <w:instrText xml:space="preserve"> PAGEREF _Toc240991478 \h </w:instrText>
             </w:r>
             <w:r>
               <w:rPr>
@@ -446,7 +446,7 @@
               <w14:ligatures w14:val="standardContextual"/>
             </w:rPr>
           </w:pPr>
-          <w:hyperlink w:anchor="_Toc240986653" w:history="1">
+          <w:hyperlink w:anchor="_Toc240991479" w:history="1">
             <w:r>
               <w:rPr>
                 <w:rStyle w:val="Hyperlink"/>
@@ -470,7 +470,7 @@
               <w:rPr>
                 <w:noProof/>
               </w:rPr>
-              <w:instrText xml:space="preserve"> PAGEREF _Toc240986653 \h </w:instrText>
+              <w:instrText xml:space="preserve"> PAGEREF _Toc240991479 \h </w:instrText>
             </w:r>
             <w:r>
               <w:rPr>
@@ -510,7 +510,7 @@
               <w14:ligatures w14:val="standardContextual"/>
             </w:rPr>
           </w:pPr>
-          <w:hyperlink w:anchor="_Toc240986654" w:history="1">
+          <w:hyperlink w:anchor="_Toc240991480" w:history="1">
             <w:r>
               <w:rPr>
                 <w:rStyle w:val="Hyperlink"/>
@@ -534,7 +534,7 @@
               <w:rPr>
                 <w:noProof/>
               </w:rPr>
-              <w:instrText xml:space="preserve"> PAGEREF _Toc240986654 \h </w:instrText>
+              <w:instrText xml:space="preserve"> PAGEREF _Toc240991480 \h </w:instrText>
             </w:r>
             <w:r>
               <w:rPr>
@@ -574,7 +574,7 @@
               <w14:ligatures w14:val="standardContextual"/>
             </w:rPr>
           </w:pPr>
-          <w:hyperlink w:anchor="_Toc240986655" w:history="1">
+          <w:hyperlink w:anchor="_Toc240991481" w:history="1">
             <w:r>
               <w:rPr>
                 <w:rStyle w:val="Hyperlink"/>
@@ -598,7 +598,7 @@
               <w:rPr>
                 <w:noProof/>
               </w:rPr>
-              <w:instrText xml:space="preserve"> PAGEREF _Toc240986655 \h </w:instrText>
+              <w:instrText xml:space="preserve"> PAGEREF _Toc240991481 \h </w:instrText>
             </w:r>
             <w:r>
               <w:rPr>
@@ -638,7 +638,7 @@
               <w14:ligatures w14:val="standardContextual"/>
             </w:rPr>
           </w:pPr>
-          <w:hyperlink w:anchor="_Toc240986656" w:history="1">
+          <w:hyperlink w:anchor="_Toc240991482" w:history="1">
             <w:r>
               <w:rPr>
                 <w:rStyle w:val="Hyperlink"/>
@@ -662,7 +662,7 @@
               <w:rPr>
                 <w:noProof/>
               </w:rPr>
-              <w:instrText xml:space="preserve"> PAGEREF _Toc240986656 \h </w:instrText>
+              <w:instrText xml:space="preserve"> PAGEREF _Toc240991482 \h </w:instrText>
             </w:r>
             <w:r>
               <w:rPr>
@@ -702,7 +702,7 @@
               <w14:ligatures w14:val="standardContextual"/>
             </w:rPr>
           </w:pPr>
-          <w:hyperlink w:anchor="_Toc240986657" w:history="1">
+          <w:hyperlink w:anchor="_Toc240991483" w:history="1">
             <w:r>
               <w:rPr>
                 <w:rStyle w:val="Hyperlink"/>
@@ -726,7 +726,7 @@
               <w:rPr>
                 <w:noProof/>
               </w:rPr>
-              <w:instrText xml:space="preserve"> PAGEREF _Toc240986657 \h </w:instrText>
+              <w:instrText xml:space="preserve"> PAGEREF _Toc240991483 \h </w:instrText>
             </w:r>
             <w:r>
               <w:rPr>
@@ -766,7 +766,7 @@
               <w14:ligatures w14:val="standardContextual"/>
             </w:rPr>
           </w:pPr>
-          <w:hyperlink w:anchor="_Toc240986658" w:history="1">
+          <w:hyperlink w:anchor="_Toc240991484" w:history="1">
             <w:r>
               <w:rPr>
                 <w:rStyle w:val="Hyperlink"/>
@@ -790,7 +790,7 @@
               <w:rPr>
                 <w:noProof/>
               </w:rPr>
-              <w:instrText xml:space="preserve"> PAGEREF _Toc240986658 \h </w:instrText>
+              <w:instrText xml:space="preserve"> PAGEREF _Toc240991484 \h </w:instrText>
             </w:r>
             <w:r>
               <w:rPr>
@@ -830,7 +830,7 @@
               <w14:ligatures w14:val="standardContextual"/>
             </w:rPr>
           </w:pPr>
-          <w:hyperlink w:anchor="_Toc240986659" w:history="1">
+          <w:hyperlink w:anchor="_Toc240991485" w:history="1">
             <w:r>
               <w:rPr>
                 <w:rStyle w:val="Hyperlink"/>
@@ -854,7 +854,7 @@
               <w:rPr>
                 <w:noProof/>
               </w:rPr>
-              <w:instrText xml:space="preserve"> PAGEREF _Toc240986659 \h </w:instrText>
+              <w:instrText xml:space="preserve"> PAGEREF _Toc240991485 \h </w:instrText>
             </w:r>
             <w:r>
               <w:rPr>
@@ -894,7 +894,7 @@
               <w14:ligatures w14:val="standardContextual"/>
             </w:rPr>
           </w:pPr>
-          <w:hyperlink w:anchor="_Toc240986660" w:history="1">
+          <w:hyperlink w:anchor="_Toc240991486" w:history="1">
             <w:r>
               <w:rPr>
                 <w:rStyle w:val="Hyperlink"/>
@@ -918,7 +918,7 @@
               <w:rPr>
                 <w:noProof/>
               </w:rPr>
-              <w:instrText xml:space="preserve"> PAGEREF _Toc240986660 \h </w:instrText>
+              <w:instrText xml:space="preserve"> PAGEREF _Toc240991486 \h </w:instrText>
             </w:r>
             <w:r>
               <w:rPr>
@@ -958,7 +958,7 @@
               <w14:ligatures w14:val="standardContextual"/>
             </w:rPr>
           </w:pPr>
-          <w:hyperlink w:anchor="_Toc240986661" w:history="1">
+          <w:hyperlink w:anchor="_Toc240991487" w:history="1">
             <w:r>
               <w:rPr>
                 <w:rStyle w:val="Hyperlink"/>
@@ -982,7 +982,7 @@
               <w:rPr>
                 <w:noProof/>
               </w:rPr>
-              <w:instrText xml:space="preserve"> PAGEREF _Toc240986661 \h </w:instrText>
+              <w:instrText xml:space="preserve"> PAGEREF _Toc240991487 \h </w:instrText>
             </w:r>
             <w:r>
               <w:rPr>
@@ -1022,7 +1022,7 @@
               <w14:ligatures w14:val="standardContextual"/>
             </w:rPr>
           </w:pPr>
-          <w:hyperlink w:anchor="_Toc240986662" w:history="1">
+          <w:hyperlink w:anchor="_Toc240991488" w:history="1">
             <w:r>
               <w:rPr>
                 <w:rStyle w:val="Hyperlink"/>
@@ -1046,7 +1046,7 @@
               <w:rPr>
                 <w:noProof/>
               </w:rPr>
-              <w:instrText xml:space="preserve"> PAGEREF _Toc240986662 \h </w:instrText>
+              <w:instrText xml:space="preserve"> PAGEREF _Toc240991488 \h </w:instrText>
             </w:r>
             <w:r>
               <w:rPr>
@@ -1086,7 +1086,7 @@
               <w14:ligatures w14:val="standardContextual"/>
             </w:rPr>
           </w:pPr>
-          <w:hyperlink w:anchor="_Toc240986663" w:history="1">
+          <w:hyperlink w:anchor="_Toc240991489" w:history="1">
             <w:r>
               <w:rPr>
                 <w:rStyle w:val="Hyperlink"/>
@@ -1110,7 +1110,7 @@
               <w:rPr>
                 <w:noProof/>
               </w:rPr>
-              <w:instrText xml:space="preserve"> PAGEREF _Toc240986663 \h </w:instrText>
+              <w:instrText xml:space="preserve"> PAGEREF _Toc240991489 \h </w:instrText>
             </w:r>
             <w:r>
               <w:rPr>
@@ -1150,7 +1150,7 @@
               <w14:ligatures w14:val="standardContextual"/>
             </w:rPr>
           </w:pPr>
-          <w:hyperlink w:anchor="_Toc240986664" w:history="1">
+          <w:hyperlink w:anchor="_Toc240991490" w:history="1">
             <w:r>
               <w:rPr>
                 <w:rStyle w:val="Hyperlink"/>
@@ -1174,7 +1174,7 @@
               <w:rPr>
                 <w:noProof/>
               </w:rPr>
-              <w:instrText xml:space="preserve"> PAGEREF _Toc240986664 \h </w:instrText>
+              <w:instrText xml:space="preserve"> PAGEREF _Toc240991490 \h </w:instrText>
             </w:r>
             <w:r>
               <w:rPr>
@@ -1214,7 +1214,7 @@
               <w14:ligatures w14:val="standardContextual"/>
             </w:rPr>
           </w:pPr>
-          <w:hyperlink w:anchor="_Toc240986665" w:history="1">
+          <w:hyperlink w:anchor="_Toc240991491" w:history="1">
             <w:r>
               <w:rPr>
                 <w:rStyle w:val="Hyperlink"/>
@@ -1238,7 +1238,7 @@
               <w:rPr>
                 <w:noProof/>
               </w:rPr>
-              <w:instrText xml:space="preserve"> PAGEREF _Toc240986665 \h </w:instrText>
+              <w:instrText xml:space="preserve"> PAGEREF _Toc240991491 \h </w:instrText>
             </w:r>
             <w:r>
               <w:rPr>
@@ -1278,7 +1278,7 @@
               <w14:ligatures w14:val="standardContextual"/>
             </w:rPr>
           </w:pPr>
-          <w:hyperlink w:anchor="_Toc240986666" w:history="1">
+          <w:hyperlink w:anchor="_Toc240991492" w:history="1">
             <w:r>
               <w:rPr>
                 <w:rStyle w:val="Hyperlink"/>
@@ -1302,7 +1302,7 @@
               <w:rPr>
                 <w:noProof/>
               </w:rPr>
-              <w:instrText xml:space="preserve"> PAGEREF _Toc240986666 \h </w:instrText>
+              <w:instrText xml:space="preserve"> PAGEREF _Toc240991492 \h </w:instrText>
             </w:r>
             <w:r>
               <w:rPr>
@@ -1342,7 +1342,7 @@
               <w14:ligatures w14:val="standardContextual"/>
             </w:rPr>
           </w:pPr>
-          <w:hyperlink w:anchor="_Toc240986667" w:history="1">
+          <w:hyperlink w:anchor="_Toc240991493" w:history="1">
             <w:r>
               <w:rPr>
                 <w:rStyle w:val="Hyperlink"/>
@@ -1366,7 +1366,7 @@
               <w:rPr>
                 <w:noProof/>
               </w:rPr>
-              <w:instrText xml:space="preserve"> PAGEREF _Toc240986667 \h </w:instrText>
+              <w:instrText xml:space="preserve"> PAGEREF _Toc240991493 \h </w:instrText>
             </w:r>
             <w:r>
               <w:rPr>
@@ -1406,7 +1406,7 @@
               <w14:ligatures w14:val="standardContextual"/>
             </w:rPr>
           </w:pPr>
-          <w:hyperlink w:anchor="_Toc240986668" w:history="1">
+          <w:hyperlink w:anchor="_Toc240991494" w:history="1">
             <w:r>
               <w:rPr>
                 <w:rStyle w:val="Hyperlink"/>
@@ -1430,7 +1430,7 @@
               <w:rPr>
                 <w:noProof/>
               </w:rPr>
-              <w:instrText xml:space="preserve"> PAGEREF _Toc240986668 \h </w:instrText>
+              <w:instrText xml:space="preserve"> PAGEREF _Toc240991494 \h </w:instrText>
             </w:r>
             <w:r>
               <w:rPr>
@@ -1470,7 +1470,7 @@
               <w14:ligatures w14:val="standardContextual"/>
             </w:rPr>
           </w:pPr>
-          <w:hyperlink w:anchor="_Toc240986669" w:history="1">
+          <w:hyperlink w:anchor="_Toc240991495" w:history="1">
             <w:r>
               <w:rPr>
                 <w:rStyle w:val="Hyperlink"/>
@@ -1494,7 +1494,7 @@
               <w:rPr>
                 <w:noProof/>
               </w:rPr>
-              <w:instrText xml:space="preserve"> PAGEREF _Toc240986669 \h </w:instrText>
+              <w:instrText xml:space="preserve"> PAGEREF _Toc240991495 \h </w:instrText>
             </w:r>
             <w:r>
               <w:rPr>
@@ -1534,7 +1534,7 @@
               <w14:ligatures w14:val="standardContextual"/>
             </w:rPr>
           </w:pPr>
-          <w:hyperlink w:anchor="_Toc240986670" w:history="1">
+          <w:hyperlink w:anchor="_Toc240991496" w:history="1">
             <w:r>
               <w:rPr>
                 <w:rStyle w:val="Hyperlink"/>
@@ -1558,7 +1558,7 @@
               <w:rPr>
                 <w:noProof/>
               </w:rPr>
-              <w:instrText xml:space="preserve"> PAGEREF _Toc240986670 \h </w:instrText>
+              <w:instrText xml:space="preserve"> PAGEREF _Toc240991496 \h </w:instrText>
             </w:r>
             <w:r>
               <w:rPr>
@@ -1598,7 +1598,7 @@
               <w14:ligatures w14:val="standardContextual"/>
             </w:rPr>
           </w:pPr>
-          <w:hyperlink w:anchor="_Toc240986671" w:history="1">
+          <w:hyperlink w:anchor="_Toc240991497" w:history="1">
             <w:r>
               <w:rPr>
                 <w:rStyle w:val="Hyperlink"/>
@@ -1622,7 +1622,7 @@
               <w:rPr>
                 <w:noProof/>
               </w:rPr>
-              <w:instrText xml:space="preserve"> PAGEREF _Toc240986671 \h </w:instrText>
+              <w:instrText xml:space="preserve"> PAGEREF _Toc240991497 \h </w:instrText>
             </w:r>
             <w:r>
               <w:rPr>
@@ -1662,7 +1662,7 @@
               <w14:ligatures w14:val="standardContextual"/>
             </w:rPr>
           </w:pPr>
-          <w:hyperlink w:anchor="_Toc240986672" w:history="1">
+          <w:hyperlink w:anchor="_Toc240991498" w:history="1">
             <w:r>
               <w:rPr>
                 <w:rStyle w:val="Hyperlink"/>
@@ -1686,7 +1686,7 @@
               <w:rPr>
                 <w:noProof/>
               </w:rPr>
-              <w:instrText xml:space="preserve"> PAGEREF _Toc240986672 \h </w:instrText>
+              <w:instrText xml:space="preserve"> PAGEREF _Toc240991498 \h </w:instrText>
             </w:r>
             <w:r>
               <w:rPr>
@@ -1726,7 +1726,7 @@
               <w14:ligatures w14:val="standardContextual"/>
             </w:rPr>
           </w:pPr>
-          <w:hyperlink w:anchor="_Toc240986673" w:history="1">
+          <w:hyperlink w:anchor="_Toc240991499" w:history="1">
             <w:r>
               <w:rPr>
                 <w:rStyle w:val="Hyperlink"/>
@@ -1750,7 +1750,7 @@
               <w:rPr>
                 <w:noProof/>
               </w:rPr>
-              <w:instrText xml:space="preserve"> PAGEREF _Toc240986673 \h </w:instrText>
+              <w:instrText xml:space="preserve"> PAGEREF _Toc240991499 \h </w:instrText>
             </w:r>
             <w:r>
               <w:rPr>
@@ -1790,7 +1790,7 @@
               <w14:ligatures w14:val="standardContextual"/>
             </w:rPr>
           </w:pPr>
-          <w:hyperlink w:anchor="_Toc240986674" w:history="1">
+          <w:hyperlink w:anchor="_Toc240991500" w:history="1">
             <w:r>
               <w:rPr>
                 <w:rStyle w:val="Hyperlink"/>
@@ -1814,7 +1814,7 @@
               <w:rPr>
                 <w:noProof/>
               </w:rPr>
-              <w:instrText xml:space="preserve"> PAGEREF _Toc240986674 \h </w:instrText>
+              <w:instrText xml:space="preserve"> PAGEREF _Toc240991500 \h </w:instrText>
             </w:r>
             <w:r>
               <w:rPr>
@@ -1854,7 +1854,7 @@
               <w14:ligatures w14:val="standardContextual"/>
             </w:rPr>
           </w:pPr>
-          <w:hyperlink w:anchor="_Toc240986675" w:history="1">
+          <w:hyperlink w:anchor="_Toc240991501" w:history="1">
             <w:r>
               <w:rPr>
                 <w:rStyle w:val="Hyperlink"/>
@@ -1878,7 +1878,7 @@
               <w:rPr>
                 <w:noProof/>
               </w:rPr>
-              <w:instrText xml:space="preserve"> PAGEREF _Toc240986675 \h </w:instrText>
+              <w:instrText xml:space="preserve"> PAGEREF _Toc240991501 \h </w:instrText>
             </w:r>
             <w:r>
               <w:rPr>
@@ -1918,7 +1918,7 @@
               <w14:ligatures w14:val="standardContextual"/>
             </w:rPr>
           </w:pPr>
-          <w:hyperlink w:anchor="_Toc240986676" w:history="1">
+          <w:hyperlink w:anchor="_Toc240991502" w:history="1">
             <w:r>
               <w:rPr>
                 <w:rStyle w:val="Hyperlink"/>
@@ -1942,7 +1942,7 @@
               <w:rPr>
                 <w:noProof/>
               </w:rPr>
-              <w:instrText xml:space="preserve"> PAGEREF _Toc240986676 \h </w:instrText>
+              <w:instrText xml:space="preserve"> PAGEREF _Toc240991502 \h </w:instrText>
             </w:r>
             <w:r>
               <w:rPr>
@@ -1982,7 +1982,7 @@
               <w14:ligatures w14:val="standardContextual"/>
             </w:rPr>
           </w:pPr>
-          <w:hyperlink w:anchor="_Toc240986677" w:history="1">
+          <w:hyperlink w:anchor="_Toc240991503" w:history="1">
             <w:r>
               <w:rPr>
                 <w:rStyle w:val="Hyperlink"/>
@@ -2006,7 +2006,7 @@
               <w:rPr>
                 <w:noProof/>
               </w:rPr>
-              <w:instrText xml:space="preserve"> PAGEREF _Toc240986677 \h </w:instrText>
+              <w:instrText xml:space="preserve"> PAGEREF _Toc240991503 \h </w:instrText>
             </w:r>
             <w:r>
               <w:rPr>
@@ -2046,7 +2046,7 @@
               <w14:ligatures w14:val="standardContextual"/>
             </w:rPr>
           </w:pPr>
-          <w:hyperlink w:anchor="_Toc240986678" w:history="1">
+          <w:hyperlink w:anchor="_Toc240991504" w:history="1">
             <w:r>
               <w:rPr>
                 <w:rStyle w:val="Hyperlink"/>
@@ -2070,7 +2070,7 @@
               <w:rPr>
                 <w:noProof/>
               </w:rPr>
-              <w:instrText xml:space="preserve"> PAGEREF _Toc240986678 \h </w:instrText>
+              <w:instrText xml:space="preserve"> PAGEREF _Toc240991504 \h </w:instrText>
             </w:r>
             <w:r>
               <w:rPr>
@@ -2110,7 +2110,7 @@
               <w14:ligatures w14:val="standardContextual"/>
             </w:rPr>
           </w:pPr>
-          <w:hyperlink w:anchor="_Toc240986679" w:history="1">
+          <w:hyperlink w:anchor="_Toc240991505" w:history="1">
             <w:r>
               <w:rPr>
                 <w:rStyle w:val="Hyperlink"/>
@@ -2134,7 +2134,7 @@
               <w:rPr>
                 <w:noProof/>
               </w:rPr>
-              <w:instrText xml:space="preserve"> PAGEREF _Toc240986679 \h </w:instrText>
+              <w:instrText xml:space="preserve"> PAGEREF _Toc240991505 \h </w:instrText>
             </w:r>
             <w:r>
               <w:rPr>
@@ -2152,134 +2152,6 @@
                 <w:noProof/>
               </w:rPr>
               <w:t>24</w:t>
-            </w:r>
-            <w:r>
-              <w:rPr>
-                <w:noProof/>
-              </w:rPr>
-              <w:fldChar w:fldCharType="end"/>
-            </w:r>
-          </w:hyperlink>
-        </w:p>
-        <w:p>
-          <w:pPr>
-            <w:pStyle w:val="TOC1"/>
-            <w:tabs>
-              <w:tab w:val="right" w:leader="dot" w:pos="9062"/>
-            </w:tabs>
-            <w:rPr>
-              <w:rFonts w:asciiTheme="minorHAnsi" w:eastAsiaTheme="minorEastAsia" w:hAnsiTheme="minorHAnsi" w:cstheme="minorBidi"/>
-              <w:noProof/>
-              <w:kern w:val="2"/>
-              <w14:ligatures w14:val="standardContextual"/>
-            </w:rPr>
-          </w:pPr>
-          <w:hyperlink w:anchor="_Toc240986680" w:history="1">
-            <w:r>
-              <w:rPr>
-                <w:rStyle w:val="Hyperlink"/>
-                <w:noProof/>
-              </w:rPr>
-              <w:t>9. Referencias</w:t>
-            </w:r>
-            <w:r>
-              <w:rPr>
-                <w:noProof/>
-              </w:rPr>
-              <w:tab/>
-            </w:r>
-            <w:r>
-              <w:rPr>
-                <w:noProof/>
-              </w:rPr>
-              <w:fldChar w:fldCharType="begin"/>
-            </w:r>
-            <w:r>
-              <w:rPr>
-                <w:noProof/>
-              </w:rPr>
-              <w:instrText xml:space="preserve"> PAGEREF _Toc240986680 \h </w:instrText>
-            </w:r>
-            <w:r>
-              <w:rPr>
-                <w:noProof/>
-              </w:rPr>
-            </w:r>
-            <w:r>
-              <w:rPr>
-                <w:noProof/>
-              </w:rPr>
-              <w:fldChar w:fldCharType="separate"/>
-            </w:r>
-            <w:r>
-              <w:rPr>
-                <w:noProof/>
-              </w:rPr>
-              <w:t>25</w:t>
-            </w:r>
-            <w:r>
-              <w:rPr>
-                <w:noProof/>
-              </w:rPr>
-              <w:fldChar w:fldCharType="end"/>
-            </w:r>
-          </w:hyperlink>
-        </w:p>
-        <w:p>
-          <w:pPr>
-            <w:pStyle w:val="TOC1"/>
-            <w:tabs>
-              <w:tab w:val="right" w:leader="dot" w:pos="9062"/>
-            </w:tabs>
-            <w:rPr>
-              <w:rFonts w:asciiTheme="minorHAnsi" w:eastAsiaTheme="minorEastAsia" w:hAnsiTheme="minorHAnsi" w:cstheme="minorBidi"/>
-              <w:noProof/>
-              <w:kern w:val="2"/>
-              <w14:ligatures w14:val="standardContextual"/>
-            </w:rPr>
-          </w:pPr>
-          <w:hyperlink w:anchor="_Toc240986681" w:history="1">
-            <w:r>
-              <w:rPr>
-                <w:rStyle w:val="Hyperlink"/>
-                <w:noProof/>
-              </w:rPr>
-              <w:t>Anexo. Estructura del script</w:t>
-            </w:r>
-            <w:r>
-              <w:rPr>
-                <w:noProof/>
-              </w:rPr>
-              <w:tab/>
-            </w:r>
-            <w:r>
-              <w:rPr>
-                <w:noProof/>
-              </w:rPr>
-              <w:fldChar w:fldCharType="begin"/>
-            </w:r>
-            <w:r>
-              <w:rPr>
-                <w:noProof/>
-              </w:rPr>
-              <w:instrText xml:space="preserve"> PAGEREF _Toc240986681 \h </w:instrText>
-            </w:r>
-            <w:r>
-              <w:rPr>
-                <w:noProof/>
-              </w:rPr>
-            </w:r>
-            <w:r>
-              <w:rPr>
-                <w:noProof/>
-              </w:rPr>
-              <w:fldChar w:fldCharType="separate"/>
-            </w:r>
-            <w:r>
-              <w:rPr>
-                <w:noProof/>
-              </w:rPr>
-              <w:t>26</w:t>
             </w:r>
             <w:r>
               <w:rPr>
@@ -2305,7 +2177,7 @@
       <w:pPr>
         <w:pStyle w:val="Heading1"/>
       </w:pPr>
-      <w:bookmarkStart w:id="0" w:name="_Toc240986648"/>
+      <w:bookmarkStart w:id="0" w:name="_Toc240991474"/>
       <w:r>
         <w:lastRenderedPageBreak/>
         <w:t>1. Introducción</w:t>
@@ -2362,7 +2234,7 @@
       <w:pPr>
         <w:pStyle w:val="Heading1"/>
       </w:pPr>
-      <w:bookmarkStart w:id="1" w:name="_Toc240986649"/>
+      <w:bookmarkStart w:id="1" w:name="_Toc240991475"/>
       <w:r>
         <w:t>2. Descripción del conjunto de datos</w:t>
       </w:r>
@@ -2434,7 +2306,7 @@
           <w:left w:w="10" w:type="dxa"/>
           <w:right w:w="10" w:type="dxa"/>
         </w:tblCellMar>
-        <w:tblLook w:val="04A0" w:firstRow="1" w:lastRow="0" w:firstColumn="1" w:lastColumn="0" w:noHBand="0" w:noVBand="1"/>
+        <w:tblLook w:val="0000" w:firstRow="0" w:lastRow="0" w:firstColumn="0" w:lastColumn="0" w:noHBand="0" w:noVBand="0"/>
       </w:tblPr>
       <w:tblGrid>
         <w:gridCol w:w="1996"/>
@@ -3526,7 +3398,7 @@
       <w:pPr>
         <w:pStyle w:val="Heading1"/>
       </w:pPr>
-      <w:bookmarkStart w:id="2" w:name="_Toc240986650"/>
+      <w:bookmarkStart w:id="2" w:name="_Toc240991476"/>
       <w:r>
         <w:t>3. Carga e integridad del archivo</w:t>
       </w:r>
@@ -3549,7 +3421,7 @@
       <w:pPr>
         <w:pStyle w:val="Heading2"/>
       </w:pPr>
-      <w:bookmarkStart w:id="3" w:name="_Toc240986651"/>
+      <w:bookmarkStart w:id="3" w:name="_Toc240991477"/>
       <w:r>
         <w:t>3.1. Delimitador de campos incorrecto</w:t>
       </w:r>
@@ -3589,7 +3461,7 @@
       <w:pPr>
         <w:pStyle w:val="Heading2"/>
       </w:pPr>
-      <w:bookmarkStart w:id="4" w:name="_Toc240986652"/>
+      <w:bookmarkStart w:id="4" w:name="_Toc240991478"/>
       <w:r>
         <w:t>3.2. Reseñas repartidas en varias filas</w:t>
       </w:r>
@@ -3608,7 +3480,7 @@
       <w:pPr>
         <w:pStyle w:val="Heading2"/>
       </w:pPr>
-      <w:bookmarkStart w:id="5" w:name="_Toc240986653"/>
+      <w:bookmarkStart w:id="5" w:name="_Toc240991479"/>
       <w:r>
         <w:t>3.3. Codificación de caracteres</w:t>
       </w:r>
@@ -3656,7 +3528,7 @@
       <w:pPr>
         <w:pStyle w:val="Heading2"/>
       </w:pPr>
-      <w:bookmarkStart w:id="6" w:name="_Toc240986654"/>
+      <w:bookmarkStart w:id="6" w:name="_Toc240991480"/>
       <w:r>
         <w:t>3.4. Verificación de la carga</w:t>
       </w:r>
@@ -3684,7 +3556,7 @@
       <w:pPr>
         <w:pStyle w:val="Heading1"/>
       </w:pPr>
-      <w:bookmarkStart w:id="7" w:name="_Toc240986655"/>
+      <w:bookmarkStart w:id="7" w:name="_Toc240991481"/>
       <w:r>
         <w:t>4. Análisis exploratorio</w:t>
       </w:r>
@@ -3694,7 +3566,7 @@
       <w:pPr>
         <w:pStyle w:val="Heading2"/>
       </w:pPr>
-      <w:bookmarkStart w:id="8" w:name="_Toc240986656"/>
+      <w:bookmarkStart w:id="8" w:name="_Toc240991482"/>
       <w:r>
         <w:t>4.1. Estructura y valores repetidos</w:t>
       </w:r>
@@ -3732,7 +3604,7 @@
       <w:pPr>
         <w:pStyle w:val="Heading2"/>
       </w:pPr>
-      <w:bookmarkStart w:id="9" w:name="_Toc240986657"/>
+      <w:bookmarkStart w:id="9" w:name="_Toc240991483"/>
       <w:r>
         <w:t>4.2. Resumen estadístico de las variables numéricas</w:t>
       </w:r>
@@ -3776,7 +3648,7 @@
           <w:left w:w="10" w:type="dxa"/>
           <w:right w:w="10" w:type="dxa"/>
         </w:tblCellMar>
-        <w:tblLook w:val="04A0" w:firstRow="1" w:lastRow="0" w:firstColumn="1" w:lastColumn="0" w:noHBand="0" w:noVBand="1"/>
+        <w:tblLook w:val="0000" w:firstRow="0" w:lastRow="0" w:firstColumn="0" w:lastColumn="0" w:noHBand="0" w:noVBand="0"/>
       </w:tblPr>
       <w:tblGrid>
         <w:gridCol w:w="3024"/>
@@ -4651,7 +4523,7 @@
       <w:pPr>
         <w:pStyle w:val="Heading2"/>
       </w:pPr>
-      <w:bookmarkStart w:id="10" w:name="_Toc240986658"/>
+      <w:bookmarkStart w:id="10" w:name="_Toc240991484"/>
       <w:r>
         <w:t>4.3. Resumen estadístico de las variables categóricas</w:t>
       </w:r>
@@ -4717,7 +4589,7 @@
           <w:left w:w="10" w:type="dxa"/>
           <w:right w:w="10" w:type="dxa"/>
         </w:tblCellMar>
-        <w:tblLook w:val="04A0" w:firstRow="1" w:lastRow="0" w:firstColumn="1" w:lastColumn="0" w:noHBand="0" w:noVBand="1"/>
+        <w:tblLook w:val="0000" w:firstRow="0" w:lastRow="0" w:firstColumn="0" w:lastColumn="0" w:noHBand="0" w:noVBand="0"/>
       </w:tblPr>
       <w:tblGrid>
         <w:gridCol w:w="1997"/>
@@ -6105,7 +5977,7 @@
         </w:rPr>
         <w:lastRenderedPageBreak/>
         <w:drawing>
-          <wp:inline distT="0" distB="0" distL="0" distR="0" wp14:anchorId="1D7C2009" wp14:editId="1D7C200A">
+          <wp:inline distT="0" distB="0" distL="0" distR="0" wp14:anchorId="30F24899" wp14:editId="30F2489A">
             <wp:extent cx="5715000" cy="3943350"/>
             <wp:effectExtent l="0" t="0" r="0" b="0"/>
             <wp:docPr id="1" name="Picture 1"/>
@@ -6197,7 +6069,7 @@
       <w:pPr>
         <w:pStyle w:val="Heading2"/>
       </w:pPr>
-      <w:bookmarkStart w:id="11" w:name="_Toc240986659"/>
+      <w:bookmarkStart w:id="11" w:name="_Toc240991485"/>
       <w:r>
         <w:t>4.4. Distribución de los puntajes</w:t>
       </w:r>
@@ -6215,10 +6087,10 @@
         </w:rPr>
         <w:lastRenderedPageBreak/>
         <w:drawing>
-          <wp:inline distT="0" distB="0" distL="0" distR="0" wp14:anchorId="1D7C200B" wp14:editId="1D7C200C">
+          <wp:inline distT="0" distB="0" distL="0" distR="0" wp14:anchorId="30F2489B" wp14:editId="30F2489C">
             <wp:extent cx="5715000" cy="3124200"/>
             <wp:effectExtent l="0" t="0" r="0" b="0"/>
-            <wp:docPr id="1762573998" name="Picture 1762573998"/>
+            <wp:docPr id="360262614" name="Picture 360262614"/>
             <wp:cNvGraphicFramePr>
               <a:graphicFrameLocks xmlns:a="http://schemas.openxmlformats.org/drawingml/2006/main" noChangeAspect="1"/>
             </wp:cNvGraphicFramePr>
@@ -6298,7 +6170,7 @@
       <w:pPr>
         <w:pStyle w:val="Heading2"/>
       </w:pPr>
-      <w:bookmarkStart w:id="12" w:name="_Toc240986660"/>
+      <w:bookmarkStart w:id="12" w:name="_Toc240991486"/>
       <w:r>
         <w:t>4.5. Distribución de los precios</w:t>
       </w:r>
@@ -6316,10 +6188,10 @@
         </w:rPr>
         <w:lastRenderedPageBreak/>
         <w:drawing>
-          <wp:inline distT="0" distB="0" distL="0" distR="0" wp14:anchorId="1D7C200D" wp14:editId="1D7C200E">
+          <wp:inline distT="0" distB="0" distL="0" distR="0" wp14:anchorId="30F2489D" wp14:editId="30F2489E">
             <wp:extent cx="5715000" cy="2466975"/>
             <wp:effectExtent l="0" t="0" r="0" b="0"/>
-            <wp:docPr id="467399338" name="Picture 467399338"/>
+            <wp:docPr id="2009641188" name="Picture 2009641188"/>
             <wp:cNvGraphicFramePr>
               <a:graphicFrameLocks xmlns:a="http://schemas.openxmlformats.org/drawingml/2006/main" noChangeAspect="1"/>
             </wp:cNvGraphicFramePr>
@@ -6409,7 +6281,7 @@
       <w:pPr>
         <w:pStyle w:val="Heading1"/>
       </w:pPr>
-      <w:bookmarkStart w:id="13" w:name="_Toc240986661"/>
+      <w:bookmarkStart w:id="13" w:name="_Toc240991487"/>
       <w:r>
         <w:t>5. Tratamiento de datos faltantes</w:t>
       </w:r>
@@ -6419,7 +6291,7 @@
       <w:pPr>
         <w:pStyle w:val="Heading2"/>
       </w:pPr>
-      <w:bookmarkStart w:id="14" w:name="_Toc240986662"/>
+      <w:bookmarkStart w:id="14" w:name="_Toc240991488"/>
       <w:r>
         <w:t>5.1. Cuantificación y co-ocurrencia</w:t>
       </w:r>
@@ -6436,10 +6308,10 @@
           <w:noProof/>
         </w:rPr>
         <w:drawing>
-          <wp:inline distT="0" distB="0" distL="0" distR="0" wp14:anchorId="1D7C200F" wp14:editId="1D7C2010">
+          <wp:inline distT="0" distB="0" distL="0" distR="0" wp14:anchorId="30F2489F" wp14:editId="30F248A0">
             <wp:extent cx="5715000" cy="2095500"/>
             <wp:effectExtent l="0" t="0" r="0" b="0"/>
-            <wp:docPr id="1254374338" name="Picture 1254374338"/>
+            <wp:docPr id="555709670" name="Picture 555709670"/>
             <wp:cNvGraphicFramePr>
               <a:graphicFrameLocks xmlns:a="http://schemas.openxmlformats.org/drawingml/2006/main" noChangeAspect="1"/>
             </wp:cNvGraphicFramePr>
@@ -6536,7 +6408,7 @@
           <w:left w:w="10" w:type="dxa"/>
           <w:right w:w="10" w:type="dxa"/>
         </w:tblCellMar>
-        <w:tblLook w:val="04A0" w:firstRow="1" w:lastRow="0" w:firstColumn="1" w:lastColumn="0" w:noHBand="0" w:noVBand="1"/>
+        <w:tblLook w:val="0000" w:firstRow="0" w:lastRow="0" w:firstColumn="0" w:lastColumn="0" w:noHBand="0" w:noVBand="0"/>
       </w:tblPr>
       <w:tblGrid>
         <w:gridCol w:w="3085"/>
@@ -7626,7 +7498,7 @@
       <w:pPr>
         <w:pStyle w:val="Heading2"/>
       </w:pPr>
-      <w:bookmarkStart w:id="15" w:name="_Toc240986663"/>
+      <w:bookmarkStart w:id="15" w:name="_Toc240991489"/>
       <w:r>
         <w:t>5.2. El faltante estructural como información</w:t>
       </w:r>
@@ -7668,7 +7540,7 @@
       <w:pPr>
         <w:pStyle w:val="Heading2"/>
       </w:pPr>
-      <w:bookmarkStart w:id="16" w:name="_Toc240986664"/>
+      <w:bookmarkStart w:id="16" w:name="_Toc240991490"/>
       <w:r>
         <w:t>5.3. Diagnóstico del mecanismo de ausencia del precio</w:t>
       </w:r>
@@ -7781,7 +7653,7 @@
           <w:left w:w="10" w:type="dxa"/>
           <w:right w:w="10" w:type="dxa"/>
         </w:tblCellMar>
-        <w:tblLook w:val="04A0" w:firstRow="1" w:lastRow="0" w:firstColumn="1" w:lastColumn="0" w:noHBand="0" w:noVBand="1"/>
+        <w:tblLook w:val="0000" w:firstRow="0" w:lastRow="0" w:firstColumn="0" w:lastColumn="0" w:noHBand="0" w:noVBand="0"/>
       </w:tblPr>
       <w:tblGrid>
         <w:gridCol w:w="3024"/>
@@ -8631,7 +8503,7 @@
       <w:pPr>
         <w:pStyle w:val="Heading2"/>
       </w:pPr>
-      <w:bookmarkStart w:id="17" w:name="_Toc240986665"/>
+      <w:bookmarkStart w:id="17" w:name="_Toc240991491"/>
       <w:r>
         <w:t>5.4. Estrategias disponibles y cuándo sirve cada una</w:t>
       </w:r>
@@ -8820,7 +8692,7 @@
       <w:pPr>
         <w:pStyle w:val="Heading2"/>
       </w:pPr>
-      <w:bookmarkStart w:id="18" w:name="_Toc240986666"/>
+      <w:bookmarkStart w:id="18" w:name="_Toc240991492"/>
       <w:r>
         <w:t>5.5. Selección de la estrategia mediante validación</w:t>
       </w:r>
@@ -8882,7 +8754,7 @@
           <w:left w:w="10" w:type="dxa"/>
           <w:right w:w="10" w:type="dxa"/>
         </w:tblCellMar>
-        <w:tblLook w:val="04A0" w:firstRow="1" w:lastRow="0" w:firstColumn="1" w:lastColumn="0" w:noHBand="0" w:noVBand="1"/>
+        <w:tblLook w:val="0000" w:firstRow="0" w:lastRow="0" w:firstColumn="0" w:lastColumn="0" w:noHBand="0" w:noVBand="0"/>
       </w:tblPr>
       <w:tblGrid>
         <w:gridCol w:w="2269"/>
@@ -9654,7 +9526,7 @@
       <w:pPr>
         <w:pStyle w:val="Heading2"/>
       </w:pPr>
-      <w:bookmarkStart w:id="19" w:name="_Toc240986667"/>
+      <w:bookmarkStart w:id="19" w:name="_Toc240991493"/>
       <w:r>
         <w:t>5.6. Decisiones adoptadas y prevención de circularidad</w:t>
       </w:r>
@@ -9702,7 +9574,7 @@
       <w:pPr>
         <w:pStyle w:val="Heading1"/>
       </w:pPr>
-      <w:bookmarkStart w:id="20" w:name="_Toc240986668"/>
+      <w:bookmarkStart w:id="20" w:name="_Toc240991494"/>
       <w:r>
         <w:t>6. Análisis de datos atípicos</w:t>
       </w:r>
@@ -9712,7 +9584,7 @@
       <w:pPr>
         <w:pStyle w:val="Heading2"/>
       </w:pPr>
-      <w:bookmarkStart w:id="21" w:name="_Toc240986669"/>
+      <w:bookmarkStart w:id="21" w:name="_Toc240991495"/>
       <w:r>
         <w:t>6.1. Comparación de criterios de detección</w:t>
       </w:r>
@@ -9756,7 +9628,7 @@
           <w:left w:w="10" w:type="dxa"/>
           <w:right w:w="10" w:type="dxa"/>
         </w:tblCellMar>
-        <w:tblLook w:val="04A0" w:firstRow="1" w:lastRow="0" w:firstColumn="1" w:lastColumn="0" w:noHBand="0" w:noVBand="1"/>
+        <w:tblLook w:val="0000" w:firstRow="0" w:lastRow="0" w:firstColumn="0" w:lastColumn="0" w:noHBand="0" w:noVBand="0"/>
       </w:tblPr>
       <w:tblGrid>
         <w:gridCol w:w="3024"/>
@@ -10209,10 +10081,10 @@
           <w:noProof/>
         </w:rPr>
         <w:drawing>
-          <wp:inline distT="0" distB="0" distL="0" distR="0" wp14:anchorId="1D7C2011" wp14:editId="1D7C2012">
+          <wp:inline distT="0" distB="0" distL="0" distR="0" wp14:anchorId="30F248A1" wp14:editId="30F248A2">
             <wp:extent cx="5715000" cy="1952625"/>
             <wp:effectExtent l="0" t="0" r="0" b="0"/>
-            <wp:docPr id="969536583" name="Picture 969536583"/>
+            <wp:docPr id="2114562497" name="Picture 2114562497"/>
             <wp:cNvGraphicFramePr>
               <a:graphicFrameLocks xmlns:a="http://schemas.openxmlformats.org/drawingml/2006/main" noChangeAspect="1"/>
             </wp:cNvGraphicFramePr>
@@ -10274,7 +10146,7 @@
       <w:pPr>
         <w:pStyle w:val="Heading2"/>
       </w:pPr>
-      <w:bookmarkStart w:id="22" w:name="_Toc240986670"/>
+      <w:bookmarkStart w:id="22" w:name="_Toc240991496"/>
       <w:r>
         <w:t>6.2. Naturaleza y causa: la extremidad estadística no identifica errores</w:t>
       </w:r>
@@ -10356,7 +10228,7 @@
           <w:left w:w="10" w:type="dxa"/>
           <w:right w:w="10" w:type="dxa"/>
         </w:tblCellMar>
-        <w:tblLook w:val="04A0" w:firstRow="1" w:lastRow="0" w:firstColumn="1" w:lastColumn="0" w:noHBand="0" w:noVBand="1"/>
+        <w:tblLook w:val="0000" w:firstRow="0" w:lastRow="0" w:firstColumn="0" w:lastColumn="0" w:noHBand="0" w:noVBand="0"/>
       </w:tblPr>
       <w:tblGrid>
         <w:gridCol w:w="3993"/>
@@ -11331,7 +11203,7 @@
       <w:pPr>
         <w:pStyle w:val="Heading2"/>
       </w:pPr>
-      <w:bookmarkStart w:id="23" w:name="_Toc240986671"/>
+      <w:bookmarkStart w:id="23" w:name="_Toc240991497"/>
       <w:r>
         <w:t>6.3. Impacto sobre las conclusiones</w:t>
       </w:r>
@@ -11375,7 +11247,7 @@
           <w:left w:w="10" w:type="dxa"/>
           <w:right w:w="10" w:type="dxa"/>
         </w:tblCellMar>
-        <w:tblLook w:val="04A0" w:firstRow="1" w:lastRow="0" w:firstColumn="1" w:lastColumn="0" w:noHBand="0" w:noVBand="1"/>
+        <w:tblLook w:val="0000" w:firstRow="0" w:lastRow="0" w:firstColumn="0" w:lastColumn="0" w:noHBand="0" w:noVBand="0"/>
       </w:tblPr>
       <w:tblGrid>
         <w:gridCol w:w="4174"/>
@@ -11840,7 +11712,7 @@
       <w:pPr>
         <w:pStyle w:val="Heading2"/>
       </w:pPr>
-      <w:bookmarkStart w:id="24" w:name="_Toc240986672"/>
+      <w:bookmarkStart w:id="24" w:name="_Toc240991498"/>
       <w:r>
         <w:t>6.4. Tratamiento adoptado</w:t>
       </w:r>
@@ -11878,7 +11750,7 @@
       <w:pPr>
         <w:pStyle w:val="Heading1"/>
       </w:pPr>
-      <w:bookmarkStart w:id="25" w:name="_Toc240986673"/>
+      <w:bookmarkStart w:id="25" w:name="_Toc240991499"/>
       <w:r>
         <w:t>7. Análisis comparativo entre variables</w:t>
       </w:r>
@@ -11888,7 +11760,7 @@
       <w:pPr>
         <w:pStyle w:val="Heading2"/>
       </w:pPr>
-      <w:bookmarkStart w:id="26" w:name="_Toc240986674"/>
+      <w:bookmarkStart w:id="26" w:name="_Toc240991500"/>
       <w:r>
         <w:t>7.1. Relación entre precio y puntaje</w:t>
       </w:r>
@@ -11906,10 +11778,10 @@
         </w:rPr>
         <w:lastRenderedPageBreak/>
         <w:drawing>
-          <wp:inline distT="0" distB="0" distL="0" distR="0" wp14:anchorId="1D7C2013" wp14:editId="1D7C2014">
+          <wp:inline distT="0" distB="0" distL="0" distR="0" wp14:anchorId="30F248A3" wp14:editId="30F248A4">
             <wp:extent cx="5715000" cy="2895600"/>
             <wp:effectExtent l="0" t="0" r="0" b="0"/>
-            <wp:docPr id="1783448574" name="Picture 1783448574"/>
+            <wp:docPr id="885422713" name="Picture 885422713"/>
             <wp:cNvGraphicFramePr>
               <a:graphicFrameLocks xmlns:a="http://schemas.openxmlformats.org/drawingml/2006/main" noChangeAspect="1"/>
             </wp:cNvGraphicFramePr>
@@ -11998,7 +11870,7 @@
       <w:pPr>
         <w:pStyle w:val="Heading2"/>
       </w:pPr>
-      <w:bookmarkStart w:id="27" w:name="_Toc240986675"/>
+      <w:bookmarkStart w:id="27" w:name="_Toc240991501"/>
       <w:r>
         <w:t>7.2. Comparación entre países</w:t>
       </w:r>
@@ -12016,10 +11888,10 @@
         </w:rPr>
         <w:lastRenderedPageBreak/>
         <w:drawing>
-          <wp:inline distT="0" distB="0" distL="0" distR="0" wp14:anchorId="1D7C2015" wp14:editId="1D7C2016">
+          <wp:inline distT="0" distB="0" distL="0" distR="0" wp14:anchorId="30F248A5" wp14:editId="30F248A6">
             <wp:extent cx="5715000" cy="2838450"/>
             <wp:effectExtent l="0" t="0" r="0" b="0"/>
-            <wp:docPr id="434262284" name="Picture 434262284"/>
+            <wp:docPr id="816298730" name="Picture 816298730"/>
             <wp:cNvGraphicFramePr>
               <a:graphicFrameLocks xmlns:a="http://schemas.openxmlformats.org/drawingml/2006/main" noChangeAspect="1"/>
             </wp:cNvGraphicFramePr>
@@ -12117,7 +11989,7 @@
       <w:pPr>
         <w:pStyle w:val="Heading2"/>
       </w:pPr>
-      <w:bookmarkStart w:id="28" w:name="_Toc240986676"/>
+      <w:bookmarkStart w:id="28" w:name="_Toc240991502"/>
       <w:r>
         <w:t>7.3. El año de cosecha como variable derivada</w:t>
       </w:r>
@@ -12175,10 +12047,10 @@
           <w:noProof/>
         </w:rPr>
         <w:drawing>
-          <wp:inline distT="0" distB="0" distL="0" distR="0" wp14:anchorId="1D7C2017" wp14:editId="1D7C2018">
+          <wp:inline distT="0" distB="0" distL="0" distR="0" wp14:anchorId="30F248A7" wp14:editId="30F248A8">
             <wp:extent cx="5715000" cy="2009775"/>
             <wp:effectExtent l="0" t="0" r="0" b="0"/>
-            <wp:docPr id="1851449837" name="Picture 1851449837"/>
+            <wp:docPr id="1212191345" name="Picture 1212191345"/>
             <wp:cNvGraphicFramePr>
               <a:graphicFrameLocks xmlns:a="http://schemas.openxmlformats.org/drawingml/2006/main" noChangeAspect="1"/>
             </wp:cNvGraphicFramePr>
@@ -12249,7 +12121,7 @@
       <w:pPr>
         <w:pStyle w:val="Heading2"/>
       </w:pPr>
-      <w:bookmarkStart w:id="29" w:name="_Toc240986677"/>
+      <w:bookmarkStart w:id="29" w:name="_Toc240991503"/>
       <w:r>
         <w:t>7.4. Extensión de la nota de cata</w:t>
       </w:r>
@@ -12303,7 +12175,7 @@
           <w:left w:w="10" w:type="dxa"/>
           <w:right w:w="10" w:type="dxa"/>
         </w:tblCellMar>
-        <w:tblLook w:val="04A0" w:firstRow="1" w:lastRow="0" w:firstColumn="1" w:lastColumn="0" w:noHBand="0" w:noVBand="1"/>
+        <w:tblLook w:val="0000" w:firstRow="0" w:lastRow="0" w:firstColumn="0" w:lastColumn="0" w:noHBand="0" w:noVBand="0"/>
       </w:tblPr>
       <w:tblGrid>
         <w:gridCol w:w="4174"/>
@@ -12588,7 +12460,7 @@
       <w:pPr>
         <w:pStyle w:val="Heading2"/>
       </w:pPr>
-      <w:bookmarkStart w:id="30" w:name="_Toc240986678"/>
+      <w:bookmarkStart w:id="30" w:name="_Toc240991504"/>
       <w:r>
         <w:t>7.5. Efecto del catador y confusión por variable omitida</w:t>
       </w:r>
@@ -12659,7 +12531,7 @@
           <w:left w:w="10" w:type="dxa"/>
           <w:right w:w="10" w:type="dxa"/>
         </w:tblCellMar>
-        <w:tblLook w:val="04A0" w:firstRow="1" w:lastRow="0" w:firstColumn="1" w:lastColumn="0" w:noHBand="0" w:noVBand="1"/>
+        <w:tblLook w:val="0000" w:firstRow="0" w:lastRow="0" w:firstColumn="0" w:lastColumn="0" w:noHBand="0" w:noVBand="0"/>
       </w:tblPr>
       <w:tblGrid>
         <w:gridCol w:w="3085"/>
@@ -13636,7 +13508,7 @@
       <w:pPr>
         <w:pStyle w:val="Heading1"/>
       </w:pPr>
-      <w:bookmarkStart w:id="31" w:name="_Toc240986679"/>
+      <w:bookmarkStart w:id="31" w:name="_Toc240991505"/>
       <w:r>
         <w:t>8. Conclusiones</w:t>
       </w:r>
@@ -13689,532 +13561,6 @@
       </w:r>
       <w:r>
         <w:t>atural del trabajo.</w:t>
-      </w:r>
-    </w:p>
-    <w:p>
-      <w:pPr>
-        <w:pStyle w:val="Heading1"/>
-      </w:pPr>
-      <w:bookmarkStart w:id="32" w:name="_Toc240986680"/>
-      <w:r>
-        <w:t>9. Referencias</w:t>
-      </w:r>
-      <w:bookmarkEnd w:id="32"/>
-    </w:p>
-    <w:p>
-      <w:pPr>
-        <w:ind w:left="720" w:hanging="720"/>
-        <w:jc w:val="both"/>
-      </w:pPr>
-      <w:r>
-        <w:t>McKinney, W. (2022). Python for Data Analysis: Data Wrangling with pandas, NumPy, and Jupyter (3.ª ed.). O'Reilly Media.</w:t>
-      </w:r>
-    </w:p>
-    <w:p>
-      <w:pPr>
-        <w:ind w:left="720" w:hanging="720"/>
-        <w:jc w:val="both"/>
-      </w:pPr>
-      <w:r>
-        <w:t>Little, R. J. A. y Rubin, D. B. (2019). Statistical Analysis with Missing Data (3.ª ed.). Wiley.</w:t>
-      </w:r>
-    </w:p>
-    <w:p>
-      <w:pPr>
-        <w:ind w:left="720" w:hanging="720"/>
-        <w:jc w:val="both"/>
-      </w:pPr>
-      <w:r>
-        <w:t>Iglewicz, B. y Hoaglin, D. C. (1993). How to Detect and Handle Outliers. ASQC Quality Press.</w:t>
-      </w:r>
-    </w:p>
-    <w:p>
-      <w:pPr>
-        <w:ind w:left="720" w:hanging="720"/>
-        <w:jc w:val="both"/>
-      </w:pPr>
-      <w:r>
-        <w:t>Tukey, J. W. (1977). Exploratory Data Analysis. Addison-Wesley.</w:t>
-      </w:r>
-    </w:p>
-    <w:p>
-      <w:pPr>
-        <w:ind w:left="720" w:hanging="720"/>
-        <w:jc w:val="both"/>
-      </w:pPr>
-      <w:r>
-        <w:t>WineEnthusiast. Conjunto de datos winemag-data-130k-v2, provisto con el enunciado de la actividad.</w:t>
-      </w:r>
-    </w:p>
-    <w:p>
-      <w:r>
-        <w:br w:type="page"/>
-      </w:r>
-    </w:p>
-    <w:p>
-      <w:pPr>
-        <w:pStyle w:val="Heading1"/>
-      </w:pPr>
-      <w:bookmarkStart w:id="33" w:name="_Toc240986681"/>
-      <w:r>
-        <w:lastRenderedPageBreak/>
-        <w:t>Anexo. Estructura del script</w:t>
-      </w:r>
-      <w:bookmarkEnd w:id="33"/>
-    </w:p>
-    <w:p>
-      <w:pPr>
-        <w:ind w:firstLine="720"/>
-        <w:jc w:val="both"/>
-      </w:pPr>
-      <w:r>
-        <w:t>El código se entrega en analisis_exploratorio_vinos.py, organizado en seis secciones que se corresponden con las de este informe. Se ejecuta con «python analisis_exploratorio_vinos.py» y necesita pandas, numpy, matplotlib, scipy y openpyxl. La corrida completa tarda unos catorce segundos y deja las ocho figuras en el directorio graficos/.</w:t>
-      </w:r>
-    </w:p>
-    <w:p>
-      <w:pPr>
-        <w:ind w:firstLine="720"/>
-        <w:jc w:val="both"/>
-      </w:pPr>
-      <w:r>
-        <w:t>El script busca el archivo de datos en dos formatos y usa el primero que encuentre: winemag-data-130k-v2.csv, que lee directo, o el .xlsx entregado con el enunciado, que reconstruye antes de leer. Los dos caminos devuelven el mismo DataFrame.</w:t>
-      </w:r>
-    </w:p>
-    <w:p>
-      <w:pPr>
-        <w:keepNext/>
-        <w:spacing w:before="240" w:after="80"/>
-        <w:jc w:val="center"/>
-      </w:pPr>
-      <w:r>
-        <w:rPr>
-          <w:b/>
-          <w:bCs/>
-          <w:sz w:val="20"/>
-          <w:szCs w:val="20"/>
-        </w:rPr>
-        <w:t xml:space="preserve">Tabla 12. </w:t>
-      </w:r>
-      <w:r>
-        <w:rPr>
-          <w:sz w:val="20"/>
-          <w:szCs w:val="20"/>
-        </w:rPr>
-        <w:t>Correspondencia entre las secciones del script y las de este informe.</w:t>
-      </w:r>
-    </w:p>
-    <w:tbl>
-      <w:tblPr>
-        <w:tblW w:w="9070" w:type="dxa"/>
-        <w:tblBorders>
-          <w:top w:val="single" w:sz="4" w:space="0" w:color="auto"/>
-          <w:left w:val="single" w:sz="4" w:space="0" w:color="auto"/>
-          <w:bottom w:val="single" w:sz="4" w:space="0" w:color="auto"/>
-          <w:right w:val="single" w:sz="4" w:space="0" w:color="auto"/>
-          <w:insideH w:val="single" w:sz="4" w:space="0" w:color="auto"/>
-          <w:insideV w:val="single" w:sz="4" w:space="0" w:color="auto"/>
-        </w:tblBorders>
-        <w:tblCellMar>
-          <w:left w:w="10" w:type="dxa"/>
-          <w:right w:w="10" w:type="dxa"/>
-        </w:tblCellMar>
-        <w:tblLook w:val="04A0" w:firstRow="1" w:lastRow="0" w:firstColumn="1" w:lastColumn="0" w:noHBand="0" w:noVBand="1"/>
-      </w:tblPr>
-      <w:tblGrid>
-        <w:gridCol w:w="2359"/>
-        <w:gridCol w:w="6711"/>
-      </w:tblGrid>
-      <w:tr>
-        <w:tblPrEx>
-          <w:tblCellMar>
-            <w:top w:w="0" w:type="dxa"/>
-            <w:bottom w:w="0" w:type="dxa"/>
-          </w:tblCellMar>
-        </w:tblPrEx>
-        <w:trPr>
-          <w:cantSplit/>
-          <w:tblHeader/>
-        </w:trPr>
-        <w:tc>
-          <w:tcPr>
-            <w:tcW w:w="2359" w:type="dxa"/>
-            <w:shd w:val="clear" w:color="auto" w:fill="EDE3E6"/>
-            <w:tcMar>
-              <w:top w:w="60" w:type="dxa"/>
-              <w:left w:w="100" w:type="dxa"/>
-              <w:bottom w:w="60" w:type="dxa"/>
-              <w:right w:w="100" w:type="dxa"/>
-            </w:tcMar>
-            <w:vAlign w:val="center"/>
-          </w:tcPr>
-          <w:p>
-            <w:r>
-              <w:rPr>
-                <w:b/>
-                <w:bCs/>
-                <w:sz w:val="20"/>
-                <w:szCs w:val="20"/>
-              </w:rPr>
-              <w:t>Sección</w:t>
-            </w:r>
-          </w:p>
-        </w:tc>
-        <w:tc>
-          <w:tcPr>
-            <w:tcW w:w="6711" w:type="dxa"/>
-            <w:shd w:val="clear" w:color="auto" w:fill="EDE3E6"/>
-            <w:tcMar>
-              <w:top w:w="60" w:type="dxa"/>
-              <w:left w:w="100" w:type="dxa"/>
-              <w:bottom w:w="60" w:type="dxa"/>
-              <w:right w:w="100" w:type="dxa"/>
-            </w:tcMar>
-            <w:vAlign w:val="center"/>
-          </w:tcPr>
-          <w:p>
-            <w:r>
-              <w:rPr>
-                <w:b/>
-                <w:bCs/>
-                <w:sz w:val="20"/>
-                <w:szCs w:val="20"/>
-              </w:rPr>
-              <w:t>Funciones principales</w:t>
-            </w:r>
-          </w:p>
-        </w:tc>
-      </w:tr>
-      <w:tr>
-        <w:tblPrEx>
-          <w:tblCellMar>
-            <w:top w:w="0" w:type="dxa"/>
-            <w:bottom w:w="0" w:type="dxa"/>
-          </w:tblCellMar>
-        </w:tblPrEx>
-        <w:trPr>
-          <w:cantSplit/>
-        </w:trPr>
-        <w:tc>
-          <w:tcPr>
-            <w:tcW w:w="2359" w:type="dxa"/>
-            <w:tcMar>
-              <w:top w:w="60" w:type="dxa"/>
-              <w:left w:w="100" w:type="dxa"/>
-              <w:bottom w:w="60" w:type="dxa"/>
-              <w:right w:w="100" w:type="dxa"/>
-            </w:tcMar>
-            <w:vAlign w:val="center"/>
-          </w:tcPr>
-          <w:p>
-            <w:r>
-              <w:rPr>
-                <w:sz w:val="20"/>
-                <w:szCs w:val="20"/>
-              </w:rPr>
-              <w:t>1. Carga de datos</w:t>
-            </w:r>
-          </w:p>
-        </w:tc>
-        <w:tc>
-          <w:tcPr>
-            <w:tcW w:w="6711" w:type="dxa"/>
-            <w:tcMar>
-              <w:top w:w="60" w:type="dxa"/>
-              <w:left w:w="100" w:type="dxa"/>
-              <w:bottom w:w="60" w:type="dxa"/>
-              <w:right w:w="100" w:type="dxa"/>
-            </w:tcMar>
-            <w:vAlign w:val="center"/>
-          </w:tcPr>
-          <w:p>
-            <w:r>
-              <w:rPr>
-                <w:sz w:val="20"/>
-                <w:szCs w:val="20"/>
-              </w:rPr>
-              <w:t>cargar_datos, _reconstruir_lineas, _reparar_codificacion, _elegir_ruta</w:t>
-            </w:r>
-          </w:p>
-        </w:tc>
-      </w:tr>
-      <w:tr>
-        <w:tblPrEx>
-          <w:tblCellMar>
-            <w:top w:w="0" w:type="dxa"/>
-            <w:bottom w:w="0" w:type="dxa"/>
-          </w:tblCellMar>
-        </w:tblPrEx>
-        <w:trPr>
-          <w:cantSplit/>
-        </w:trPr>
-        <w:tc>
-          <w:tcPr>
-            <w:tcW w:w="2359" w:type="dxa"/>
-            <w:tcMar>
-              <w:top w:w="60" w:type="dxa"/>
-              <w:left w:w="100" w:type="dxa"/>
-              <w:bottom w:w="60" w:type="dxa"/>
-              <w:right w:w="100" w:type="dxa"/>
-            </w:tcMar>
-            <w:vAlign w:val="center"/>
-          </w:tcPr>
-          <w:p>
-            <w:r>
-              <w:rPr>
-                <w:sz w:val="20"/>
-                <w:szCs w:val="20"/>
-              </w:rPr>
-              <w:t>2. Perfilado y depuración</w:t>
-            </w:r>
-          </w:p>
-        </w:tc>
-        <w:tc>
-          <w:tcPr>
-            <w:tcW w:w="6711" w:type="dxa"/>
-            <w:tcMar>
-              <w:top w:w="60" w:type="dxa"/>
-              <w:left w:w="100" w:type="dxa"/>
-              <w:bottom w:w="60" w:type="dxa"/>
-              <w:right w:w="100" w:type="dxa"/>
-            </w:tcMar>
-            <w:vAlign w:val="center"/>
-          </w:tcPr>
-          <w:p>
-            <w:r>
-              <w:rPr>
-                <w:sz w:val="20"/>
-                <w:szCs w:val="20"/>
-              </w:rPr>
-              <w:t>perfil_columnas, resumen_categoricas, quitar_duplicados</w:t>
-            </w:r>
-          </w:p>
-        </w:tc>
-      </w:tr>
-      <w:tr>
-        <w:tblPrEx>
-          <w:tblCellMar>
-            <w:top w:w="0" w:type="dxa"/>
-            <w:bottom w:w="0" w:type="dxa"/>
-          </w:tblCellMar>
-        </w:tblPrEx>
-        <w:trPr>
-          <w:cantSplit/>
-        </w:trPr>
-        <w:tc>
-          <w:tcPr>
-            <w:tcW w:w="2359" w:type="dxa"/>
-            <w:tcMar>
-              <w:top w:w="60" w:type="dxa"/>
-              <w:left w:w="100" w:type="dxa"/>
-              <w:bottom w:w="60" w:type="dxa"/>
-              <w:right w:w="100" w:type="dxa"/>
-            </w:tcMar>
-            <w:vAlign w:val="center"/>
-          </w:tcPr>
-          <w:p>
-            <w:r>
-              <w:rPr>
-                <w:sz w:val="20"/>
-                <w:szCs w:val="20"/>
-              </w:rPr>
-              <w:t>3. Visualización</w:t>
-            </w:r>
-          </w:p>
-        </w:tc>
-        <w:tc>
-          <w:tcPr>
-            <w:tcW w:w="6711" w:type="dxa"/>
-            <w:tcMar>
-              <w:top w:w="60" w:type="dxa"/>
-              <w:left w:w="100" w:type="dxa"/>
-              <w:bottom w:w="60" w:type="dxa"/>
-              <w:right w:w="100" w:type="dxa"/>
-            </w:tcMar>
-            <w:vAlign w:val="center"/>
-          </w:tcPr>
-          <w:p>
-            <w:r>
-              <w:rPr>
-                <w:sz w:val="20"/>
-                <w:szCs w:val="20"/>
-              </w:rPr>
-              <w:t>grafico_puntajes, grafico_precios, grafico_categoricas, grafico_precio_vs_puntaje, grafico_puntaje_por_pais</w:t>
-            </w:r>
-          </w:p>
-        </w:tc>
-      </w:tr>
-      <w:tr>
-        <w:tblPrEx>
-          <w:tblCellMar>
-            <w:top w:w="0" w:type="dxa"/>
-            <w:bottom w:w="0" w:type="dxa"/>
-          </w:tblCellMar>
-        </w:tblPrEx>
-        <w:trPr>
-          <w:cantSplit/>
-        </w:trPr>
-        <w:tc>
-          <w:tcPr>
-            <w:tcW w:w="2359" w:type="dxa"/>
-            <w:tcMar>
-              <w:top w:w="60" w:type="dxa"/>
-              <w:left w:w="100" w:type="dxa"/>
-              <w:bottom w:w="60" w:type="dxa"/>
-              <w:right w:w="100" w:type="dxa"/>
-            </w:tcMar>
-            <w:vAlign w:val="center"/>
-          </w:tcPr>
-          <w:p>
-            <w:r>
-              <w:rPr>
-                <w:sz w:val="20"/>
-                <w:szCs w:val="20"/>
-              </w:rPr>
-              <w:t>4. Datos faltantes</w:t>
-            </w:r>
-          </w:p>
-        </w:tc>
-        <w:tc>
-          <w:tcPr>
-            <w:tcW w:w="6711" w:type="dxa"/>
-            <w:tcMar>
-              <w:top w:w="60" w:type="dxa"/>
-              <w:left w:w="100" w:type="dxa"/>
-              <w:bottom w:w="60" w:type="dxa"/>
-              <w:right w:w="100" w:type="dxa"/>
-            </w:tcMar>
-            <w:vAlign w:val="center"/>
-          </w:tcPr>
-          <w:p>
-            <w:r>
-              <w:rPr>
-                <w:sz w:val="20"/>
-                <w:szCs w:val="20"/>
-              </w:rPr>
-              <w:t>diagnostico_faltantes, validar_imputacion_precio, imputar_precio, tratar_faltantes, grafico_faltantes</w:t>
-            </w:r>
-          </w:p>
-        </w:tc>
-      </w:tr>
-      <w:tr>
-        <w:tblPrEx>
-          <w:tblCellMar>
-            <w:top w:w="0" w:type="dxa"/>
-            <w:bottom w:w="0" w:type="dxa"/>
-          </w:tblCellMar>
-        </w:tblPrEx>
-        <w:trPr>
-          <w:cantSplit/>
-        </w:trPr>
-        <w:tc>
-          <w:tcPr>
-            <w:tcW w:w="2359" w:type="dxa"/>
-            <w:tcMar>
-              <w:top w:w="60" w:type="dxa"/>
-              <w:left w:w="100" w:type="dxa"/>
-              <w:bottom w:w="60" w:type="dxa"/>
-              <w:right w:w="100" w:type="dxa"/>
-            </w:tcMar>
-            <w:vAlign w:val="center"/>
-          </w:tcPr>
-          <w:p>
-            <w:r>
-              <w:rPr>
-                <w:sz w:val="20"/>
-                <w:szCs w:val="20"/>
-              </w:rPr>
-              <w:t>5. Datos atípicos</w:t>
-            </w:r>
-          </w:p>
-        </w:tc>
-        <w:tc>
-          <w:tcPr>
-            <w:tcW w:w="6711" w:type="dxa"/>
-            <w:tcMar>
-              <w:top w:w="60" w:type="dxa"/>
-              <w:left w:w="100" w:type="dxa"/>
-              <w:bottom w:w="60" w:type="dxa"/>
-              <w:right w:w="100" w:type="dxa"/>
-            </w:tcMar>
-            <w:vAlign w:val="center"/>
-          </w:tcPr>
-          <w:p>
-            <w:r>
-              <w:rPr>
-                <w:sz w:val="20"/>
-                <w:szCs w:val="20"/>
-              </w:rPr>
-              <w:t>detectar_atipicos, atipicos_contextuales, impacto_atipicos, grafico_atipicos</w:t>
-            </w:r>
-          </w:p>
-        </w:tc>
-      </w:tr>
-      <w:tr>
-        <w:tblPrEx>
-          <w:tblCellMar>
-            <w:top w:w="0" w:type="dxa"/>
-            <w:bottom w:w="0" w:type="dxa"/>
-          </w:tblCellMar>
-        </w:tblPrEx>
-        <w:trPr>
-          <w:cantSplit/>
-        </w:trPr>
-        <w:tc>
-          <w:tcPr>
-            <w:tcW w:w="2359" w:type="dxa"/>
-            <w:tcMar>
-              <w:top w:w="60" w:type="dxa"/>
-              <w:left w:w="100" w:type="dxa"/>
-              <w:bottom w:w="60" w:type="dxa"/>
-              <w:right w:w="100" w:type="dxa"/>
-            </w:tcMar>
-            <w:vAlign w:val="center"/>
-          </w:tcPr>
-          <w:p>
-            <w:r>
-              <w:rPr>
-                <w:sz w:val="20"/>
-                <w:szCs w:val="20"/>
-              </w:rPr>
-              <w:t>6. Análisis comparativo</w:t>
-            </w:r>
-          </w:p>
-        </w:tc>
-        <w:tc>
-          <w:tcPr>
-            <w:tcW w:w="6711" w:type="dxa"/>
-            <w:tcMar>
-              <w:top w:w="60" w:type="dxa"/>
-              <w:left w:w="100" w:type="dxa"/>
-              <w:bottom w:w="60" w:type="dxa"/>
-              <w:right w:w="100" w:type="dxa"/>
-            </w:tcMar>
-            <w:vAlign w:val="center"/>
-          </w:tcPr>
-          <w:p>
-            <w:r>
-              <w:rPr>
-                <w:sz w:val="20"/>
-                <w:szCs w:val="20"/>
-              </w:rPr>
-              <w:t>extraer_anio, analisis_temporal, efecto_catador, agregar_longitud, analisis_longitud, mejor_relacion_calidad_precio, grafico_comparativo</w:t>
-            </w:r>
-          </w:p>
-        </w:tc>
-      </w:tr>
-    </w:tbl>
-    <w:p>
-      <w:pPr>
-        <w:spacing w:after="240"/>
-      </w:pPr>
-    </w:p>
-    <w:p>
-      <w:pPr>
-        <w:ind w:firstLine="720"/>
-        <w:jc w:val="both"/>
-      </w:pPr>
-      <w:r>
-        <w:t>La función de carga lleva aserciones que verifican la forma del conjunto y el tipo de las variables numéricas, además de que cada línea reconstruida dé los catorce campos esperados. Si el archivo de origen cambia, el script falla de forma visible en lugar de seguir sobre datos distintos de los analizados.</w:t>
       </w:r>
     </w:p>
     <w:sectPr>
@@ -14335,7 +13681,7 @@
         <w:sz w:val="18"/>
         <w:szCs w:val="18"/>
       </w:rPr>
-      <w:instrText>NUMPAGES</w:instrText>
+      <w:instrText>SECTIONPAGES</w:instrText>
     </w:r>
     <w:r>
       <w:rPr>
@@ -14352,7 +13698,7 @@
         <w:sz w:val="18"/>
         <w:szCs w:val="18"/>
       </w:rPr>
-      <w:t>3</w:t>
+      <w:t>25</w:t>
     </w:r>
     <w:r>
       <w:rPr>
@@ -14417,10 +13763,10 @@
 <file path=word/numbering.xml><?xml version="1.0" encoding="utf-8"?>
 <w:numbering xmlns:wpc="http://schemas.microsoft.com/office/word/2010/wordprocessingCanvas" xmlns:cx="http://schemas.microsoft.com/office/drawing/2014/chartex" xmlns:cx1="http://schemas.microsoft.com/office/drawing/2015/9/8/chartex" xmlns:cx2="http://schemas.microsoft.com/office/drawing/2015/10/21/chartex" xmlns:cx3="http://schemas.microsoft.com/office/drawing/2016/5/9/chartex" xmlns:cx4="http://schemas.microsoft.com/office/drawing/2016/5/10/chartex" xmlns:cx5="http://schemas.microsoft.com/office/drawing/2016/5/11/chartex" xmlns:cx6="http://schemas.microsoft.com/office/drawing/2016/5/12/chartex" xmlns:cx7="http://schemas.microsoft.com/office/drawing/2016/5/13/chartex" xmlns:cx8="http://schemas.microsoft.com/office/drawing/2016/5/14/chartex" xmlns:mc="http://schemas.openxmlformats.org/markup-compatibility/2006" xmlns:aink="http://schemas.microsoft.com/office/drawing/2016/ink" xmlns:am3d="http://schemas.microsoft.com/office/drawing/2017/model3d" xmlns:o="urn:schemas-microsoft-com:office:office" xmlns:oel="http://schemas.microsoft.com/office/2019/extlst" xmlns:r="http://schemas.openxmlformats.org/officeDocument/2006/relationships" xmlns:m="http://schemas.openxmlformats.org/officeDocument/2006/math" xmlns:v="urn:schemas-microsoft-com:vml" xmlns:wp14="http://schemas.microsoft.com/office/word/2010/wordprocessingDrawing" xmlns:wp="http://schemas.openxmlformats.org/drawingml/2006/wordprocessingDrawing" xmlns:w10="urn:schemas-microsoft-com:office:word" xmlns:w="http://schemas.openxmlformats.org/wordprocessingml/2006/main" xmlns:w14="http://schemas.microsoft.com/office/word/2010/wordml" xmlns:w15="http://schemas.microsoft.com/office/word/2012/wordml" xmlns:w16cex="http://schemas.microsoft.com/office/word/2018/wordml/cex" xmlns:w16cid="http://schemas.microsoft.com/office/word/2016/wordml/cid" xmlns:w16="http://schemas.microsoft.com/office/word/2018/wordml" xmlns:w16du="http://schemas.microsoft.com/office/word/2023/wordml/word16du" xmlns:w16sdtdh="http://schemas.microsoft.com/office/word/2020/wordml/sdtdatahash" xmlns:w16sdtfl="http://schemas.microsoft.com/office/word/2024/wordml/sdtformatlock" xmlns:w16se="http://schemas.microsoft.com/office/word/2015/wordml/symex" xmlns:wpg="http://schemas.microsoft.com/office/word/2010/wordprocessingGroup" xmlns:wpi="http://schemas.microsoft.com/office/word/2010/wordprocessingInk" xmlns:wne="http://schemas.microsoft.com/office/word/2006/wordml" xmlns:wps="http://schemas.microsoft.com/office/word/2010/wordprocessingShape" mc:Ignorable="w14 w15 w16se w16cid w16 w16cex w16sdtdh w16sdtfl w16du wp14">
   <w:abstractNum w:abstractNumId="0" w15:restartNumberingAfterBreak="0">
-    <w:nsid w:val="156A3578"/>
+    <w:nsid w:val="3F7B1E98"/>
     <w:multiLevelType w:val="hybridMultilevel"/>
-    <w:tmpl w:val="EAA66A1A"/>
-    <w:lvl w:ilvl="0" w:tplc="ED242E20">
+    <w:tmpl w:val="E4729248"/>
+    <w:lvl w:ilvl="0" w:tplc="712AB8BA">
       <w:start w:val="1"/>
       <w:numFmt w:val="bullet"/>
       <w:lvlText w:val="•"/>
@@ -14429,52 +13775,52 @@
         <w:ind w:left="720" w:hanging="360"/>
       </w:pPr>
     </w:lvl>
-    <w:lvl w:ilvl="1" w:tplc="D8A8495A">
+    <w:lvl w:ilvl="1" w:tplc="2ED6337E">
       <w:numFmt w:val="decimal"/>
       <w:lvlText w:val=""/>
       <w:lvlJc w:val="left"/>
     </w:lvl>
-    <w:lvl w:ilvl="2" w:tplc="63004DAC">
+    <w:lvl w:ilvl="2" w:tplc="CF20A73A">
       <w:numFmt w:val="decimal"/>
       <w:lvlText w:val=""/>
       <w:lvlJc w:val="left"/>
     </w:lvl>
-    <w:lvl w:ilvl="3" w:tplc="4BF8CEC4">
+    <w:lvl w:ilvl="3" w:tplc="CEC6131C">
       <w:numFmt w:val="decimal"/>
       <w:lvlText w:val=""/>
       <w:lvlJc w:val="left"/>
     </w:lvl>
-    <w:lvl w:ilvl="4" w:tplc="B524950C">
+    <w:lvl w:ilvl="4" w:tplc="63DA4182">
       <w:numFmt w:val="decimal"/>
       <w:lvlText w:val=""/>
       <w:lvlJc w:val="left"/>
     </w:lvl>
-    <w:lvl w:ilvl="5" w:tplc="92D68880">
+    <w:lvl w:ilvl="5" w:tplc="9912F6A8">
       <w:numFmt w:val="decimal"/>
       <w:lvlText w:val=""/>
       <w:lvlJc w:val="left"/>
     </w:lvl>
-    <w:lvl w:ilvl="6" w:tplc="0D5AB60E">
+    <w:lvl w:ilvl="6" w:tplc="112C22F8">
       <w:numFmt w:val="decimal"/>
       <w:lvlText w:val=""/>
       <w:lvlJc w:val="left"/>
     </w:lvl>
-    <w:lvl w:ilvl="7" w:tplc="B1B4D1B8">
+    <w:lvl w:ilvl="7" w:tplc="D868C860">
       <w:numFmt w:val="decimal"/>
       <w:lvlText w:val=""/>
       <w:lvlJc w:val="left"/>
     </w:lvl>
-    <w:lvl w:ilvl="8" w:tplc="2676DEFC">
+    <w:lvl w:ilvl="8" w:tplc="80EA0232">
       <w:numFmt w:val="decimal"/>
       <w:lvlText w:val=""/>
       <w:lvlJc w:val="left"/>
     </w:lvl>
   </w:abstractNum>
   <w:abstractNum w:abstractNumId="1" w15:restartNumberingAfterBreak="0">
-    <w:nsid w:val="3D8712B2"/>
+    <w:nsid w:val="597D6B06"/>
     <w:multiLevelType w:val="hybridMultilevel"/>
-    <w:tmpl w:val="0254D1D2"/>
-    <w:lvl w:ilvl="0" w:tplc="14E01AC0">
+    <w:tmpl w:val="B45A8528"/>
+    <w:lvl w:ilvl="0" w:tplc="F19A259E">
       <w:start w:val="1"/>
       <w:numFmt w:val="bullet"/>
       <w:lvlText w:val="●"/>
@@ -14483,7 +13829,7 @@
         <w:ind w:left="720" w:hanging="360"/>
       </w:pPr>
     </w:lvl>
-    <w:lvl w:ilvl="1" w:tplc="9148EFFE">
+    <w:lvl w:ilvl="1" w:tplc="782ED74A">
       <w:start w:val="1"/>
       <w:numFmt w:val="bullet"/>
       <w:lvlText w:val="○"/>
@@ -14492,7 +13838,7 @@
         <w:ind w:left="1440" w:hanging="360"/>
       </w:pPr>
     </w:lvl>
-    <w:lvl w:ilvl="2" w:tplc="772EB000">
+    <w:lvl w:ilvl="2" w:tplc="E8383D0C">
       <w:start w:val="1"/>
       <w:numFmt w:val="bullet"/>
       <w:lvlText w:val="■"/>
@@ -14501,7 +13847,7 @@
         <w:ind w:left="2160" w:hanging="360"/>
       </w:pPr>
     </w:lvl>
-    <w:lvl w:ilvl="3" w:tplc="6420A864">
+    <w:lvl w:ilvl="3" w:tplc="45621656">
       <w:start w:val="1"/>
       <w:numFmt w:val="bullet"/>
       <w:lvlText w:val="●"/>
@@ -14510,7 +13856,7 @@
         <w:ind w:left="2880" w:hanging="360"/>
       </w:pPr>
     </w:lvl>
-    <w:lvl w:ilvl="4" w:tplc="A9C6885C">
+    <w:lvl w:ilvl="4" w:tplc="2E443CCE">
       <w:start w:val="1"/>
       <w:numFmt w:val="bullet"/>
       <w:lvlText w:val="○"/>
@@ -14519,7 +13865,7 @@
         <w:ind w:left="3600" w:hanging="360"/>
       </w:pPr>
     </w:lvl>
-    <w:lvl w:ilvl="5" w:tplc="D19C0676">
+    <w:lvl w:ilvl="5" w:tplc="200EFA02">
       <w:start w:val="1"/>
       <w:numFmt w:val="bullet"/>
       <w:lvlText w:val="■"/>
@@ -14528,7 +13874,7 @@
         <w:ind w:left="4320" w:hanging="360"/>
       </w:pPr>
     </w:lvl>
-    <w:lvl w:ilvl="6" w:tplc="26BA1ACE">
+    <w:lvl w:ilvl="6" w:tplc="DF28A0EC">
       <w:start w:val="1"/>
       <w:numFmt w:val="bullet"/>
       <w:lvlText w:val="●"/>
@@ -14537,7 +13883,7 @@
         <w:ind w:left="5040" w:hanging="360"/>
       </w:pPr>
     </w:lvl>
-    <w:lvl w:ilvl="7" w:tplc="D03AE6CA">
+    <w:lvl w:ilvl="7" w:tplc="15629480">
       <w:start w:val="1"/>
       <w:numFmt w:val="bullet"/>
       <w:lvlText w:val="●"/>
@@ -14546,7 +13892,7 @@
         <w:ind w:left="5760" w:hanging="360"/>
       </w:pPr>
     </w:lvl>
-    <w:lvl w:ilvl="8" w:tplc="7F9C1C62">
+    <w:lvl w:ilvl="8" w:tplc="773A6440">
       <w:start w:val="1"/>
       <w:numFmt w:val="bullet"/>
       <w:lvlText w:val="●"/>
@@ -14556,13 +13902,13 @@
       </w:pPr>
     </w:lvl>
   </w:abstractNum>
-  <w:num w:numId="1" w16cid:durableId="1022442402">
+  <w:num w:numId="1" w16cid:durableId="1631551399">
     <w:abstractNumId w:val="1"/>
     <w:lvlOverride w:ilvl="0">
       <w:startOverride w:val="1"/>
     </w:lvlOverride>
   </w:num>
-  <w:num w:numId="2" w16cid:durableId="1510293949">
+  <w:num w:numId="2" w16cid:durableId="2025478805">
     <w:abstractNumId w:val="0"/>
     <w:lvlOverride w:ilvl="0">
       <w:startOverride w:val="1"/>
@@ -15187,7 +14533,7 @@
     <w:autoRedefine/>
     <w:uiPriority w:val="39"/>
     <w:unhideWhenUsed/>
-    <w:rsid w:val="0035784D"/>
+    <w:rsid w:val="00847858"/>
     <w:pPr>
       <w:spacing w:after="100"/>
     </w:pPr>
@@ -15199,7 +14545,7 @@
     <w:autoRedefine/>
     <w:uiPriority w:val="39"/>
     <w:unhideWhenUsed/>
-    <w:rsid w:val="0035784D"/>
+    <w:rsid w:val="00847858"/>
     <w:pPr>
       <w:spacing w:after="100"/>
       <w:ind w:left="240"/>

</xml_diff>

<commit_message>
Simplificar partes avanzadas y hacer el script más robusto
- Informe: comillas normales, fecha actual, pie sin total de páginas.
  Se sacan la entropía, la curtosis, el coeficiente de variación, la
  tabla de criterios de atípicos y el mapa de faltantes cruzados. Se
  explica por qué se usa el IQR y se simplifica el efecto del catador.
- Script: busca los datos y guarda los gráficos en la carpeta del
  script, lee el CSV original sin depender de index_col, repara la
  codificación solo en el .xlsx y funciona con pandas 2 y 3.

Co-Authored-By: Claude Opus 5.5 <noreply@anthropic.com>
</commit_message>
<xml_diff>
--- a/Informe TP2 - Analisis exploratorio de vinos.docx
+++ b/Informe TP2 - Analisis exploratorio de vinos.docx
@@ -55,7 +55,7 @@
         <w:jc w:val="center"/>
       </w:pPr>
       <w:r>
-        <w:t>22 de septiembre de 2026</w:t>
+        <w:t>28 de septiembre de 2026</w:t>
       </w:r>
     </w:p>
     <w:p>
@@ -127,7 +127,7 @@
           <w:r>
             <w:fldChar w:fldCharType="separate"/>
           </w:r>
-          <w:hyperlink w:anchor="_Toc241487012" w:history="1">
+          <w:hyperlink w:anchor="_Toc241506714" w:history="1">
             <w:r>
               <w:rPr>
                 <w:rStyle w:val="Hyperlink"/>
@@ -151,7 +151,7 @@
               <w:rPr>
                 <w:noProof/>
               </w:rPr>
-              <w:instrText xml:space="preserve"> PAGEREF _Toc241487012 \h </w:instrText>
+              <w:instrText xml:space="preserve"> PAGEREF _Toc241506714 \h </w:instrText>
             </w:r>
             <w:r>
               <w:rPr>
@@ -192,7 +192,7 @@
               <w14:ligatures w14:val="standardContextual"/>
             </w:rPr>
           </w:pPr>
-          <w:hyperlink w:anchor="_Toc241487013" w:history="1">
+          <w:hyperlink w:anchor="_Toc241506715" w:history="1">
             <w:r>
               <w:rPr>
                 <w:rStyle w:val="Hyperlink"/>
@@ -216,7 +216,7 @@
               <w:rPr>
                 <w:noProof/>
               </w:rPr>
-              <w:instrText xml:space="preserve"> PAGEREF _Toc241487013 \h </w:instrText>
+              <w:instrText xml:space="preserve"> PAGEREF _Toc241506715 \h </w:instrText>
             </w:r>
             <w:r>
               <w:rPr>
@@ -257,7 +257,7 @@
               <w14:ligatures w14:val="standardContextual"/>
             </w:rPr>
           </w:pPr>
-          <w:hyperlink w:anchor="_Toc241487014" w:history="1">
+          <w:hyperlink w:anchor="_Toc241506716" w:history="1">
             <w:r>
               <w:rPr>
                 <w:rStyle w:val="Hyperlink"/>
@@ -281,7 +281,7 @@
               <w:rPr>
                 <w:noProof/>
               </w:rPr>
-              <w:instrText xml:space="preserve"> PAGEREF _Toc241487014 \h </w:instrText>
+              <w:instrText xml:space="preserve"> PAGEREF _Toc241506716 \h </w:instrText>
             </w:r>
             <w:r>
               <w:rPr>
@@ -322,7 +322,7 @@
               <w14:ligatures w14:val="standardContextual"/>
             </w:rPr>
           </w:pPr>
-          <w:hyperlink w:anchor="_Toc241487015" w:history="1">
+          <w:hyperlink w:anchor="_Toc241506717" w:history="1">
             <w:r>
               <w:rPr>
                 <w:rStyle w:val="Hyperlink"/>
@@ -346,7 +346,7 @@
               <w:rPr>
                 <w:noProof/>
               </w:rPr>
-              <w:instrText xml:space="preserve"> PAGEREF _Toc241487015 \h </w:instrText>
+              <w:instrText xml:space="preserve"> PAGEREF _Toc241506717 \h </w:instrText>
             </w:r>
             <w:r>
               <w:rPr>
@@ -387,7 +387,7 @@
               <w14:ligatures w14:val="standardContextual"/>
             </w:rPr>
           </w:pPr>
-          <w:hyperlink w:anchor="_Toc241487016" w:history="1">
+          <w:hyperlink w:anchor="_Toc241506718" w:history="1">
             <w:r>
               <w:rPr>
                 <w:rStyle w:val="Hyperlink"/>
@@ -411,7 +411,7 @@
               <w:rPr>
                 <w:noProof/>
               </w:rPr>
-              <w:instrText xml:space="preserve"> PAGEREF _Toc241487016 \h </w:instrText>
+              <w:instrText xml:space="preserve"> PAGEREF _Toc241506718 \h </w:instrText>
             </w:r>
             <w:r>
               <w:rPr>
@@ -452,7 +452,7 @@
               <w14:ligatures w14:val="standardContextual"/>
             </w:rPr>
           </w:pPr>
-          <w:hyperlink w:anchor="_Toc241487017" w:history="1">
+          <w:hyperlink w:anchor="_Toc241506719" w:history="1">
             <w:r>
               <w:rPr>
                 <w:rStyle w:val="Hyperlink"/>
@@ -476,7 +476,7 @@
               <w:rPr>
                 <w:noProof/>
               </w:rPr>
-              <w:instrText xml:space="preserve"> PAGEREF _Toc241487017 \h </w:instrText>
+              <w:instrText xml:space="preserve"> PAGEREF _Toc241506719 \h </w:instrText>
             </w:r>
             <w:r>
               <w:rPr>
@@ -517,7 +517,7 @@
               <w14:ligatures w14:val="standardContextual"/>
             </w:rPr>
           </w:pPr>
-          <w:hyperlink w:anchor="_Toc241487018" w:history="1">
+          <w:hyperlink w:anchor="_Toc241506720" w:history="1">
             <w:r>
               <w:rPr>
                 <w:rStyle w:val="Hyperlink"/>
@@ -541,7 +541,7 @@
               <w:rPr>
                 <w:noProof/>
               </w:rPr>
-              <w:instrText xml:space="preserve"> PAGEREF _Toc241487018 \h </w:instrText>
+              <w:instrText xml:space="preserve"> PAGEREF _Toc241506720 \h </w:instrText>
             </w:r>
             <w:r>
               <w:rPr>
@@ -582,7 +582,7 @@
               <w14:ligatures w14:val="standardContextual"/>
             </w:rPr>
           </w:pPr>
-          <w:hyperlink w:anchor="_Toc241487019" w:history="1">
+          <w:hyperlink w:anchor="_Toc241506721" w:history="1">
             <w:r>
               <w:rPr>
                 <w:rStyle w:val="Hyperlink"/>
@@ -606,7 +606,7 @@
               <w:rPr>
                 <w:noProof/>
               </w:rPr>
-              <w:instrText xml:space="preserve"> PAGEREF _Toc241487019 \h </w:instrText>
+              <w:instrText xml:space="preserve"> PAGEREF _Toc241506721 \h </w:instrText>
             </w:r>
             <w:r>
               <w:rPr>
@@ -647,7 +647,7 @@
               <w14:ligatures w14:val="standardContextual"/>
             </w:rPr>
           </w:pPr>
-          <w:hyperlink w:anchor="_Toc241487020" w:history="1">
+          <w:hyperlink w:anchor="_Toc241506722" w:history="1">
             <w:r>
               <w:rPr>
                 <w:rStyle w:val="Hyperlink"/>
@@ -671,7 +671,7 @@
               <w:rPr>
                 <w:noProof/>
               </w:rPr>
-              <w:instrText xml:space="preserve"> PAGEREF _Toc241487020 \h </w:instrText>
+              <w:instrText xml:space="preserve"> PAGEREF _Toc241506722 \h </w:instrText>
             </w:r>
             <w:r>
               <w:rPr>
@@ -712,7 +712,7 @@
               <w14:ligatures w14:val="standardContextual"/>
             </w:rPr>
           </w:pPr>
-          <w:hyperlink w:anchor="_Toc241487021" w:history="1">
+          <w:hyperlink w:anchor="_Toc241506723" w:history="1">
             <w:r>
               <w:rPr>
                 <w:rStyle w:val="Hyperlink"/>
@@ -736,7 +736,7 @@
               <w:rPr>
                 <w:noProof/>
               </w:rPr>
-              <w:instrText xml:space="preserve"> PAGEREF _Toc241487021 \h </w:instrText>
+              <w:instrText xml:space="preserve"> PAGEREF _Toc241506723 \h </w:instrText>
             </w:r>
             <w:r>
               <w:rPr>
@@ -777,7 +777,7 @@
               <w14:ligatures w14:val="standardContextual"/>
             </w:rPr>
           </w:pPr>
-          <w:hyperlink w:anchor="_Toc241487022" w:history="1">
+          <w:hyperlink w:anchor="_Toc241506724" w:history="1">
             <w:r>
               <w:rPr>
                 <w:rStyle w:val="Hyperlink"/>
@@ -801,7 +801,7 @@
               <w:rPr>
                 <w:noProof/>
               </w:rPr>
-              <w:instrText xml:space="preserve"> PAGEREF _Toc241487022 \h </w:instrText>
+              <w:instrText xml:space="preserve"> PAGEREF _Toc241506724 \h </w:instrText>
             </w:r>
             <w:r>
               <w:rPr>
@@ -842,13 +842,13 @@
               <w14:ligatures w14:val="standardContextual"/>
             </w:rPr>
           </w:pPr>
-          <w:hyperlink w:anchor="_Toc241487023" w:history="1">
+          <w:hyperlink w:anchor="_Toc241506725" w:history="1">
             <w:r>
               <w:rPr>
                 <w:rStyle w:val="Hyperlink"/>
                 <w:noProof/>
               </w:rPr>
-              <w:t>5.2. Faltantes que significan «no aplica»</w:t>
+              <w:t>5.2. Faltantes que significan "no aplica"</w:t>
             </w:r>
             <w:r>
               <w:rPr>
@@ -866,7 +866,7 @@
               <w:rPr>
                 <w:noProof/>
               </w:rPr>
-              <w:instrText xml:space="preserve"> PAGEREF _Toc241487023 \h </w:instrText>
+              <w:instrText xml:space="preserve"> PAGEREF _Toc241506725 \h </w:instrText>
             </w:r>
             <w:r>
               <w:rPr>
@@ -907,7 +907,7 @@
               <w14:ligatures w14:val="standardContextual"/>
             </w:rPr>
           </w:pPr>
-          <w:hyperlink w:anchor="_Toc241487024" w:history="1">
+          <w:hyperlink w:anchor="_Toc241506726" w:history="1">
             <w:r>
               <w:rPr>
                 <w:rStyle w:val="Hyperlink"/>
@@ -931,7 +931,7 @@
               <w:rPr>
                 <w:noProof/>
               </w:rPr>
-              <w:instrText xml:space="preserve"> PAGEREF _Toc241487024 \h </w:instrText>
+              <w:instrText xml:space="preserve"> PAGEREF _Toc241506726 \h </w:instrText>
             </w:r>
             <w:r>
               <w:rPr>
@@ -972,7 +972,7 @@
               <w14:ligatures w14:val="standardContextual"/>
             </w:rPr>
           </w:pPr>
-          <w:hyperlink w:anchor="_Toc241487025" w:history="1">
+          <w:hyperlink w:anchor="_Toc241506727" w:history="1">
             <w:r>
               <w:rPr>
                 <w:rStyle w:val="Hyperlink"/>
@@ -996,7 +996,7 @@
               <w:rPr>
                 <w:noProof/>
               </w:rPr>
-              <w:instrText xml:space="preserve"> PAGEREF _Toc241487025 \h </w:instrText>
+              <w:instrText xml:space="preserve"> PAGEREF _Toc241506727 \h </w:instrText>
             </w:r>
             <w:r>
               <w:rPr>
@@ -1037,7 +1037,7 @@
               <w14:ligatures w14:val="standardContextual"/>
             </w:rPr>
           </w:pPr>
-          <w:hyperlink w:anchor="_Toc241487026" w:history="1">
+          <w:hyperlink w:anchor="_Toc241506728" w:history="1">
             <w:r>
               <w:rPr>
                 <w:rStyle w:val="Hyperlink"/>
@@ -1061,7 +1061,7 @@
               <w:rPr>
                 <w:noProof/>
               </w:rPr>
-              <w:instrText xml:space="preserve"> PAGEREF _Toc241487026 \h </w:instrText>
+              <w:instrText xml:space="preserve"> PAGEREF _Toc241506728 \h </w:instrText>
             </w:r>
             <w:r>
               <w:rPr>
@@ -1102,7 +1102,7 @@
               <w14:ligatures w14:val="standardContextual"/>
             </w:rPr>
           </w:pPr>
-          <w:hyperlink w:anchor="_Toc241487027" w:history="1">
+          <w:hyperlink w:anchor="_Toc241506729" w:history="1">
             <w:r>
               <w:rPr>
                 <w:rStyle w:val="Hyperlink"/>
@@ -1126,7 +1126,7 @@
               <w:rPr>
                 <w:noProof/>
               </w:rPr>
-              <w:instrText xml:space="preserve"> PAGEREF _Toc241487027 \h </w:instrText>
+              <w:instrText xml:space="preserve"> PAGEREF _Toc241506729 \h </w:instrText>
             </w:r>
             <w:r>
               <w:rPr>
@@ -1167,7 +1167,7 @@
               <w14:ligatures w14:val="standardContextual"/>
             </w:rPr>
           </w:pPr>
-          <w:hyperlink w:anchor="_Toc241487028" w:history="1">
+          <w:hyperlink w:anchor="_Toc241506730" w:history="1">
             <w:r>
               <w:rPr>
                 <w:rStyle w:val="Hyperlink"/>
@@ -1191,7 +1191,7 @@
               <w:rPr>
                 <w:noProof/>
               </w:rPr>
-              <w:instrText xml:space="preserve"> PAGEREF _Toc241487028 \h </w:instrText>
+              <w:instrText xml:space="preserve"> PAGEREF _Toc241506730 \h </w:instrText>
             </w:r>
             <w:r>
               <w:rPr>
@@ -1232,13 +1232,13 @@
               <w14:ligatures w14:val="standardContextual"/>
             </w:rPr>
           </w:pPr>
-          <w:hyperlink w:anchor="_Toc241487029" w:history="1">
+          <w:hyperlink w:anchor="_Toc241506731" w:history="1">
             <w:r>
               <w:rPr>
                 <w:rStyle w:val="Hyperlink"/>
                 <w:noProof/>
               </w:rPr>
-              <w:t>6.1. Comparación de criterios de detección</w:t>
+              <w:t>6.1. Criterio de detección</w:t>
             </w:r>
             <w:r>
               <w:rPr>
@@ -1256,7 +1256,7 @@
               <w:rPr>
                 <w:noProof/>
               </w:rPr>
-              <w:instrText xml:space="preserve"> PAGEREF _Toc241487029 \h </w:instrText>
+              <w:instrText xml:space="preserve"> PAGEREF _Toc241506731 \h </w:instrText>
             </w:r>
             <w:r>
               <w:rPr>
@@ -1297,7 +1297,7 @@
               <w14:ligatures w14:val="standardContextual"/>
             </w:rPr>
           </w:pPr>
-          <w:hyperlink w:anchor="_Toc241487030" w:history="1">
+          <w:hyperlink w:anchor="_Toc241506732" w:history="1">
             <w:r>
               <w:rPr>
                 <w:rStyle w:val="Hyperlink"/>
@@ -1321,7 +1321,7 @@
               <w:rPr>
                 <w:noProof/>
               </w:rPr>
-              <w:instrText xml:space="preserve"> PAGEREF _Toc241487030 \h </w:instrText>
+              <w:instrText xml:space="preserve"> PAGEREF _Toc241506732 \h </w:instrText>
             </w:r>
             <w:r>
               <w:rPr>
@@ -1362,7 +1362,7 @@
               <w14:ligatures w14:val="standardContextual"/>
             </w:rPr>
           </w:pPr>
-          <w:hyperlink w:anchor="_Toc241487031" w:history="1">
+          <w:hyperlink w:anchor="_Toc241506733" w:history="1">
             <w:r>
               <w:rPr>
                 <w:rStyle w:val="Hyperlink"/>
@@ -1386,7 +1386,7 @@
               <w:rPr>
                 <w:noProof/>
               </w:rPr>
-              <w:instrText xml:space="preserve"> PAGEREF _Toc241487031 \h </w:instrText>
+              <w:instrText xml:space="preserve"> PAGEREF _Toc241506733 \h </w:instrText>
             </w:r>
             <w:r>
               <w:rPr>
@@ -1427,7 +1427,7 @@
               <w14:ligatures w14:val="standardContextual"/>
             </w:rPr>
           </w:pPr>
-          <w:hyperlink w:anchor="_Toc241487032" w:history="1">
+          <w:hyperlink w:anchor="_Toc241506734" w:history="1">
             <w:r>
               <w:rPr>
                 <w:rStyle w:val="Hyperlink"/>
@@ -1451,7 +1451,7 @@
               <w:rPr>
                 <w:noProof/>
               </w:rPr>
-              <w:instrText xml:space="preserve"> PAGEREF _Toc241487032 \h </w:instrText>
+              <w:instrText xml:space="preserve"> PAGEREF _Toc241506734 \h </w:instrText>
             </w:r>
             <w:r>
               <w:rPr>
@@ -1492,7 +1492,7 @@
               <w14:ligatures w14:val="standardContextual"/>
             </w:rPr>
           </w:pPr>
-          <w:hyperlink w:anchor="_Toc241487033" w:history="1">
+          <w:hyperlink w:anchor="_Toc241506735" w:history="1">
             <w:r>
               <w:rPr>
                 <w:rStyle w:val="Hyperlink"/>
@@ -1516,7 +1516,7 @@
               <w:rPr>
                 <w:noProof/>
               </w:rPr>
-              <w:instrText xml:space="preserve"> PAGEREF _Toc241487033 \h </w:instrText>
+              <w:instrText xml:space="preserve"> PAGEREF _Toc241506735 \h </w:instrText>
             </w:r>
             <w:r>
               <w:rPr>
@@ -1557,7 +1557,7 @@
               <w14:ligatures w14:val="standardContextual"/>
             </w:rPr>
           </w:pPr>
-          <w:hyperlink w:anchor="_Toc241487034" w:history="1">
+          <w:hyperlink w:anchor="_Toc241506736" w:history="1">
             <w:r>
               <w:rPr>
                 <w:rStyle w:val="Hyperlink"/>
@@ -1581,7 +1581,7 @@
               <w:rPr>
                 <w:noProof/>
               </w:rPr>
-              <w:instrText xml:space="preserve"> PAGEREF _Toc241487034 \h </w:instrText>
+              <w:instrText xml:space="preserve"> PAGEREF _Toc241506736 \h </w:instrText>
             </w:r>
             <w:r>
               <w:rPr>
@@ -1622,7 +1622,7 @@
               <w14:ligatures w14:val="standardContextual"/>
             </w:rPr>
           </w:pPr>
-          <w:hyperlink w:anchor="_Toc241487035" w:history="1">
+          <w:hyperlink w:anchor="_Toc241506737" w:history="1">
             <w:r>
               <w:rPr>
                 <w:rStyle w:val="Hyperlink"/>
@@ -1646,7 +1646,7 @@
               <w:rPr>
                 <w:noProof/>
               </w:rPr>
-              <w:instrText xml:space="preserve"> PAGEREF _Toc241487035 \h </w:instrText>
+              <w:instrText xml:space="preserve"> PAGEREF _Toc241506737 \h </w:instrText>
             </w:r>
             <w:r>
               <w:rPr>
@@ -1687,7 +1687,7 @@
               <w14:ligatures w14:val="standardContextual"/>
             </w:rPr>
           </w:pPr>
-          <w:hyperlink w:anchor="_Toc241487036" w:history="1">
+          <w:hyperlink w:anchor="_Toc241506738" w:history="1">
             <w:r>
               <w:rPr>
                 <w:rStyle w:val="Hyperlink"/>
@@ -1711,7 +1711,7 @@
               <w:rPr>
                 <w:noProof/>
               </w:rPr>
-              <w:instrText xml:space="preserve"> PAGEREF _Toc241487036 \h </w:instrText>
+              <w:instrText xml:space="preserve"> PAGEREF _Toc241506738 \h </w:instrText>
             </w:r>
             <w:r>
               <w:rPr>
@@ -1728,7 +1728,7 @@
               <w:rPr>
                 <w:noProof/>
               </w:rPr>
-              <w:t>13</w:t>
+              <w:t>14</w:t>
             </w:r>
             <w:r>
               <w:rPr>
@@ -1752,7 +1752,7 @@
               <w14:ligatures w14:val="standardContextual"/>
             </w:rPr>
           </w:pPr>
-          <w:hyperlink w:anchor="_Toc241487037" w:history="1">
+          <w:hyperlink w:anchor="_Toc241506739" w:history="1">
             <w:r>
               <w:rPr>
                 <w:rStyle w:val="Hyperlink"/>
@@ -1776,7 +1776,7 @@
               <w:rPr>
                 <w:noProof/>
               </w:rPr>
-              <w:instrText xml:space="preserve"> PAGEREF _Toc241487037 \h </w:instrText>
+              <w:instrText xml:space="preserve"> PAGEREF _Toc241506739 \h </w:instrText>
             </w:r>
             <w:r>
               <w:rPr>
@@ -1817,7 +1817,7 @@
               <w14:ligatures w14:val="standardContextual"/>
             </w:rPr>
           </w:pPr>
-          <w:hyperlink w:anchor="_Toc241487038" w:history="1">
+          <w:hyperlink w:anchor="_Toc241506740" w:history="1">
             <w:r>
               <w:rPr>
                 <w:rStyle w:val="Hyperlink"/>
@@ -1841,7 +1841,7 @@
               <w:rPr>
                 <w:noProof/>
               </w:rPr>
-              <w:instrText xml:space="preserve"> PAGEREF _Toc241487038 \h </w:instrText>
+              <w:instrText xml:space="preserve"> PAGEREF _Toc241506740 \h </w:instrText>
             </w:r>
             <w:r>
               <w:rPr>
@@ -1858,7 +1858,7 @@
               <w:rPr>
                 <w:noProof/>
               </w:rPr>
-              <w:t>14</w:t>
+              <w:t>15</w:t>
             </w:r>
             <w:r>
               <w:rPr>
@@ -1882,7 +1882,7 @@
               <w14:ligatures w14:val="standardContextual"/>
             </w:rPr>
           </w:pPr>
-          <w:hyperlink w:anchor="_Toc241487039" w:history="1">
+          <w:hyperlink w:anchor="_Toc241506741" w:history="1">
             <w:r>
               <w:rPr>
                 <w:rStyle w:val="Hyperlink"/>
@@ -1906,7 +1906,7 @@
               <w:rPr>
                 <w:noProof/>
               </w:rPr>
-              <w:instrText xml:space="preserve"> PAGEREF _Toc241487039 \h </w:instrText>
+              <w:instrText xml:space="preserve"> PAGEREF _Toc241506741 \h </w:instrText>
             </w:r>
             <w:r>
               <w:rPr>
@@ -1949,7 +1949,7 @@
       <w:pPr>
         <w:pStyle w:val="Heading1"/>
       </w:pPr>
-      <w:bookmarkStart w:id="0" w:name="_Toc241487012"/>
+      <w:bookmarkStart w:id="0" w:name="_Toc241506714"/>
       <w:r>
         <w:t>1. Introducción</w:t>
       </w:r>
@@ -1987,7 +1987,7 @@
       <w:pPr>
         <w:pStyle w:val="Heading1"/>
       </w:pPr>
-      <w:bookmarkStart w:id="1" w:name="_Toc241487013"/>
+      <w:bookmarkStart w:id="1" w:name="_Toc241506715"/>
       <w:r>
         <w:t>2. Descripción del conjunto de datos</w:t>
       </w:r>
@@ -2751,7 +2751,7 @@
                 <w:sz w:val="20"/>
                 <w:szCs w:val="20"/>
               </w:rPr>
-              <w:t>Sub-área vinícola (sólo Estados Unidos)</w:t>
+              <w:t>Sub-área vinícola (solo Estados Unidos)</w:t>
             </w:r>
           </w:p>
         </w:tc>
@@ -3180,7 +3180,7 @@
       <w:pPr>
         <w:pStyle w:val="Heading1"/>
       </w:pPr>
-      <w:bookmarkStart w:id="2" w:name="_Toc241487014"/>
+      <w:bookmarkStart w:id="2" w:name="_Toc241506716"/>
       <w:r>
         <w:t>3. Carga e integridad del archivo</w:t>
       </w:r>
@@ -3262,7 +3262,7 @@
         <w:t>Codificación.</w:t>
       </w:r>
       <w:r>
-        <w:t xml:space="preserve"> Los acentos venían rotos («Gewürztraminer» aparecía como «GewÃ¼rztraminer»), que es lo que pasa cuando un texto UTF-8 se lee como cp1252. Se arregla haciendo la conversión al revés. Así recuperé 106.479 de las 106.611 celdas afectadas; las 132 restantes son comillas tipográficas que este método no puede arreglar.</w:t>
+        <w:t xml:space="preserve"> Los acentos venían rotos ("Gewürztraminer" aparecía como "GewÃ¼rztraminer"), que es lo que pasa cuando un texto UTF-8 se lee como cp1252. Se arregla haciendo la conversión al revés. Así recuperé 106.479 de las 106.611 celdas afectadas; las 132 restantes son comillas tipográficas que este método no puede arreglar.</w:t>
       </w:r>
     </w:p>
     <w:p>
@@ -3298,7 +3298,7 @@
       <w:pPr>
         <w:pStyle w:val="Heading1"/>
       </w:pPr>
-      <w:bookmarkStart w:id="3" w:name="_Toc241487015"/>
+      <w:bookmarkStart w:id="3" w:name="_Toc241506717"/>
       <w:r>
         <w:t>4. Análisis exploratorio</w:t>
       </w:r>
@@ -3308,7 +3308,7 @@
       <w:pPr>
         <w:pStyle w:val="Heading2"/>
       </w:pPr>
-      <w:bookmarkStart w:id="4" w:name="_Toc241487016"/>
+      <w:bookmarkStart w:id="4" w:name="_Toc241506718"/>
       <w:r>
         <w:t>4.1. Estructura y duplicados</w:t>
       </w:r>
@@ -3396,7 +3396,7 @@
       <w:pPr>
         <w:pStyle w:val="Heading2"/>
       </w:pPr>
-      <w:bookmarkStart w:id="5" w:name="_Toc241487017"/>
+      <w:bookmarkStart w:id="5" w:name="_Toc241506719"/>
       <w:r>
         <w:t>4.2. Resumen estadístico de las variables numéricas</w:t>
       </w:r>
@@ -4094,166 +4094,6 @@
           </w:p>
         </w:tc>
       </w:tr>
-      <w:tr>
-        <w:trPr>
-          <w:cantSplit/>
-          <w:jc w:val="center"/>
-        </w:trPr>
-        <w:tc>
-          <w:tcPr>
-            <w:tcW w:w="4535" w:type="dxa"/>
-            <w:tcMar>
-              <w:top w:w="40" w:type="dxa"/>
-              <w:left w:w="100" w:type="dxa"/>
-              <w:bottom w:w="40" w:type="dxa"/>
-              <w:right w:w="100" w:type="dxa"/>
-            </w:tcMar>
-            <w:vAlign w:val="center"/>
-          </w:tcPr>
-          <w:p>
-            <w:pPr>
-              <w:spacing w:after="0" w:line="240" w:lineRule="auto"/>
-            </w:pPr>
-            <w:r>
-              <w:rPr>
-                <w:sz w:val="20"/>
-                <w:szCs w:val="20"/>
-              </w:rPr>
-              <w:t>Curtosis</w:t>
-            </w:r>
-          </w:p>
-        </w:tc>
-        <w:tc>
-          <w:tcPr>
-            <w:tcW w:w="2267" w:type="dxa"/>
-            <w:tcMar>
-              <w:top w:w="40" w:type="dxa"/>
-              <w:left w:w="100" w:type="dxa"/>
-              <w:bottom w:w="40" w:type="dxa"/>
-              <w:right w:w="100" w:type="dxa"/>
-            </w:tcMar>
-            <w:vAlign w:val="center"/>
-          </w:tcPr>
-          <w:p>
-            <w:pPr>
-              <w:spacing w:after="0" w:line="240" w:lineRule="auto"/>
-              <w:jc w:val="right"/>
-            </w:pPr>
-            <w:r>
-              <w:rPr>
-                <w:sz w:val="20"/>
-                <w:szCs w:val="20"/>
-              </w:rPr>
-              <w:t>-0,34</w:t>
-            </w:r>
-          </w:p>
-        </w:tc>
-        <w:tc>
-          <w:tcPr>
-            <w:tcW w:w="2267" w:type="dxa"/>
-            <w:tcMar>
-              <w:top w:w="40" w:type="dxa"/>
-              <w:left w:w="100" w:type="dxa"/>
-              <w:bottom w:w="40" w:type="dxa"/>
-              <w:right w:w="100" w:type="dxa"/>
-            </w:tcMar>
-            <w:vAlign w:val="center"/>
-          </w:tcPr>
-          <w:p>
-            <w:pPr>
-              <w:spacing w:after="0" w:line="240" w:lineRule="auto"/>
-              <w:jc w:val="right"/>
-            </w:pPr>
-            <w:r>
-              <w:rPr>
-                <w:sz w:val="20"/>
-                <w:szCs w:val="20"/>
-              </w:rPr>
-              <w:t>809,37</w:t>
-            </w:r>
-          </w:p>
-        </w:tc>
-      </w:tr>
-      <w:tr>
-        <w:trPr>
-          <w:cantSplit/>
-          <w:jc w:val="center"/>
-        </w:trPr>
-        <w:tc>
-          <w:tcPr>
-            <w:tcW w:w="4535" w:type="dxa"/>
-            <w:tcMar>
-              <w:top w:w="40" w:type="dxa"/>
-              <w:left w:w="100" w:type="dxa"/>
-              <w:bottom w:w="40" w:type="dxa"/>
-              <w:right w:w="100" w:type="dxa"/>
-            </w:tcMar>
-            <w:vAlign w:val="center"/>
-          </w:tcPr>
-          <w:p>
-            <w:pPr>
-              <w:spacing w:after="0" w:line="240" w:lineRule="auto"/>
-            </w:pPr>
-            <w:r>
-              <w:rPr>
-                <w:sz w:val="20"/>
-                <w:szCs w:val="20"/>
-              </w:rPr>
-              <w:t>Coeficiente de variación</w:t>
-            </w:r>
-          </w:p>
-        </w:tc>
-        <w:tc>
-          <w:tcPr>
-            <w:tcW w:w="2267" w:type="dxa"/>
-            <w:tcMar>
-              <w:top w:w="40" w:type="dxa"/>
-              <w:left w:w="100" w:type="dxa"/>
-              <w:bottom w:w="40" w:type="dxa"/>
-              <w:right w:w="100" w:type="dxa"/>
-            </w:tcMar>
-            <w:vAlign w:val="center"/>
-          </w:tcPr>
-          <w:p>
-            <w:pPr>
-              <w:spacing w:after="0" w:line="240" w:lineRule="auto"/>
-              <w:jc w:val="right"/>
-            </w:pPr>
-            <w:r>
-              <w:rPr>
-                <w:sz w:val="20"/>
-                <w:szCs w:val="20"/>
-              </w:rPr>
-              <w:t>0,03</w:t>
-            </w:r>
-          </w:p>
-        </w:tc>
-        <w:tc>
-          <w:tcPr>
-            <w:tcW w:w="2267" w:type="dxa"/>
-            <w:tcMar>
-              <w:top w:w="40" w:type="dxa"/>
-              <w:left w:w="100" w:type="dxa"/>
-              <w:bottom w:w="40" w:type="dxa"/>
-              <w:right w:w="100" w:type="dxa"/>
-            </w:tcMar>
-            <w:vAlign w:val="center"/>
-          </w:tcPr>
-          <w:p>
-            <w:pPr>
-              <w:spacing w:after="0" w:line="240" w:lineRule="auto"/>
-              <w:jc w:val="right"/>
-            </w:pPr>
-            <w:r>
-              <w:rPr>
-                <w:sz w:val="20"/>
-                <w:szCs w:val="20"/>
-              </w:rPr>
-              <w:t>1,18</w:t>
-            </w:r>
-          </w:p>
-        </w:tc>
-      </w:tr>
     </w:tbl>
     <w:p/>
     <w:p>
@@ -4282,14 +4122,14 @@
         <w:t>price</w:t>
       </w:r>
       <w:r>
-        <w:t>, en cambio, tiene asimetría 17,96 y curtosis 809, la media supera a la mediana en un 42% y el máximo es 132 veces la mediana. Por eso para el precio uso mediana y rango intercuartílico, y escala logarítmica en los gráficos.</w:t>
+        <w:t>, en cambio, tiene asimetría 17,96: la media supera a la mediana en un 42% y el máximo es 132 veces la mediana. Por eso para el precio uso mediana y rango intercuartílico, y escala logarítmica en los gráficos.</w:t>
       </w:r>
     </w:p>
     <w:p>
       <w:pPr>
         <w:pStyle w:val="Heading2"/>
       </w:pPr>
-      <w:bookmarkStart w:id="6" w:name="_Toc241487018"/>
+      <w:bookmarkStart w:id="6" w:name="_Toc241506720"/>
       <w:r>
         <w:t>4.3. Resumen estadístico de las variables categóricas</w:t>
       </w:r>
@@ -4301,7 +4141,7 @@
         <w:jc w:val="both"/>
       </w:pPr>
       <w:r>
-        <w:t>Para las categóricas no tiene sentido calcular media ni desvío. En su lugar uso la moda, el porcentaje que representa y lo que suman las 10 categorías más frecuentes. También calculé la entropía normalizada, que va de 0 (todas las reseñas en una sola categoría) a 1 (repartidas en partes iguales) y sirve para comparar qué tan concentrada está cada variable.</w:t>
+        <w:t>Para las categóricas no tiene sentido calcular media ni desvío. En su lugar uso la moda, el porcentaje que representa y lo que suman las 10 categorías más frecuentes. Ese último número muestra qué tan concentrada está cada variable: si es alto, unas pocas categorías se llevan casi todas las reseñas.</w:t>
       </w:r>
     </w:p>
     <w:p>
@@ -4342,12 +4182,11 @@
         <w:tblLook w:val="0000" w:firstRow="0" w:lastRow="0" w:firstColumn="0" w:lastColumn="0" w:noHBand="0" w:noVBand="0"/>
       </w:tblPr>
       <w:tblGrid>
-        <w:gridCol w:w="1770"/>
-        <w:gridCol w:w="1327"/>
-        <w:gridCol w:w="2655"/>
-        <w:gridCol w:w="1106"/>
-        <w:gridCol w:w="1106"/>
-        <w:gridCol w:w="1106"/>
+        <w:gridCol w:w="2017"/>
+        <w:gridCol w:w="1511"/>
+        <w:gridCol w:w="3024"/>
+        <w:gridCol w:w="1259"/>
+        <w:gridCol w:w="1259"/>
       </w:tblGrid>
       <w:tr>
         <w:trPr>
@@ -4357,7 +4196,7 @@
         </w:trPr>
         <w:tc>
           <w:tcPr>
-            <w:tcW w:w="1769" w:type="dxa"/>
+            <w:tcW w:w="2015" w:type="dxa"/>
             <w:shd w:val="clear" w:color="auto" w:fill="EDE3E6"/>
             <w:tcMar>
               <w:top w:w="40" w:type="dxa"/>
@@ -4384,7 +4223,7 @@
         </w:tc>
         <w:tc>
           <w:tcPr>
-            <w:tcW w:w="1327" w:type="dxa"/>
+            <w:tcW w:w="1511" w:type="dxa"/>
             <w:shd w:val="clear" w:color="auto" w:fill="EDE3E6"/>
             <w:tcMar>
               <w:top w:w="40" w:type="dxa"/>
@@ -4412,7 +4251,7 @@
         </w:tc>
         <w:tc>
           <w:tcPr>
-            <w:tcW w:w="2654" w:type="dxa"/>
+            <w:tcW w:w="3023" w:type="dxa"/>
             <w:shd w:val="clear" w:color="auto" w:fill="EDE3E6"/>
             <w:tcMar>
               <w:top w:w="40" w:type="dxa"/>
@@ -4439,7 +4278,7 @@
         </w:tc>
         <w:tc>
           <w:tcPr>
-            <w:tcW w:w="1106" w:type="dxa"/>
+            <w:tcW w:w="1259" w:type="dxa"/>
             <w:shd w:val="clear" w:color="auto" w:fill="EDE3E6"/>
             <w:tcMar>
               <w:top w:w="40" w:type="dxa"/>
@@ -4467,7 +4306,7 @@
         </w:tc>
         <w:tc>
           <w:tcPr>
-            <w:tcW w:w="1106" w:type="dxa"/>
+            <w:tcW w:w="1259" w:type="dxa"/>
             <w:shd w:val="clear" w:color="auto" w:fill="EDE3E6"/>
             <w:tcMar>
               <w:top w:w="40" w:type="dxa"/>
@@ -4490,34 +4329,6 @@
                 <w:szCs w:val="20"/>
               </w:rPr>
               <w:t>Top 10 %</w:t>
-            </w:r>
-          </w:p>
-        </w:tc>
-        <w:tc>
-          <w:tcPr>
-            <w:tcW w:w="1106" w:type="dxa"/>
-            <w:shd w:val="clear" w:color="auto" w:fill="EDE3E6"/>
-            <w:tcMar>
-              <w:top w:w="40" w:type="dxa"/>
-              <w:left w:w="100" w:type="dxa"/>
-              <w:bottom w:w="40" w:type="dxa"/>
-              <w:right w:w="100" w:type="dxa"/>
-            </w:tcMar>
-            <w:vAlign w:val="center"/>
-          </w:tcPr>
-          <w:p>
-            <w:pPr>
-              <w:spacing w:after="0" w:line="240" w:lineRule="auto"/>
-              <w:jc w:val="right"/>
-            </w:pPr>
-            <w:r>
-              <w:rPr>
-                <w:b/>
-                <w:bCs/>
-                <w:sz w:val="20"/>
-                <w:szCs w:val="20"/>
-              </w:rPr>
-              <w:t>Entropía</w:t>
             </w:r>
           </w:p>
         </w:tc>
@@ -4529,7 +4340,7 @@
         </w:trPr>
         <w:tc>
           <w:tcPr>
-            <w:tcW w:w="1769" w:type="dxa"/>
+            <w:tcW w:w="2015" w:type="dxa"/>
             <w:tcMar>
               <w:top w:w="40" w:type="dxa"/>
               <w:left w:w="100" w:type="dxa"/>
@@ -4553,7 +4364,7 @@
         </w:tc>
         <w:tc>
           <w:tcPr>
-            <w:tcW w:w="1327" w:type="dxa"/>
+            <w:tcW w:w="1511" w:type="dxa"/>
             <w:tcMar>
               <w:top w:w="40" w:type="dxa"/>
               <w:left w:w="100" w:type="dxa"/>
@@ -4578,7 +4389,7 @@
         </w:tc>
         <w:tc>
           <w:tcPr>
-            <w:tcW w:w="2654" w:type="dxa"/>
+            <w:tcW w:w="3023" w:type="dxa"/>
             <w:tcMar>
               <w:top w:w="40" w:type="dxa"/>
               <w:left w:w="100" w:type="dxa"/>
@@ -4602,7 +4413,7 @@
         </w:tc>
         <w:tc>
           <w:tcPr>
-            <w:tcW w:w="1106" w:type="dxa"/>
+            <w:tcW w:w="1259" w:type="dxa"/>
             <w:tcMar>
               <w:top w:w="40" w:type="dxa"/>
               <w:left w:w="100" w:type="dxa"/>
@@ -4627,7 +4438,7 @@
         </w:tc>
         <w:tc>
           <w:tcPr>
-            <w:tcW w:w="1106" w:type="dxa"/>
+            <w:tcW w:w="1259" w:type="dxa"/>
             <w:tcMar>
               <w:top w:w="40" w:type="dxa"/>
               <w:left w:w="100" w:type="dxa"/>
@@ -4647,31 +4458,6 @@
                 <w:szCs w:val="20"/>
               </w:rPr>
               <w:t>96,0</w:t>
-            </w:r>
-          </w:p>
-        </w:tc>
-        <w:tc>
-          <w:tcPr>
-            <w:tcW w:w="1106" w:type="dxa"/>
-            <w:tcMar>
-              <w:top w:w="40" w:type="dxa"/>
-              <w:left w:w="100" w:type="dxa"/>
-              <w:bottom w:w="40" w:type="dxa"/>
-              <w:right w:w="100" w:type="dxa"/>
-            </w:tcMar>
-            <w:vAlign w:val="center"/>
-          </w:tcPr>
-          <w:p>
-            <w:pPr>
-              <w:spacing w:after="0" w:line="240" w:lineRule="auto"/>
-              <w:jc w:val="right"/>
-            </w:pPr>
-            <w:r>
-              <w:rPr>
-                <w:sz w:val="20"/>
-                <w:szCs w:val="20"/>
-              </w:rPr>
-              <w:t>0,510</w:t>
             </w:r>
           </w:p>
         </w:tc>
@@ -4683,7 +4469,7 @@
         </w:trPr>
         <w:tc>
           <w:tcPr>
-            <w:tcW w:w="1769" w:type="dxa"/>
+            <w:tcW w:w="2015" w:type="dxa"/>
             <w:tcMar>
               <w:top w:w="40" w:type="dxa"/>
               <w:left w:w="100" w:type="dxa"/>
@@ -4707,7 +4493,7 @@
         </w:tc>
         <w:tc>
           <w:tcPr>
-            <w:tcW w:w="1327" w:type="dxa"/>
+            <w:tcW w:w="1511" w:type="dxa"/>
             <w:tcMar>
               <w:top w:w="40" w:type="dxa"/>
               <w:left w:w="100" w:type="dxa"/>
@@ -4732,7 +4518,7 @@
         </w:tc>
         <w:tc>
           <w:tcPr>
-            <w:tcW w:w="2654" w:type="dxa"/>
+            <w:tcW w:w="3023" w:type="dxa"/>
             <w:tcMar>
               <w:top w:w="40" w:type="dxa"/>
               <w:left w:w="100" w:type="dxa"/>
@@ -4756,7 +4542,7 @@
         </w:tc>
         <w:tc>
           <w:tcPr>
-            <w:tcW w:w="1106" w:type="dxa"/>
+            <w:tcW w:w="1259" w:type="dxa"/>
             <w:tcMar>
               <w:top w:w="40" w:type="dxa"/>
               <w:left w:w="100" w:type="dxa"/>
@@ -4781,7 +4567,7 @@
         </w:tc>
         <w:tc>
           <w:tcPr>
-            <w:tcW w:w="1106" w:type="dxa"/>
+            <w:tcW w:w="1259" w:type="dxa"/>
             <w:tcMar>
               <w:top w:w="40" w:type="dxa"/>
               <w:left w:w="100" w:type="dxa"/>
@@ -4801,31 +4587,6 @@
                 <w:szCs w:val="20"/>
               </w:rPr>
               <w:t>61,5</w:t>
-            </w:r>
-          </w:p>
-        </w:tc>
-        <w:tc>
-          <w:tcPr>
-            <w:tcW w:w="1106" w:type="dxa"/>
-            <w:tcMar>
-              <w:top w:w="40" w:type="dxa"/>
-              <w:left w:w="100" w:type="dxa"/>
-              <w:bottom w:w="40" w:type="dxa"/>
-              <w:right w:w="100" w:type="dxa"/>
-            </w:tcMar>
-            <w:vAlign w:val="center"/>
-          </w:tcPr>
-          <w:p>
-            <w:pPr>
-              <w:spacing w:after="0" w:line="240" w:lineRule="auto"/>
-              <w:jc w:val="right"/>
-            </w:pPr>
-            <w:r>
-              <w:rPr>
-                <w:sz w:val="20"/>
-                <w:szCs w:val="20"/>
-              </w:rPr>
-              <w:t>0,577</w:t>
             </w:r>
           </w:p>
         </w:tc>
@@ -4837,7 +4598,7 @@
         </w:trPr>
         <w:tc>
           <w:tcPr>
-            <w:tcW w:w="1769" w:type="dxa"/>
+            <w:tcW w:w="2015" w:type="dxa"/>
             <w:tcMar>
               <w:top w:w="40" w:type="dxa"/>
               <w:left w:w="100" w:type="dxa"/>
@@ -4861,7 +4622,7 @@
         </w:tc>
         <w:tc>
           <w:tcPr>
-            <w:tcW w:w="1327" w:type="dxa"/>
+            <w:tcW w:w="1511" w:type="dxa"/>
             <w:tcMar>
               <w:top w:w="40" w:type="dxa"/>
               <w:left w:w="100" w:type="dxa"/>
@@ -4886,7 +4647,7 @@
         </w:tc>
         <w:tc>
           <w:tcPr>
-            <w:tcW w:w="2654" w:type="dxa"/>
+            <w:tcW w:w="3023" w:type="dxa"/>
             <w:tcMar>
               <w:top w:w="40" w:type="dxa"/>
               <w:left w:w="100" w:type="dxa"/>
@@ -4910,7 +4671,7 @@
         </w:tc>
         <w:tc>
           <w:tcPr>
-            <w:tcW w:w="1106" w:type="dxa"/>
+            <w:tcW w:w="1259" w:type="dxa"/>
             <w:tcMar>
               <w:top w:w="40" w:type="dxa"/>
               <w:left w:w="100" w:type="dxa"/>
@@ -4935,7 +4696,7 @@
         </w:tc>
         <w:tc>
           <w:tcPr>
-            <w:tcW w:w="1106" w:type="dxa"/>
+            <w:tcW w:w="1259" w:type="dxa"/>
             <w:tcMar>
               <w:top w:w="40" w:type="dxa"/>
               <w:left w:w="100" w:type="dxa"/>
@@ -4955,31 +4716,6 @@
                 <w:szCs w:val="20"/>
               </w:rPr>
               <w:t>24,6</w:t>
-            </w:r>
-          </w:p>
-        </w:tc>
-        <w:tc>
-          <w:tcPr>
-            <w:tcW w:w="1106" w:type="dxa"/>
-            <w:tcMar>
-              <w:top w:w="40" w:type="dxa"/>
-              <w:left w:w="100" w:type="dxa"/>
-              <w:bottom w:w="40" w:type="dxa"/>
-              <w:right w:w="100" w:type="dxa"/>
-            </w:tcMar>
-            <w:vAlign w:val="center"/>
-          </w:tcPr>
-          <w:p>
-            <w:pPr>
-              <w:spacing w:after="0" w:line="240" w:lineRule="auto"/>
-              <w:jc w:val="right"/>
-            </w:pPr>
-            <w:r>
-              <w:rPr>
-                <w:sz w:val="20"/>
-                <w:szCs w:val="20"/>
-              </w:rPr>
-              <w:t>0,769</w:t>
             </w:r>
           </w:p>
         </w:tc>
@@ -4991,7 +4727,7 @@
         </w:trPr>
         <w:tc>
           <w:tcPr>
-            <w:tcW w:w="1769" w:type="dxa"/>
+            <w:tcW w:w="2015" w:type="dxa"/>
             <w:tcMar>
               <w:top w:w="40" w:type="dxa"/>
               <w:left w:w="100" w:type="dxa"/>
@@ -5015,7 +4751,7 @@
         </w:tc>
         <w:tc>
           <w:tcPr>
-            <w:tcW w:w="1327" w:type="dxa"/>
+            <w:tcW w:w="1511" w:type="dxa"/>
             <w:tcMar>
               <w:top w:w="40" w:type="dxa"/>
               <w:left w:w="100" w:type="dxa"/>
@@ -5040,7 +4776,7 @@
         </w:tc>
         <w:tc>
           <w:tcPr>
-            <w:tcW w:w="2654" w:type="dxa"/>
+            <w:tcW w:w="3023" w:type="dxa"/>
             <w:tcMar>
               <w:top w:w="40" w:type="dxa"/>
               <w:left w:w="100" w:type="dxa"/>
@@ -5064,7 +4800,7 @@
         </w:tc>
         <w:tc>
           <w:tcPr>
-            <w:tcW w:w="1106" w:type="dxa"/>
+            <w:tcW w:w="1259" w:type="dxa"/>
             <w:tcMar>
               <w:top w:w="40" w:type="dxa"/>
               <w:left w:w="100" w:type="dxa"/>
@@ -5089,7 +4825,7 @@
         </w:tc>
         <w:tc>
           <w:tcPr>
-            <w:tcW w:w="1106" w:type="dxa"/>
+            <w:tcW w:w="1259" w:type="dxa"/>
             <w:tcMar>
               <w:top w:w="40" w:type="dxa"/>
               <w:left w:w="100" w:type="dxa"/>
@@ -5109,31 +4845,6 @@
                 <w:szCs w:val="20"/>
               </w:rPr>
               <w:t>92,3</w:t>
-            </w:r>
-          </w:p>
-        </w:tc>
-        <w:tc>
-          <w:tcPr>
-            <w:tcW w:w="1106" w:type="dxa"/>
-            <w:tcMar>
-              <w:top w:w="40" w:type="dxa"/>
-              <w:left w:w="100" w:type="dxa"/>
-              <w:bottom w:w="40" w:type="dxa"/>
-              <w:right w:w="100" w:type="dxa"/>
-            </w:tcMar>
-            <w:vAlign w:val="center"/>
-          </w:tcPr>
-          <w:p>
-            <w:pPr>
-              <w:spacing w:after="0" w:line="240" w:lineRule="auto"/>
-              <w:jc w:val="right"/>
-            </w:pPr>
-            <w:r>
-              <w:rPr>
-                <w:sz w:val="20"/>
-                <w:szCs w:val="20"/>
-              </w:rPr>
-              <w:t>0,802</w:t>
             </w:r>
           </w:p>
         </w:tc>
@@ -5145,7 +4856,7 @@
         </w:trPr>
         <w:tc>
           <w:tcPr>
-            <w:tcW w:w="1769" w:type="dxa"/>
+            <w:tcW w:w="2015" w:type="dxa"/>
             <w:tcMar>
               <w:top w:w="40" w:type="dxa"/>
               <w:left w:w="100" w:type="dxa"/>
@@ -5169,7 +4880,7 @@
         </w:tc>
         <w:tc>
           <w:tcPr>
-            <w:tcW w:w="1327" w:type="dxa"/>
+            <w:tcW w:w="1511" w:type="dxa"/>
             <w:tcMar>
               <w:top w:w="40" w:type="dxa"/>
               <w:left w:w="100" w:type="dxa"/>
@@ -5194,7 +4905,7 @@
         </w:tc>
         <w:tc>
           <w:tcPr>
-            <w:tcW w:w="2654" w:type="dxa"/>
+            <w:tcW w:w="3023" w:type="dxa"/>
             <w:tcMar>
               <w:top w:w="40" w:type="dxa"/>
               <w:left w:w="100" w:type="dxa"/>
@@ -5218,7 +4929,7 @@
         </w:tc>
         <w:tc>
           <w:tcPr>
-            <w:tcW w:w="1106" w:type="dxa"/>
+            <w:tcW w:w="1259" w:type="dxa"/>
             <w:tcMar>
               <w:top w:w="40" w:type="dxa"/>
               <w:left w:w="100" w:type="dxa"/>
@@ -5243,7 +4954,7 @@
         </w:tc>
         <w:tc>
           <w:tcPr>
-            <w:tcW w:w="1106" w:type="dxa"/>
+            <w:tcW w:w="1259" w:type="dxa"/>
             <w:tcMar>
               <w:top w:w="40" w:type="dxa"/>
               <w:left w:w="100" w:type="dxa"/>
@@ -5263,31 +4974,6 @@
                 <w:szCs w:val="20"/>
               </w:rPr>
               <w:t>55,0</w:t>
-            </w:r>
-          </w:p>
-        </w:tc>
-        <w:tc>
-          <w:tcPr>
-            <w:tcW w:w="1106" w:type="dxa"/>
-            <w:tcMar>
-              <w:top w:w="40" w:type="dxa"/>
-              <w:left w:w="100" w:type="dxa"/>
-              <w:bottom w:w="40" w:type="dxa"/>
-              <w:right w:w="100" w:type="dxa"/>
-            </w:tcMar>
-            <w:vAlign w:val="center"/>
-          </w:tcPr>
-          <w:p>
-            <w:pPr>
-              <w:spacing w:after="0" w:line="240" w:lineRule="auto"/>
-              <w:jc w:val="right"/>
-            </w:pPr>
-            <w:r>
-              <w:rPr>
-                <w:sz w:val="20"/>
-                <w:szCs w:val="20"/>
-              </w:rPr>
-              <w:t>0,598</w:t>
             </w:r>
           </w:p>
         </w:tc>
@@ -5299,7 +4985,7 @@
         </w:trPr>
         <w:tc>
           <w:tcPr>
-            <w:tcW w:w="1769" w:type="dxa"/>
+            <w:tcW w:w="2015" w:type="dxa"/>
             <w:tcMar>
               <w:top w:w="40" w:type="dxa"/>
               <w:left w:w="100" w:type="dxa"/>
@@ -5323,7 +5009,7 @@
         </w:tc>
         <w:tc>
           <w:tcPr>
-            <w:tcW w:w="1327" w:type="dxa"/>
+            <w:tcW w:w="1511" w:type="dxa"/>
             <w:tcMar>
               <w:top w:w="40" w:type="dxa"/>
               <w:left w:w="100" w:type="dxa"/>
@@ -5348,7 +5034,7 @@
         </w:tc>
         <w:tc>
           <w:tcPr>
-            <w:tcW w:w="2654" w:type="dxa"/>
+            <w:tcW w:w="3023" w:type="dxa"/>
             <w:tcMar>
               <w:top w:w="40" w:type="dxa"/>
               <w:left w:w="100" w:type="dxa"/>
@@ -5372,7 +5058,7 @@
         </w:tc>
         <w:tc>
           <w:tcPr>
-            <w:tcW w:w="1106" w:type="dxa"/>
+            <w:tcW w:w="1259" w:type="dxa"/>
             <w:tcMar>
               <w:top w:w="40" w:type="dxa"/>
               <w:left w:w="100" w:type="dxa"/>
@@ -5397,7 +5083,7 @@
         </w:tc>
         <w:tc>
           <w:tcPr>
-            <w:tcW w:w="1106" w:type="dxa"/>
+            <w:tcW w:w="1259" w:type="dxa"/>
             <w:tcMar>
               <w:top w:w="40" w:type="dxa"/>
               <w:left w:w="100" w:type="dxa"/>
@@ -5417,31 +5103,6 @@
                 <w:szCs w:val="20"/>
               </w:rPr>
               <w:t>1,5</w:t>
-            </w:r>
-          </w:p>
-        </w:tc>
-        <w:tc>
-          <w:tcPr>
-            <w:tcW w:w="1106" w:type="dxa"/>
-            <w:tcMar>
-              <w:top w:w="40" w:type="dxa"/>
-              <w:left w:w="100" w:type="dxa"/>
-              <w:bottom w:w="40" w:type="dxa"/>
-              <w:right w:w="100" w:type="dxa"/>
-            </w:tcMar>
-            <w:vAlign w:val="center"/>
-          </w:tcPr>
-          <w:p>
-            <w:pPr>
-              <w:spacing w:after="0" w:line="240" w:lineRule="auto"/>
-              <w:jc w:val="right"/>
-            </w:pPr>
-            <w:r>
-              <w:rPr>
-                <w:sz w:val="20"/>
-                <w:szCs w:val="20"/>
-              </w:rPr>
-              <w:t>0,925</w:t>
             </w:r>
           </w:p>
         </w:tc>
@@ -5453,7 +5114,7 @@
         </w:trPr>
         <w:tc>
           <w:tcPr>
-            <w:tcW w:w="1769" w:type="dxa"/>
+            <w:tcW w:w="2015" w:type="dxa"/>
             <w:tcMar>
               <w:top w:w="40" w:type="dxa"/>
               <w:left w:w="100" w:type="dxa"/>
@@ -5477,7 +5138,7 @@
         </w:tc>
         <w:tc>
           <w:tcPr>
-            <w:tcW w:w="1327" w:type="dxa"/>
+            <w:tcW w:w="1511" w:type="dxa"/>
             <w:tcMar>
               <w:top w:w="40" w:type="dxa"/>
               <w:left w:w="100" w:type="dxa"/>
@@ -5502,7 +5163,7 @@
         </w:tc>
         <w:tc>
           <w:tcPr>
-            <w:tcW w:w="2654" w:type="dxa"/>
+            <w:tcW w:w="3023" w:type="dxa"/>
             <w:tcMar>
               <w:top w:w="40" w:type="dxa"/>
               <w:left w:w="100" w:type="dxa"/>
@@ -5526,7 +5187,7 @@
         </w:tc>
         <w:tc>
           <w:tcPr>
-            <w:tcW w:w="1106" w:type="dxa"/>
+            <w:tcW w:w="1259" w:type="dxa"/>
             <w:tcMar>
               <w:top w:w="40" w:type="dxa"/>
               <w:left w:w="100" w:type="dxa"/>
@@ -5551,7 +5212,7 @@
         </w:tc>
         <w:tc>
           <w:tcPr>
-            <w:tcW w:w="1106" w:type="dxa"/>
+            <w:tcW w:w="1259" w:type="dxa"/>
             <w:tcMar>
               <w:top w:w="40" w:type="dxa"/>
               <w:left w:w="100" w:type="dxa"/>
@@ -5571,31 +5232,6 @@
                 <w:szCs w:val="20"/>
               </w:rPr>
               <w:t>8,6</w:t>
-            </w:r>
-          </w:p>
-        </w:tc>
-        <w:tc>
-          <w:tcPr>
-            <w:tcW w:w="1106" w:type="dxa"/>
-            <w:tcMar>
-              <w:top w:w="40" w:type="dxa"/>
-              <w:left w:w="100" w:type="dxa"/>
-              <w:bottom w:w="40" w:type="dxa"/>
-              <w:right w:w="100" w:type="dxa"/>
-            </w:tcMar>
-            <w:vAlign w:val="center"/>
-          </w:tcPr>
-          <w:p>
-            <w:pPr>
-              <w:spacing w:after="0" w:line="240" w:lineRule="auto"/>
-              <w:jc w:val="right"/>
-            </w:pPr>
-            <w:r>
-              <w:rPr>
-                <w:sz w:val="20"/>
-                <w:szCs w:val="20"/>
-              </w:rPr>
-              <w:t>0,910</w:t>
             </w:r>
           </w:p>
         </w:tc>
@@ -5607,7 +5243,7 @@
         </w:trPr>
         <w:tc>
           <w:tcPr>
-            <w:tcW w:w="1769" w:type="dxa"/>
+            <w:tcW w:w="2015" w:type="dxa"/>
             <w:tcMar>
               <w:top w:w="40" w:type="dxa"/>
               <w:left w:w="100" w:type="dxa"/>
@@ -5631,7 +5267,7 @@
         </w:tc>
         <w:tc>
           <w:tcPr>
-            <w:tcW w:w="1327" w:type="dxa"/>
+            <w:tcW w:w="1511" w:type="dxa"/>
             <w:tcMar>
               <w:top w:w="40" w:type="dxa"/>
               <w:left w:w="100" w:type="dxa"/>
@@ -5656,7 +5292,7 @@
         </w:tc>
         <w:tc>
           <w:tcPr>
-            <w:tcW w:w="2654" w:type="dxa"/>
+            <w:tcW w:w="3023" w:type="dxa"/>
             <w:tcMar>
               <w:top w:w="40" w:type="dxa"/>
               <w:left w:w="100" w:type="dxa"/>
@@ -5680,7 +5316,7 @@
         </w:tc>
         <w:tc>
           <w:tcPr>
-            <w:tcW w:w="1106" w:type="dxa"/>
+            <w:tcW w:w="1259" w:type="dxa"/>
             <w:tcMar>
               <w:top w:w="40" w:type="dxa"/>
               <w:left w:w="100" w:type="dxa"/>
@@ -5705,7 +5341,7 @@
         </w:tc>
         <w:tc>
           <w:tcPr>
-            <w:tcW w:w="1106" w:type="dxa"/>
+            <w:tcW w:w="1259" w:type="dxa"/>
             <w:tcMar>
               <w:top w:w="40" w:type="dxa"/>
               <w:left w:w="100" w:type="dxa"/>
@@ -5725,31 +5361,6 @@
                 <w:szCs w:val="20"/>
               </w:rPr>
               <w:t>92,2</w:t>
-            </w:r>
-          </w:p>
-        </w:tc>
-        <w:tc>
-          <w:tcPr>
-            <w:tcW w:w="1106" w:type="dxa"/>
-            <w:tcMar>
-              <w:top w:w="40" w:type="dxa"/>
-              <w:left w:w="100" w:type="dxa"/>
-              <w:bottom w:w="40" w:type="dxa"/>
-              <w:right w:w="100" w:type="dxa"/>
-            </w:tcMar>
-            <w:vAlign w:val="center"/>
-          </w:tcPr>
-          <w:p>
-            <w:pPr>
-              <w:spacing w:after="0" w:line="240" w:lineRule="auto"/>
-              <w:jc w:val="right"/>
-            </w:pPr>
-            <w:r>
-              <w:rPr>
-                <w:sz w:val="20"/>
-                <w:szCs w:val="20"/>
-              </w:rPr>
-              <w:t>0,797</w:t>
             </w:r>
           </w:p>
         </w:tc>
@@ -5767,7 +5378,7 @@
           <w:noProof/>
         </w:rPr>
         <w:drawing>
-          <wp:inline distT="0" distB="0" distL="0" distR="0" wp14:anchorId="03D347E4" wp14:editId="5B79AF5F">
+          <wp:inline distT="0" distB="0" distL="0" distR="0" wp14:anchorId="49DA9396" wp14:editId="615CC1EC">
             <wp:extent cx="5400000" cy="3724715"/>
             <wp:effectExtent l="0" t="0" r="0" b="0"/>
             <wp:docPr id="1" name="Picture 1"/>
@@ -5831,34 +5442,14 @@
         <w:jc w:val="both"/>
       </w:pPr>
       <w:r>
-        <w:t xml:space="preserve">Los datos están muy concentrados geográficamente: Estados Unidos tiene el 42,1% de las reseñas y, junto con Francia e Italia, llega al 74%. En el otro extremo, </w:t>
-      </w:r>
-      <w:r>
-        <w:rPr>
-          <w:i/>
-          <w:iCs/>
-        </w:rPr>
-        <w:t>winery</w:t>
-      </w:r>
-      <w:r>
-        <w:t xml:space="preserve"> tiene entropía 0,925: hay 16.757 bodegas y las quince más frecuentes suman menos del 2% de las reseñas, así que no tiene sentido comparar bodegas una por una. La columna </w:t>
-      </w:r>
-      <w:r>
-        <w:rPr>
-          <w:i/>
-          <w:iCs/>
-        </w:rPr>
-        <w:t>region_2</w:t>
-      </w:r>
-      <w:r>
-        <w:t xml:space="preserve"> tiene entropía alta porque solo existe para vinos de Estados Unidos (lo explico en la sección 5.2).</w:t>
+        <w:t>Los datos están muy concentrados geográficamente: Estados Unidos tiene el 42,1% de las reseñas y, junto con Francia e Italia, llega al 74%. Con las bodegas pasa lo contrario: hay 16.757 y las quince más frecuentes suman menos del 2% de las reseñas, así que no tiene sentido comparar bodegas una por una.</w:t>
       </w:r>
     </w:p>
     <w:p>
       <w:pPr>
         <w:pStyle w:val="Heading2"/>
       </w:pPr>
-      <w:bookmarkStart w:id="7" w:name="_Toc241487019"/>
+      <w:bookmarkStart w:id="7" w:name="_Toc241506721"/>
       <w:r>
         <w:t>4.4. Distribución de los puntajes</w:t>
       </w:r>
@@ -5875,7 +5466,7 @@
           <w:noProof/>
         </w:rPr>
         <w:drawing>
-          <wp:inline distT="0" distB="0" distL="0" distR="0" wp14:anchorId="6649BC88" wp14:editId="35D29243">
+          <wp:inline distT="0" distB="0" distL="0" distR="0" wp14:anchorId="3E88722C" wp14:editId="1390C9FE">
             <wp:extent cx="5040000" cy="2751797"/>
             <wp:effectExtent l="0" t="0" r="0" b="0"/>
             <wp:docPr id="2" name="Picture 2"/>
@@ -5946,7 +5537,7 @@
       <w:pPr>
         <w:pStyle w:val="Heading2"/>
       </w:pPr>
-      <w:bookmarkStart w:id="8" w:name="_Toc241487020"/>
+      <w:bookmarkStart w:id="8" w:name="_Toc241506722"/>
       <w:r>
         <w:t>4.5. Distribución de los precios</w:t>
       </w:r>
@@ -5963,7 +5554,7 @@
           <w:noProof/>
         </w:rPr>
         <w:drawing>
-          <wp:inline distT="0" distB="0" distL="0" distR="0" wp14:anchorId="6A41DA8C" wp14:editId="7B6A0E43">
+          <wp:inline distT="0" distB="0" distL="0" distR="0" wp14:anchorId="34A1DE1B" wp14:editId="40D27A90">
             <wp:extent cx="5724000" cy="2473462"/>
             <wp:effectExtent l="0" t="0" r="0" b="0"/>
             <wp:docPr id="3" name="Picture 3"/>
@@ -6034,7 +5625,7 @@
       <w:pPr>
         <w:pStyle w:val="Heading1"/>
       </w:pPr>
-      <w:bookmarkStart w:id="9" w:name="_Toc241487021"/>
+      <w:bookmarkStart w:id="9" w:name="_Toc241506723"/>
       <w:r>
         <w:t>5. Tratamiento de datos faltantes</w:t>
       </w:r>
@@ -6044,7 +5635,7 @@
       <w:pPr>
         <w:pStyle w:val="Heading2"/>
       </w:pPr>
-      <w:bookmarkStart w:id="10" w:name="_Toc241487022"/>
+      <w:bookmarkStart w:id="10" w:name="_Toc241506724"/>
       <w:r>
         <w:t>5.1. Cuantificación</w:t>
       </w:r>
@@ -6061,8 +5652,8 @@
           <w:noProof/>
         </w:rPr>
         <w:drawing>
-          <wp:inline distT="0" distB="0" distL="0" distR="0" wp14:anchorId="2EB225A3" wp14:editId="035ABD74">
-            <wp:extent cx="5724000" cy="2095952"/>
+          <wp:inline distT="0" distB="0" distL="0" distR="0" wp14:anchorId="65B4CE76" wp14:editId="64617123">
+            <wp:extent cx="5040000" cy="2499143"/>
             <wp:effectExtent l="0" t="0" r="0" b="0"/>
             <wp:docPr id="4" name="Picture 4"/>
             <wp:cNvGraphicFramePr>
@@ -6072,7 +5663,7 @@
               <a:graphicData uri="http://schemas.openxmlformats.org/drawingml/2006/picture">
                 <pic:pic xmlns:pic="http://schemas.openxmlformats.org/drawingml/2006/picture">
                   <pic:nvPicPr>
-                    <pic:cNvPr id="0" name="image.png"/>
+                    <pic:cNvPr id="0" name="06_faltantes.png"/>
                     <pic:cNvPicPr/>
                   </pic:nvPicPr>
                   <pic:blipFill>
@@ -6084,7 +5675,7 @@
                   <pic:spPr>
                     <a:xfrm>
                       <a:off x="0" y="0"/>
-                      <a:ext cx="5724000" cy="2095952"/>
+                      <a:ext cx="5040000" cy="2499143"/>
                     </a:xfrm>
                     <a:prstGeom prst="rect">
                       <a:avLst/>
@@ -6116,7 +5707,7 @@
           <w:sz w:val="20"/>
           <w:szCs w:val="20"/>
         </w:rPr>
-        <w:t>Porcentaje de faltantes por columna (izquierda) y probabilidad de que falte una columna dado que falta otra (derecha).</w:t>
+        <w:t>Porcentaje de faltantes por columna.</w:t>
       </w:r>
     </w:p>
     <w:p>
@@ -7223,7 +6814,7 @@
         <w:jc w:val="both"/>
       </w:pPr>
       <w:r>
-        <w:t xml:space="preserve">En el gráfico de la derecha se ven dos relaciones claras. Cuando falta </w:t>
+        <w:t xml:space="preserve">Hay columnas que faltan juntas. Todas las reseñas sin </w:t>
       </w:r>
       <w:r>
         <w:rPr>
@@ -7233,7 +6824,7 @@
         <w:t>taster_name</w:t>
       </w:r>
       <w:r>
-        <w:t xml:space="preserve"> siempre falta también </w:t>
+        <w:t xml:space="preserve"> tampoco tienen </w:t>
       </w:r>
       <w:r>
         <w:rPr>
@@ -7243,7 +6834,7 @@
         <w:t>taster_twitter_handle</w:t>
       </w:r>
       <w:r>
-        <w:t xml:space="preserve"> (probabilidad 1,00), así que la segunda depende de la primera. Y cuando falta </w:t>
+        <w:t xml:space="preserve">, así que la segunda depende de la primera. Y el 98% de las reseñas sin </w:t>
       </w:r>
       <w:r>
         <w:rPr>
@@ -7253,7 +6844,7 @@
         <w:t>price</w:t>
       </w:r>
       <w:r>
-        <w:t xml:space="preserve">, en el 98% de los casos también falta </w:t>
+        <w:t xml:space="preserve"> tampoco tiene </w:t>
       </w:r>
       <w:r>
         <w:rPr>
@@ -7270,9 +6861,9 @@
       <w:pPr>
         <w:pStyle w:val="Heading2"/>
       </w:pPr>
-      <w:bookmarkStart w:id="11" w:name="_Toc241487023"/>
-      <w:r>
-        <w:t>5.2. Faltantes que significan «no aplica»</w:t>
+      <w:bookmarkStart w:id="11" w:name="_Toc241506725"/>
+      <w:r>
+        <w:t>5.2. Faltantes que significan "no aplica"</w:t>
       </w:r>
       <w:bookmarkEnd w:id="11"/>
     </w:p>
@@ -7321,14 +6912,14 @@
         <w:jc w:val="both"/>
       </w:pPr>
       <w:r>
-        <w:t>En estos casos el nulo significa «no aplica», así que no lo imputo: lo reemplazo por una etiqueta («No aplica», «Sin región», «Sin designación»). Hice lo mismo con el catador («No informado») y con las 59 reseñas sin país y la única sin variedad («Desconocido»). No borré ninguna de esas filas porque el resto de sus datos está bien.</w:t>
+        <w:t>En estos casos el nulo significa "no aplica", así que no lo imputo: lo reemplazo por una etiqueta ("No aplica", "Sin región", "Sin designación"). Hice lo mismo con el catador ("No informado") y con las 59 reseñas sin país y la única sin variedad ("Desconocido"). No borré ninguna de esas filas porque el resto de sus datos está bien.</w:t>
       </w:r>
     </w:p>
     <w:p>
       <w:pPr>
         <w:pStyle w:val="Heading2"/>
       </w:pPr>
-      <w:bookmarkStart w:id="12" w:name="_Toc241487024"/>
+      <w:bookmarkStart w:id="12" w:name="_Toc241506726"/>
       <w:r>
         <w:t>5.3. Por qué falta el precio</w:t>
       </w:r>
@@ -8510,7 +8101,7 @@
       <w:pPr>
         <w:pStyle w:val="Heading2"/>
       </w:pPr>
-      <w:bookmarkStart w:id="13" w:name="_Toc241487025"/>
+      <w:bookmarkStart w:id="13" w:name="_Toc241506727"/>
       <w:r>
         <w:t>5.4. Estrategias posibles</w:t>
       </w:r>
@@ -8678,7 +8269,7 @@
       <w:pPr>
         <w:pStyle w:val="Heading2"/>
       </w:pPr>
-      <w:bookmarkStart w:id="14" w:name="_Toc241487026"/>
+      <w:bookmarkStart w:id="14" w:name="_Toc241506728"/>
       <w:r>
         <w:t>5.5. Validación de la imputación</w:t>
       </w:r>
@@ -8793,7 +8384,7 @@
                 <w:sz w:val="20"/>
                 <w:szCs w:val="20"/>
               </w:rPr>
-              <w:t>MAE</w:t>
+              <w:t>Error medio</w:t>
             </w:r>
           </w:p>
         </w:tc>
@@ -8849,7 +8440,7 @@
                 <w:sz w:val="20"/>
                 <w:szCs w:val="20"/>
               </w:rPr>
-              <w:t>MAPE</w:t>
+              <w:t>Error % mediano</w:t>
             </w:r>
           </w:p>
         </w:tc>
@@ -9499,7 +9090,7 @@
       <w:pPr>
         <w:pStyle w:val="Heading2"/>
       </w:pPr>
-      <w:bookmarkStart w:id="15" w:name="_Toc241487027"/>
+      <w:bookmarkStart w:id="15" w:name="_Toc241506729"/>
       <w:r>
         <w:t>5.6. Decisión final</w:t>
       </w:r>
@@ -9528,7 +9119,7 @@
       <w:pPr>
         <w:pStyle w:val="Heading1"/>
       </w:pPr>
-      <w:bookmarkStart w:id="16" w:name="_Toc241487028"/>
+      <w:bookmarkStart w:id="16" w:name="_Toc241506730"/>
       <w:r>
         <w:t>6. Análisis de datos atípicos</w:t>
       </w:r>
@@ -9538,476 +9129,28 @@
       <w:pPr>
         <w:pStyle w:val="Heading2"/>
       </w:pPr>
-      <w:bookmarkStart w:id="17" w:name="_Toc241487029"/>
-      <w:r>
-        <w:t>6.1. Comparación de criterios de detección</w:t>
+      <w:bookmarkStart w:id="17" w:name="_Toc241506731"/>
+      <w:r>
+        <w:t>6.1. Criterio de detección</w:t>
       </w:r>
       <w:bookmarkEnd w:id="17"/>
     </w:p>
     <w:p>
       <w:pPr>
-        <w:keepNext/>
-        <w:spacing w:before="240" w:after="80"/>
-        <w:jc w:val="center"/>
-      </w:pPr>
-      <w:r>
-        <w:rPr>
-          <w:b/>
-          <w:bCs/>
-          <w:sz w:val="20"/>
-          <w:szCs w:val="20"/>
-        </w:rPr>
-        <w:t xml:space="preserve">Tabla 7. </w:t>
-      </w:r>
-      <w:r>
-        <w:rPr>
-          <w:sz w:val="20"/>
-          <w:szCs w:val="20"/>
-        </w:rPr>
-        <w:t>Porcentaje de observaciones marcadas como atípicas según cada criterio.</w:t>
-      </w:r>
-    </w:p>
-    <w:tbl>
-      <w:tblPr>
-        <w:tblW w:w="9070" w:type="dxa"/>
-        <w:jc w:val="center"/>
-        <w:tblBorders>
-          <w:top w:val="single" w:sz="4" w:space="0" w:color="auto"/>
-          <w:left w:val="single" w:sz="4" w:space="0" w:color="auto"/>
-          <w:bottom w:val="single" w:sz="4" w:space="0" w:color="auto"/>
-          <w:right w:val="single" w:sz="4" w:space="0" w:color="auto"/>
-          <w:insideH w:val="single" w:sz="4" w:space="0" w:color="auto"/>
-          <w:insideV w:val="single" w:sz="4" w:space="0" w:color="auto"/>
-        </w:tblBorders>
-        <w:tblLook w:val="0000" w:firstRow="0" w:lastRow="0" w:firstColumn="0" w:lastColumn="0" w:noHBand="0" w:noVBand="0"/>
-      </w:tblPr>
-      <w:tblGrid>
-        <w:gridCol w:w="5128"/>
-        <w:gridCol w:w="1971"/>
-        <w:gridCol w:w="1971"/>
-      </w:tblGrid>
-      <w:tr>
-        <w:trPr>
-          <w:cantSplit/>
-          <w:tblHeader/>
-          <w:jc w:val="center"/>
-        </w:trPr>
-        <w:tc>
-          <w:tcPr>
-            <w:tcW w:w="5126" w:type="dxa"/>
-            <w:shd w:val="clear" w:color="auto" w:fill="EDE3E6"/>
-            <w:tcMar>
-              <w:top w:w="40" w:type="dxa"/>
-              <w:left w:w="100" w:type="dxa"/>
-              <w:bottom w:w="40" w:type="dxa"/>
-              <w:right w:w="100" w:type="dxa"/>
-            </w:tcMar>
-            <w:vAlign w:val="center"/>
-          </w:tcPr>
-          <w:p>
-            <w:pPr>
-              <w:spacing w:after="0" w:line="240" w:lineRule="auto"/>
-            </w:pPr>
-            <w:r>
-              <w:rPr>
-                <w:b/>
-                <w:bCs/>
-                <w:sz w:val="20"/>
-                <w:szCs w:val="20"/>
-              </w:rPr>
-              <w:t>Criterio</w:t>
-            </w:r>
-          </w:p>
-        </w:tc>
-        <w:tc>
-          <w:tcPr>
-            <w:tcW w:w="1971" w:type="dxa"/>
-            <w:shd w:val="clear" w:color="auto" w:fill="EDE3E6"/>
-            <w:tcMar>
-              <w:top w:w="40" w:type="dxa"/>
-              <w:left w:w="100" w:type="dxa"/>
-              <w:bottom w:w="40" w:type="dxa"/>
-              <w:right w:w="100" w:type="dxa"/>
-            </w:tcMar>
-            <w:vAlign w:val="center"/>
-          </w:tcPr>
-          <w:p>
-            <w:pPr>
-              <w:spacing w:after="0" w:line="240" w:lineRule="auto"/>
-              <w:jc w:val="right"/>
-            </w:pPr>
-            <w:r>
-              <w:rPr>
-                <w:b/>
-                <w:bCs/>
-                <w:sz w:val="20"/>
-                <w:szCs w:val="20"/>
-              </w:rPr>
-              <w:t>% en price</w:t>
-            </w:r>
-          </w:p>
-        </w:tc>
-        <w:tc>
-          <w:tcPr>
-            <w:tcW w:w="1971" w:type="dxa"/>
-            <w:shd w:val="clear" w:color="auto" w:fill="EDE3E6"/>
-            <w:tcMar>
-              <w:top w:w="40" w:type="dxa"/>
-              <w:left w:w="100" w:type="dxa"/>
-              <w:bottom w:w="40" w:type="dxa"/>
-              <w:right w:w="100" w:type="dxa"/>
-            </w:tcMar>
-            <w:vAlign w:val="center"/>
-          </w:tcPr>
-          <w:p>
-            <w:pPr>
-              <w:spacing w:after="0" w:line="240" w:lineRule="auto"/>
-              <w:jc w:val="right"/>
-            </w:pPr>
-            <w:r>
-              <w:rPr>
-                <w:b/>
-                <w:bCs/>
-                <w:sz w:val="20"/>
-                <w:szCs w:val="20"/>
-              </w:rPr>
-              <w:t>% en points</w:t>
-            </w:r>
-          </w:p>
-        </w:tc>
-      </w:tr>
-      <w:tr>
-        <w:trPr>
-          <w:cantSplit/>
-          <w:jc w:val="center"/>
-        </w:trPr>
-        <w:tc>
-          <w:tcPr>
-            <w:tcW w:w="5126" w:type="dxa"/>
-            <w:tcMar>
-              <w:top w:w="40" w:type="dxa"/>
-              <w:left w:w="100" w:type="dxa"/>
-              <w:bottom w:w="40" w:type="dxa"/>
-              <w:right w:w="100" w:type="dxa"/>
-            </w:tcMar>
-            <w:vAlign w:val="center"/>
-          </w:tcPr>
-          <w:p>
-            <w:pPr>
-              <w:spacing w:after="0" w:line="240" w:lineRule="auto"/>
-            </w:pPr>
-            <w:r>
-              <w:rPr>
-                <w:sz w:val="20"/>
-                <w:szCs w:val="20"/>
-              </w:rPr>
-              <w:t>IQR clásico</w:t>
-            </w:r>
-          </w:p>
-        </w:tc>
-        <w:tc>
-          <w:tcPr>
-            <w:tcW w:w="1971" w:type="dxa"/>
-            <w:tcMar>
-              <w:top w:w="40" w:type="dxa"/>
-              <w:left w:w="100" w:type="dxa"/>
-              <w:bottom w:w="40" w:type="dxa"/>
-              <w:right w:w="100" w:type="dxa"/>
-            </w:tcMar>
-            <w:vAlign w:val="center"/>
-          </w:tcPr>
-          <w:p>
-            <w:pPr>
-              <w:spacing w:after="0" w:line="240" w:lineRule="auto"/>
-              <w:jc w:val="right"/>
-            </w:pPr>
-            <w:r>
-              <w:rPr>
-                <w:sz w:val="20"/>
-                <w:szCs w:val="20"/>
-              </w:rPr>
-              <w:t>6,16</w:t>
-            </w:r>
-          </w:p>
-        </w:tc>
-        <w:tc>
-          <w:tcPr>
-            <w:tcW w:w="1971" w:type="dxa"/>
-            <w:tcMar>
-              <w:top w:w="40" w:type="dxa"/>
-              <w:left w:w="100" w:type="dxa"/>
-              <w:bottom w:w="40" w:type="dxa"/>
-              <w:right w:w="100" w:type="dxa"/>
-            </w:tcMar>
-            <w:vAlign w:val="center"/>
-          </w:tcPr>
-          <w:p>
-            <w:pPr>
-              <w:spacing w:after="0" w:line="240" w:lineRule="auto"/>
-              <w:jc w:val="right"/>
-            </w:pPr>
-            <w:r>
-              <w:rPr>
-                <w:sz w:val="20"/>
-                <w:szCs w:val="20"/>
-              </w:rPr>
-              <w:t>0,04</w:t>
-            </w:r>
-          </w:p>
-        </w:tc>
-      </w:tr>
-      <w:tr>
-        <w:trPr>
-          <w:cantSplit/>
-          <w:jc w:val="center"/>
-        </w:trPr>
-        <w:tc>
-          <w:tcPr>
-            <w:tcW w:w="5126" w:type="dxa"/>
-            <w:tcMar>
-              <w:top w:w="40" w:type="dxa"/>
-              <w:left w:w="100" w:type="dxa"/>
-              <w:bottom w:w="40" w:type="dxa"/>
-              <w:right w:w="100" w:type="dxa"/>
-            </w:tcMar>
-            <w:vAlign w:val="center"/>
-          </w:tcPr>
-          <w:p>
-            <w:pPr>
-              <w:spacing w:after="0" w:line="240" w:lineRule="auto"/>
-            </w:pPr>
-            <w:r>
-              <w:rPr>
-                <w:sz w:val="20"/>
-                <w:szCs w:val="20"/>
-              </w:rPr>
-              <w:t>z-score, |z| &gt; 3</w:t>
-            </w:r>
-          </w:p>
-        </w:tc>
-        <w:tc>
-          <w:tcPr>
-            <w:tcW w:w="1971" w:type="dxa"/>
-            <w:tcMar>
-              <w:top w:w="40" w:type="dxa"/>
-              <w:left w:w="100" w:type="dxa"/>
-              <w:bottom w:w="40" w:type="dxa"/>
-              <w:right w:w="100" w:type="dxa"/>
-            </w:tcMar>
-            <w:vAlign w:val="center"/>
-          </w:tcPr>
-          <w:p>
-            <w:pPr>
-              <w:spacing w:after="0" w:line="240" w:lineRule="auto"/>
-              <w:jc w:val="right"/>
-            </w:pPr>
-            <w:r>
-              <w:rPr>
-                <w:sz w:val="20"/>
-                <w:szCs w:val="20"/>
-              </w:rPr>
-              <w:t>0,97</w:t>
-            </w:r>
-          </w:p>
-        </w:tc>
-        <w:tc>
-          <w:tcPr>
-            <w:tcW w:w="1971" w:type="dxa"/>
-            <w:tcMar>
-              <w:top w:w="40" w:type="dxa"/>
-              <w:left w:w="100" w:type="dxa"/>
-              <w:bottom w:w="40" w:type="dxa"/>
-              <w:right w:w="100" w:type="dxa"/>
-            </w:tcMar>
-            <w:vAlign w:val="center"/>
-          </w:tcPr>
-          <w:p>
-            <w:pPr>
-              <w:spacing w:after="0" w:line="240" w:lineRule="auto"/>
-              <w:jc w:val="right"/>
-            </w:pPr>
-            <w:r>
-              <w:rPr>
-                <w:sz w:val="20"/>
-                <w:szCs w:val="20"/>
-              </w:rPr>
-              <w:t>0,10</w:t>
-            </w:r>
-          </w:p>
-        </w:tc>
-      </w:tr>
-      <w:tr>
-        <w:trPr>
-          <w:cantSplit/>
-          <w:jc w:val="center"/>
-        </w:trPr>
-        <w:tc>
-          <w:tcPr>
-            <w:tcW w:w="5126" w:type="dxa"/>
-            <w:tcMar>
-              <w:top w:w="40" w:type="dxa"/>
-              <w:left w:w="100" w:type="dxa"/>
-              <w:bottom w:w="40" w:type="dxa"/>
-              <w:right w:w="100" w:type="dxa"/>
-            </w:tcMar>
-            <w:vAlign w:val="center"/>
-          </w:tcPr>
-          <w:p>
-            <w:pPr>
-              <w:spacing w:after="0" w:line="240" w:lineRule="auto"/>
-            </w:pPr>
-            <w:r>
-              <w:rPr>
-                <w:sz w:val="20"/>
-                <w:szCs w:val="20"/>
-              </w:rPr>
-              <w:t>z modificado (MAD), |z| &gt; 3,5</w:t>
-            </w:r>
-          </w:p>
-        </w:tc>
-        <w:tc>
-          <w:tcPr>
-            <w:tcW w:w="1971" w:type="dxa"/>
-            <w:tcMar>
-              <w:top w:w="40" w:type="dxa"/>
-              <w:left w:w="100" w:type="dxa"/>
-              <w:bottom w:w="40" w:type="dxa"/>
-              <w:right w:w="100" w:type="dxa"/>
-            </w:tcMar>
-            <w:vAlign w:val="center"/>
-          </w:tcPr>
-          <w:p>
-            <w:pPr>
-              <w:spacing w:after="0" w:line="240" w:lineRule="auto"/>
-              <w:jc w:val="right"/>
-            </w:pPr>
-            <w:r>
-              <w:rPr>
-                <w:sz w:val="20"/>
-                <w:szCs w:val="20"/>
-              </w:rPr>
-              <w:t>6,41</w:t>
-            </w:r>
-          </w:p>
-        </w:tc>
-        <w:tc>
-          <w:tcPr>
-            <w:tcW w:w="1971" w:type="dxa"/>
-            <w:tcMar>
-              <w:top w:w="40" w:type="dxa"/>
-              <w:left w:w="100" w:type="dxa"/>
-              <w:bottom w:w="40" w:type="dxa"/>
-              <w:right w:w="100" w:type="dxa"/>
-            </w:tcMar>
-            <w:vAlign w:val="center"/>
-          </w:tcPr>
-          <w:p>
-            <w:pPr>
-              <w:spacing w:after="0" w:line="240" w:lineRule="auto"/>
-              <w:jc w:val="right"/>
-            </w:pPr>
-            <w:r>
-              <w:rPr>
-                <w:sz w:val="20"/>
-                <w:szCs w:val="20"/>
-              </w:rPr>
-              <w:t>0,04</w:t>
-            </w:r>
-          </w:p>
-        </w:tc>
-      </w:tr>
-      <w:tr>
-        <w:trPr>
-          <w:cantSplit/>
-          <w:jc w:val="center"/>
-        </w:trPr>
-        <w:tc>
-          <w:tcPr>
-            <w:tcW w:w="5126" w:type="dxa"/>
-            <w:tcMar>
-              <w:top w:w="40" w:type="dxa"/>
-              <w:left w:w="100" w:type="dxa"/>
-              <w:bottom w:w="40" w:type="dxa"/>
-              <w:right w:w="100" w:type="dxa"/>
-            </w:tcMar>
-            <w:vAlign w:val="center"/>
-          </w:tcPr>
-          <w:p>
-            <w:pPr>
-              <w:spacing w:after="0" w:line="240" w:lineRule="auto"/>
-            </w:pPr>
-            <w:r>
-              <w:rPr>
-                <w:sz w:val="20"/>
-                <w:szCs w:val="20"/>
-              </w:rPr>
-              <w:t>IQR sobre log(x)</w:t>
-            </w:r>
-          </w:p>
-        </w:tc>
-        <w:tc>
-          <w:tcPr>
-            <w:tcW w:w="1971" w:type="dxa"/>
-            <w:tcMar>
-              <w:top w:w="40" w:type="dxa"/>
-              <w:left w:w="100" w:type="dxa"/>
-              <w:bottom w:w="40" w:type="dxa"/>
-              <w:right w:w="100" w:type="dxa"/>
-            </w:tcMar>
-            <w:vAlign w:val="center"/>
-          </w:tcPr>
-          <w:p>
-            <w:pPr>
-              <w:spacing w:after="0" w:line="240" w:lineRule="auto"/>
-              <w:jc w:val="right"/>
-            </w:pPr>
-            <w:r>
-              <w:rPr>
-                <w:sz w:val="20"/>
-                <w:szCs w:val="20"/>
-              </w:rPr>
-              <w:t>0,97</w:t>
-            </w:r>
-          </w:p>
-        </w:tc>
-        <w:tc>
-          <w:tcPr>
-            <w:tcW w:w="1971" w:type="dxa"/>
-            <w:tcMar>
-              <w:top w:w="40" w:type="dxa"/>
-              <w:left w:w="100" w:type="dxa"/>
-              <w:bottom w:w="40" w:type="dxa"/>
-              <w:right w:w="100" w:type="dxa"/>
-            </w:tcMar>
-            <w:vAlign w:val="center"/>
-          </w:tcPr>
-          <w:p>
-            <w:pPr>
-              <w:spacing w:after="0" w:line="240" w:lineRule="auto"/>
-              <w:jc w:val="right"/>
-            </w:pPr>
-            <w:r>
-              <w:rPr>
-                <w:sz w:val="20"/>
-                <w:szCs w:val="20"/>
-              </w:rPr>
-              <w:t>0,02</w:t>
-            </w:r>
-          </w:p>
-        </w:tc>
-      </w:tr>
-    </w:tbl>
-    <w:p/>
-    <w:p>
-      <w:pPr>
         <w:ind w:firstLine="720"/>
         <w:jc w:val="both"/>
       </w:pPr>
       <w:r>
-        <w:t>Los criterios dan resultados muy distintos para el precio. El IQR clásico supone una distribución más o menos simétrica, así que en el precio marca el 6,16% de los datos, que en realidad es la cola normal de la distribución. El z-score usa la media y el desvío, que los mismos atípicos inflan, y termina marcando menos. El z modificado reemplaza esos valores por la mediana y la MAD. Para esta variable me parece más adecuado el IQR sobre el logaritmo, porque en esa escala el precio es simétrico; con ese criter</w:t>
-      </w:r>
-      <w:r>
-        <w:t>io el 0,97% de los precios son atípicos.</w:t>
+        <w:t>Para detectar atípicos usé el rango intercuartílico (IQR): un valor es atípico si queda a más de 1,5 IQR por debajo del primer cuartil o por encima del tercero. Lo elegí porque se basa en cuartiles, que no cambian por culpa de los mismos valores extremos que quiero encontrar, y porque no necesita que los datos tengan distribución normal. El z-score, en cambio, usa la media y el desvío, y justamente esos valores se inflan con los atípicos.</w:t>
+      </w:r>
+    </w:p>
+    <w:p>
+      <w:pPr>
+        <w:ind w:firstLine="720"/>
+        <w:jc w:val="both"/>
+      </w:pPr>
+      <w:r>
+        <w:t>Como el precio es muy asimétrico, el IQR aplicado directo marca el 6,16% de los precios, que en realidad es la cola normal de la distribución y no casos raros. Por eso lo apliqué sobre el logaritmo del precio, donde la distribución es simétrica, y ahí marca el 0,97% (Figura 5).</w:t>
       </w:r>
     </w:p>
     <w:p>
@@ -10021,7 +9164,7 @@
           <w:noProof/>
         </w:rPr>
         <w:drawing>
-          <wp:inline distT="0" distB="0" distL="0" distR="0" wp14:anchorId="4B22B972" wp14:editId="0E312DFF">
+          <wp:inline distT="0" distB="0" distL="0" distR="0" wp14:anchorId="093E379E" wp14:editId="32E84B17">
             <wp:extent cx="5724000" cy="1952441"/>
             <wp:effectExtent l="0" t="0" r="0" b="0"/>
             <wp:docPr id="5" name="Picture 5"/>
@@ -10083,7 +9226,7 @@
       <w:pPr>
         <w:pStyle w:val="Heading2"/>
       </w:pPr>
-      <w:bookmarkStart w:id="18" w:name="_Toc241487030"/>
+      <w:bookmarkStart w:id="18" w:name="_Toc241506732"/>
       <w:r>
         <w:t>6.2. Naturaleza y causa de los atípicos</w:t>
       </w:r>
@@ -10095,7 +9238,7 @@
         <w:jc w:val="both"/>
       </w:pPr>
       <w:r>
-        <w:t>Estos métodos dicen si un valor es extremo, pero no si es un error. Un Château Pétrus a 2.500 dólares es extremo pero real, mientras que un Médoc común a 3.300 no tiene sentido. Para separar esos casos comparé cada precio con la mediana de sus pares, es decir, los vinos de la misma provincia y con el mismo puntaje (solo en grupos de al menos 30 vinos). El percentil 99,9 de ese cociente es 7,3, así que tomé 10 como umbral, y quedaron 33 vinos para revisar.</w:t>
+        <w:t>El IQR dice si un valor es extremo, pero no si es un error. Un Château Pétrus a 2.500 dólares es extremo pero real, mientras que un Médoc común a 3.300 no tiene sentido. Para separar esos casos comparé cada precio con la mediana de sus pares, es decir, los vinos de la misma provincia y con el mismo puntaje (solo en grupos de al menos 30 vinos). Tomé 10 como umbral, porque que un vino cueste más de diez veces lo que cuestan vinos parecidos es muy raro. Quedaron 33 vinos para revisar.</w:t>
       </w:r>
     </w:p>
     <w:p>
@@ -10111,7 +9254,7 @@
           <w:sz w:val="20"/>
           <w:szCs w:val="20"/>
         </w:rPr>
-        <w:t xml:space="preserve">Tabla 8. </w:t>
+        <w:t xml:space="preserve">Tabla 7. </w:t>
       </w:r>
       <w:r>
         <w:rPr>
@@ -11138,7 +10281,7 @@
       <w:pPr>
         <w:pStyle w:val="Heading2"/>
       </w:pPr>
-      <w:bookmarkStart w:id="19" w:name="_Toc241487031"/>
+      <w:bookmarkStart w:id="19" w:name="_Toc241506733"/>
       <w:r>
         <w:t>6.3. Impacto sobre el análisis</w:t>
       </w:r>
@@ -11157,7 +10300,7 @@
           <w:sz w:val="20"/>
           <w:szCs w:val="20"/>
         </w:rPr>
-        <w:t xml:space="preserve">Tabla 9. </w:t>
+        <w:t xml:space="preserve">Tabla 8. </w:t>
       </w:r>
       <w:r>
         <w:rPr>
@@ -11635,7 +10778,7 @@
       <w:pPr>
         <w:pStyle w:val="Heading2"/>
       </w:pPr>
-      <w:bookmarkStart w:id="20" w:name="_Toc241487032"/>
+      <w:bookmarkStart w:id="20" w:name="_Toc241506734"/>
       <w:r>
         <w:t>6.4. Tratamiento adoptado</w:t>
       </w:r>
@@ -11657,14 +10800,14 @@
         <w:t>points</w:t>
       </w:r>
       <w:r>
-        <w:t xml:space="preserve"> casi no hay atípicos (ningún criterio pasa del 0,10%), porque la variable ya viene cortada en 80.</w:t>
+        <w:t xml:space="preserve"> casi no hay atípicos (el IQR marca solo el 0,04%), porque la variable ya viene cortada en 80.</w:t>
       </w:r>
     </w:p>
     <w:p>
       <w:pPr>
         <w:pStyle w:val="Heading1"/>
       </w:pPr>
-      <w:bookmarkStart w:id="21" w:name="_Toc241487033"/>
+      <w:bookmarkStart w:id="21" w:name="_Toc241506735"/>
       <w:r>
         <w:t>7. Análisis comparativo entre variables</w:t>
       </w:r>
@@ -11674,7 +10817,7 @@
       <w:pPr>
         <w:pStyle w:val="Heading2"/>
       </w:pPr>
-      <w:bookmarkStart w:id="22" w:name="_Toc241487034"/>
+      <w:bookmarkStart w:id="22" w:name="_Toc241506736"/>
       <w:r>
         <w:t>7.1. Precio y puntaje</w:t>
       </w:r>
@@ -11691,7 +10834,7 @@
           <w:noProof/>
         </w:rPr>
         <w:drawing>
-          <wp:inline distT="0" distB="0" distL="0" distR="0" wp14:anchorId="0FBE527A" wp14:editId="136EC6B3">
+          <wp:inline distT="0" distB="0" distL="0" distR="0" wp14:anchorId="14958F05" wp14:editId="489C683D">
             <wp:extent cx="5724000" cy="2901149"/>
             <wp:effectExtent l="0" t="0" r="0" b="0"/>
             <wp:docPr id="6" name="Picture 6"/>
@@ -11772,7 +10915,7 @@
       <w:pPr>
         <w:pStyle w:val="Heading2"/>
       </w:pPr>
-      <w:bookmarkStart w:id="23" w:name="_Toc241487035"/>
+      <w:bookmarkStart w:id="23" w:name="_Toc241506737"/>
       <w:r>
         <w:t>7.2. Puntaje por país</w:t>
       </w:r>
@@ -11789,7 +10932,7 @@
           <w:noProof/>
         </w:rPr>
         <w:drawing>
-          <wp:inline distT="0" distB="0" distL="0" distR="0" wp14:anchorId="1BC9733B" wp14:editId="1A566CBC">
+          <wp:inline distT="0" distB="0" distL="0" distR="0" wp14:anchorId="3357D98E" wp14:editId="4C41FDEB">
             <wp:extent cx="5724000" cy="2845622"/>
             <wp:effectExtent l="0" t="0" r="0" b="0"/>
             <wp:docPr id="7" name="Picture 7"/>
@@ -11860,7 +11003,7 @@
       <w:pPr>
         <w:pStyle w:val="Heading2"/>
       </w:pPr>
-      <w:bookmarkStart w:id="24" w:name="_Toc241487036"/>
+      <w:bookmarkStart w:id="24" w:name="_Toc241506738"/>
       <w:r>
         <w:t>7.3. Año de cosecha</w:t>
       </w:r>
@@ -11872,7 +11015,7 @@
         <w:jc w:val="both"/>
       </w:pPr>
       <w:r>
-        <w:t>El año de cosecha no es una columna, pero se puede sacar del título. El problema es que algunas bodegas tienen un año en el nombre: en «Hazlitt 1852 Vineyards 2005 Cabernet Sauvignon» una búsqueda directa devuelve 1852. Por eso primero le saco al título el nombre de la bodega y después busco el año. El 3,6% de las reseñas queda sin año; son espumantes «NV» (sin cosecha) y los dejé como nulos.</w:t>
+        <w:t>El año de cosecha no es una columna, pero se puede sacar del título. El problema es que algunas bodegas tienen un año en el nombre: en "Hazlitt 1852 Vineyards 2005 Cabernet Sauvignon" una búsqueda directa devuelve 1852. Por eso primero le saco al título el nombre de la bodega y después busco el año. El 3,6% de las reseñas queda sin año; son espumantes "NV" (sin cosecha) y los dejé como nulos.</w:t>
       </w:r>
     </w:p>
     <w:p>
@@ -11886,7 +11029,7 @@
           <w:noProof/>
         </w:rPr>
         <w:drawing>
-          <wp:inline distT="0" distB="0" distL="0" distR="0" wp14:anchorId="00963B06" wp14:editId="1E62F6AD">
+          <wp:inline distT="0" distB="0" distL="0" distR="0" wp14:anchorId="1AB6F857" wp14:editId="7861DE85">
             <wp:extent cx="5724000" cy="2016035"/>
             <wp:effectExtent l="0" t="0" r="0" b="0"/>
             <wp:docPr id="8" name="Picture 8"/>
@@ -11941,7 +11084,7 @@
           <w:sz w:val="20"/>
           <w:szCs w:val="20"/>
         </w:rPr>
-        <w:t>Puntaje medio por cosecha y cantidad de reseñas (izquierda). Efecto de cada catador antes y después de controlar por país y variedad (derecha).</w:t>
+        <w:t>Puntaje medio por cosecha y cantidad de reseñas (izquierda). Diferencia de cada catador con el promedio, antes y después de compararlo con vinos del mismo país y variedad (derecha).</w:t>
       </w:r>
     </w:p>
     <w:p>
@@ -11957,7 +11100,7 @@
       <w:pPr>
         <w:pStyle w:val="Heading2"/>
       </w:pPr>
-      <w:bookmarkStart w:id="25" w:name="_Toc241487037"/>
+      <w:bookmarkStart w:id="25" w:name="_Toc241506739"/>
       <w:r>
         <w:t>7.4. Largo de la nota de cata</w:t>
       </w:r>
@@ -11995,7 +11138,7 @@
           <w:sz w:val="20"/>
           <w:szCs w:val="20"/>
         </w:rPr>
-        <w:t xml:space="preserve">Tabla 10. </w:t>
+        <w:t xml:space="preserve">Tabla 9. </w:t>
       </w:r>
       <w:r>
         <w:rPr>
@@ -12289,7 +11432,7 @@
       <w:pPr>
         <w:pStyle w:val="Heading2"/>
       </w:pPr>
-      <w:bookmarkStart w:id="26" w:name="_Toc241487038"/>
+      <w:bookmarkStart w:id="26" w:name="_Toc241506740"/>
       <w:r>
         <w:t>7.5. Efecto del catador</w:t>
       </w:r>
@@ -12301,7 +11444,7 @@
         <w:jc w:val="both"/>
       </w:pPr>
       <w:r>
-        <w:t>Si comparo el promedio de cada catador hay bastante diferencia: Michael Schachner tiene 86,86 y Anne Krebiehl MW 90,63, una diferencia de 3,77 puntos. Pero cada catador reseña vinos de ciertas regiones. Schachner reseña sobre todo vinos de España (43%) y Chile (29%), y Krebiehl de Austria (60%) y Francia (38%). La diferencia podría venir de los vinos y no del catador.</w:t>
+        <w:t>Si comparo el promedio de cada catador hay bastante diferencia: Michael Schachner tiene 86,86 y Anne Krebiehl MW 90,63. Pero cada uno reseña vinos de regiones distintas: Schachner sobre todo de España y Chile, y Krebiehl de Austria y Francia. Entonces la diferencia puede venir de los vinos y no de la persona.</w:t>
       </w:r>
     </w:p>
     <w:p>
@@ -12310,7 +11453,7 @@
         <w:jc w:val="both"/>
       </w:pPr>
       <w:r>
-        <w:t>Para separar las dos cosas calculé, en cada reseña, cuánto se aleja del promedio de los vinos del mismo país y variedad, y después promedié eso por catador (Tabla 11).</w:t>
+        <w:t>Para verlo comparé cada reseña con el promedio de los vinos del mismo país y variedad. Si un catador es más exigente, sus puntajes tendrían que quedar por debajo de ese promedio.</w:t>
       </w:r>
     </w:p>
     <w:p>
@@ -12326,14 +11469,14 @@
           <w:sz w:val="20"/>
           <w:szCs w:val="20"/>
         </w:rPr>
-        <w:t xml:space="preserve">Tabla 11. </w:t>
+        <w:t xml:space="preserve">Tabla 10. </w:t>
       </w:r>
       <w:r>
         <w:rPr>
           <w:sz w:val="20"/>
           <w:szCs w:val="20"/>
         </w:rPr>
-        <w:t>Puntaje por catador, crudo y controlado por país y variedad (catadores con al menos 1.500 reseñas).</w:t>
+        <w:t>Puntaje promedio de tres catadores y su diferencia con vinos parecidos.</w:t>
       </w:r>
     </w:p>
     <w:tbl>
@@ -12351,10 +11494,10 @@
         <w:tblLook w:val="0000" w:firstRow="0" w:lastRow="0" w:firstColumn="0" w:lastColumn="0" w:noHBand="0" w:noVBand="0"/>
       </w:tblPr>
       <w:tblGrid>
-        <w:gridCol w:w="3502"/>
-        <w:gridCol w:w="1591"/>
-        <w:gridCol w:w="1750"/>
-        <w:gridCol w:w="2227"/>
+        <w:gridCol w:w="3024"/>
+        <w:gridCol w:w="1511"/>
+        <w:gridCol w:w="1511"/>
+        <w:gridCol w:w="3024"/>
       </w:tblGrid>
       <w:tr>
         <w:trPr>
@@ -12364,7 +11507,7 @@
         </w:trPr>
         <w:tc>
           <w:tcPr>
-            <w:tcW w:w="3500" w:type="dxa"/>
+            <w:tcW w:w="3023" w:type="dxa"/>
             <w:shd w:val="clear" w:color="auto" w:fill="EDE3E6"/>
             <w:tcMar>
               <w:top w:w="40" w:type="dxa"/>
@@ -12391,7 +11534,7 @@
         </w:tc>
         <w:tc>
           <w:tcPr>
-            <w:tcW w:w="1591" w:type="dxa"/>
+            <w:tcW w:w="1511" w:type="dxa"/>
             <w:shd w:val="clear" w:color="auto" w:fill="EDE3E6"/>
             <w:tcMar>
               <w:top w:w="40" w:type="dxa"/>
@@ -12419,7 +11562,7 @@
         </w:tc>
         <w:tc>
           <w:tcPr>
-            <w:tcW w:w="1750" w:type="dxa"/>
+            <w:tcW w:w="1511" w:type="dxa"/>
             <w:shd w:val="clear" w:color="auto" w:fill="EDE3E6"/>
             <w:tcMar>
               <w:top w:w="40" w:type="dxa"/>
@@ -12441,13 +11584,13 @@
                 <w:sz w:val="20"/>
                 <w:szCs w:val="20"/>
               </w:rPr>
-              <w:t>Media cruda</w:t>
-            </w:r>
-          </w:p>
-        </w:tc>
-        <w:tc>
-          <w:tcPr>
-            <w:tcW w:w="2227" w:type="dxa"/>
+              <w:t>Promedio</w:t>
+            </w:r>
+          </w:p>
+        </w:tc>
+        <w:tc>
+          <w:tcPr>
+            <w:tcW w:w="3023" w:type="dxa"/>
             <w:shd w:val="clear" w:color="auto" w:fill="EDE3E6"/>
             <w:tcMar>
               <w:top w:w="40" w:type="dxa"/>
@@ -12469,7 +11612,7 @@
                 <w:sz w:val="20"/>
                 <w:szCs w:val="20"/>
               </w:rPr>
-              <w:t>Desvío controlado</w:t>
+              <w:t>Diferencia con vinos parecidos</w:t>
             </w:r>
           </w:p>
         </w:tc>
@@ -12481,7 +11624,7 @@
         </w:trPr>
         <w:tc>
           <w:tcPr>
-            <w:tcW w:w="3500" w:type="dxa"/>
+            <w:tcW w:w="3023" w:type="dxa"/>
             <w:tcMar>
               <w:top w:w="40" w:type="dxa"/>
               <w:left w:w="100" w:type="dxa"/>
@@ -12505,7 +11648,7 @@
         </w:tc>
         <w:tc>
           <w:tcPr>
-            <w:tcW w:w="1591" w:type="dxa"/>
+            <w:tcW w:w="1511" w:type="dxa"/>
             <w:tcMar>
               <w:top w:w="40" w:type="dxa"/>
               <w:left w:w="100" w:type="dxa"/>
@@ -12530,7 +11673,7 @@
         </w:tc>
         <w:tc>
           <w:tcPr>
-            <w:tcW w:w="1750" w:type="dxa"/>
+            <w:tcW w:w="1511" w:type="dxa"/>
             <w:tcMar>
               <w:top w:w="40" w:type="dxa"/>
               <w:left w:w="100" w:type="dxa"/>
@@ -12555,7 +11698,7 @@
         </w:tc>
         <w:tc>
           <w:tcPr>
-            <w:tcW w:w="2227" w:type="dxa"/>
+            <w:tcW w:w="3023" w:type="dxa"/>
             <w:tcMar>
               <w:top w:w="40" w:type="dxa"/>
               <w:left w:w="100" w:type="dxa"/>
@@ -12586,100 +11729,100 @@
         </w:trPr>
         <w:tc>
           <w:tcPr>
-            <w:tcW w:w="3500" w:type="dxa"/>
-            <w:tcMar>
-              <w:top w:w="40" w:type="dxa"/>
-              <w:left w:w="100" w:type="dxa"/>
-              <w:bottom w:w="40" w:type="dxa"/>
-              <w:right w:w="100" w:type="dxa"/>
-            </w:tcMar>
-            <w:vAlign w:val="center"/>
-          </w:tcPr>
-          <w:p>
-            <w:pPr>
-              <w:spacing w:after="0" w:line="240" w:lineRule="auto"/>
-            </w:pPr>
-            <w:r>
-              <w:rPr>
-                <w:sz w:val="20"/>
-                <w:szCs w:val="20"/>
-              </w:rPr>
-              <w:t>Matt Kettmann</w:t>
-            </w:r>
-          </w:p>
-        </w:tc>
-        <w:tc>
-          <w:tcPr>
-            <w:tcW w:w="1591" w:type="dxa"/>
-            <w:tcMar>
-              <w:top w:w="40" w:type="dxa"/>
-              <w:left w:w="100" w:type="dxa"/>
-              <w:bottom w:w="40" w:type="dxa"/>
-              <w:right w:w="100" w:type="dxa"/>
-            </w:tcMar>
-            <w:vAlign w:val="center"/>
-          </w:tcPr>
-          <w:p>
-            <w:pPr>
-              <w:spacing w:after="0" w:line="240" w:lineRule="auto"/>
-              <w:jc w:val="right"/>
-            </w:pPr>
-            <w:r>
-              <w:rPr>
-                <w:sz w:val="20"/>
-                <w:szCs w:val="20"/>
-              </w:rPr>
-              <w:t>5.730</w:t>
-            </w:r>
-          </w:p>
-        </w:tc>
-        <w:tc>
-          <w:tcPr>
-            <w:tcW w:w="1750" w:type="dxa"/>
-            <w:tcMar>
-              <w:top w:w="40" w:type="dxa"/>
-              <w:left w:w="100" w:type="dxa"/>
-              <w:bottom w:w="40" w:type="dxa"/>
-              <w:right w:w="100" w:type="dxa"/>
-            </w:tcMar>
-            <w:vAlign w:val="center"/>
-          </w:tcPr>
-          <w:p>
-            <w:pPr>
-              <w:spacing w:after="0" w:line="240" w:lineRule="auto"/>
-              <w:jc w:val="right"/>
-            </w:pPr>
-            <w:r>
-              <w:rPr>
-                <w:sz w:val="20"/>
-                <w:szCs w:val="20"/>
-              </w:rPr>
-              <w:t>90,06</w:t>
-            </w:r>
-          </w:p>
-        </w:tc>
-        <w:tc>
-          <w:tcPr>
-            <w:tcW w:w="2227" w:type="dxa"/>
-            <w:tcMar>
-              <w:top w:w="40" w:type="dxa"/>
-              <w:left w:w="100" w:type="dxa"/>
-              <w:bottom w:w="40" w:type="dxa"/>
-              <w:right w:w="100" w:type="dxa"/>
-            </w:tcMar>
-            <w:vAlign w:val="center"/>
-          </w:tcPr>
-          <w:p>
-            <w:pPr>
-              <w:spacing w:after="0" w:line="240" w:lineRule="auto"/>
-              <w:jc w:val="right"/>
-            </w:pPr>
-            <w:r>
-              <w:rPr>
-                <w:sz w:val="20"/>
-                <w:szCs w:val="20"/>
-              </w:rPr>
-              <w:t>+0,85</w:t>
+            <w:tcW w:w="3023" w:type="dxa"/>
+            <w:tcMar>
+              <w:top w:w="40" w:type="dxa"/>
+              <w:left w:w="100" w:type="dxa"/>
+              <w:bottom w:w="40" w:type="dxa"/>
+              <w:right w:w="100" w:type="dxa"/>
+            </w:tcMar>
+            <w:vAlign w:val="center"/>
+          </w:tcPr>
+          <w:p>
+            <w:pPr>
+              <w:spacing w:after="0" w:line="240" w:lineRule="auto"/>
+            </w:pPr>
+            <w:r>
+              <w:rPr>
+                <w:sz w:val="20"/>
+                <w:szCs w:val="20"/>
+              </w:rPr>
+              <w:t>Roger Voss</w:t>
+            </w:r>
+          </w:p>
+        </w:tc>
+        <w:tc>
+          <w:tcPr>
+            <w:tcW w:w="1511" w:type="dxa"/>
+            <w:tcMar>
+              <w:top w:w="40" w:type="dxa"/>
+              <w:left w:w="100" w:type="dxa"/>
+              <w:bottom w:w="40" w:type="dxa"/>
+              <w:right w:w="100" w:type="dxa"/>
+            </w:tcMar>
+            <w:vAlign w:val="center"/>
+          </w:tcPr>
+          <w:p>
+            <w:pPr>
+              <w:spacing w:after="0" w:line="240" w:lineRule="auto"/>
+              <w:jc w:val="right"/>
+            </w:pPr>
+            <w:r>
+              <w:rPr>
+                <w:sz w:val="20"/>
+                <w:szCs w:val="20"/>
+              </w:rPr>
+              <w:t>23.560</w:t>
+            </w:r>
+          </w:p>
+        </w:tc>
+        <w:tc>
+          <w:tcPr>
+            <w:tcW w:w="1511" w:type="dxa"/>
+            <w:tcMar>
+              <w:top w:w="40" w:type="dxa"/>
+              <w:left w:w="100" w:type="dxa"/>
+              <w:bottom w:w="40" w:type="dxa"/>
+              <w:right w:w="100" w:type="dxa"/>
+            </w:tcMar>
+            <w:vAlign w:val="center"/>
+          </w:tcPr>
+          <w:p>
+            <w:pPr>
+              <w:spacing w:after="0" w:line="240" w:lineRule="auto"/>
+              <w:jc w:val="right"/>
+            </w:pPr>
+            <w:r>
+              <w:rPr>
+                <w:sz w:val="20"/>
+                <w:szCs w:val="20"/>
+              </w:rPr>
+              <w:t>88,73</w:t>
+            </w:r>
+          </w:p>
+        </w:tc>
+        <w:tc>
+          <w:tcPr>
+            <w:tcW w:w="3023" w:type="dxa"/>
+            <w:tcMar>
+              <w:top w:w="40" w:type="dxa"/>
+              <w:left w:w="100" w:type="dxa"/>
+              <w:bottom w:w="40" w:type="dxa"/>
+              <w:right w:w="100" w:type="dxa"/>
+            </w:tcMar>
+            <w:vAlign w:val="center"/>
+          </w:tcPr>
+          <w:p>
+            <w:pPr>
+              <w:spacing w:after="0" w:line="240" w:lineRule="auto"/>
+              <w:jc w:val="right"/>
+            </w:pPr>
+            <w:r>
+              <w:rPr>
+                <w:sz w:val="20"/>
+                <w:szCs w:val="20"/>
+              </w:rPr>
+              <w:t>-0,04</w:t>
             </w:r>
           </w:p>
         </w:tc>
@@ -12691,952 +11834,7 @@
         </w:trPr>
         <w:tc>
           <w:tcPr>
-            <w:tcW w:w="3500" w:type="dxa"/>
-            <w:tcMar>
-              <w:top w:w="40" w:type="dxa"/>
-              <w:left w:w="100" w:type="dxa"/>
-              <w:bottom w:w="40" w:type="dxa"/>
-              <w:right w:w="100" w:type="dxa"/>
-            </w:tcMar>
-            <w:vAlign w:val="center"/>
-          </w:tcPr>
-          <w:p>
-            <w:pPr>
-              <w:spacing w:after="0" w:line="240" w:lineRule="auto"/>
-            </w:pPr>
-            <w:r>
-              <w:rPr>
-                <w:sz w:val="20"/>
-                <w:szCs w:val="20"/>
-              </w:rPr>
-              <w:t>Virginie Boone</w:t>
-            </w:r>
-          </w:p>
-        </w:tc>
-        <w:tc>
-          <w:tcPr>
-            <w:tcW w:w="1591" w:type="dxa"/>
-            <w:tcMar>
-              <w:top w:w="40" w:type="dxa"/>
-              <w:left w:w="100" w:type="dxa"/>
-              <w:bottom w:w="40" w:type="dxa"/>
-              <w:right w:w="100" w:type="dxa"/>
-            </w:tcMar>
-            <w:vAlign w:val="center"/>
-          </w:tcPr>
-          <w:p>
-            <w:pPr>
-              <w:spacing w:after="0" w:line="240" w:lineRule="auto"/>
-              <w:jc w:val="right"/>
-            </w:pPr>
-            <w:r>
-              <w:rPr>
-                <w:sz w:val="20"/>
-                <w:szCs w:val="20"/>
-              </w:rPr>
-              <w:t>8.708</w:t>
-            </w:r>
-          </w:p>
-        </w:tc>
-        <w:tc>
-          <w:tcPr>
-            <w:tcW w:w="1750" w:type="dxa"/>
-            <w:tcMar>
-              <w:top w:w="40" w:type="dxa"/>
-              <w:left w:w="100" w:type="dxa"/>
-              <w:bottom w:w="40" w:type="dxa"/>
-              <w:right w:w="100" w:type="dxa"/>
-            </w:tcMar>
-            <w:vAlign w:val="center"/>
-          </w:tcPr>
-          <w:p>
-            <w:pPr>
-              <w:spacing w:after="0" w:line="240" w:lineRule="auto"/>
-              <w:jc w:val="right"/>
-            </w:pPr>
-            <w:r>
-              <w:rPr>
-                <w:sz w:val="20"/>
-                <w:szCs w:val="20"/>
-              </w:rPr>
-              <w:t>89,22</w:t>
-            </w:r>
-          </w:p>
-        </w:tc>
-        <w:tc>
-          <w:tcPr>
-            <w:tcW w:w="2227" w:type="dxa"/>
-            <w:tcMar>
-              <w:top w:w="40" w:type="dxa"/>
-              <w:left w:w="100" w:type="dxa"/>
-              <w:bottom w:w="40" w:type="dxa"/>
-              <w:right w:w="100" w:type="dxa"/>
-            </w:tcMar>
-            <w:vAlign w:val="center"/>
-          </w:tcPr>
-          <w:p>
-            <w:pPr>
-              <w:spacing w:after="0" w:line="240" w:lineRule="auto"/>
-              <w:jc w:val="right"/>
-            </w:pPr>
-            <w:r>
-              <w:rPr>
-                <w:sz w:val="20"/>
-                <w:szCs w:val="20"/>
-              </w:rPr>
-              <w:t>+0,20</w:t>
-            </w:r>
-          </w:p>
-        </w:tc>
-      </w:tr>
-      <w:tr>
-        <w:trPr>
-          <w:cantSplit/>
-          <w:jc w:val="center"/>
-        </w:trPr>
-        <w:tc>
-          <w:tcPr>
-            <w:tcW w:w="3500" w:type="dxa"/>
-            <w:tcMar>
-              <w:top w:w="40" w:type="dxa"/>
-              <w:left w:w="100" w:type="dxa"/>
-              <w:bottom w:w="40" w:type="dxa"/>
-              <w:right w:w="100" w:type="dxa"/>
-            </w:tcMar>
-            <w:vAlign w:val="center"/>
-          </w:tcPr>
-          <w:p>
-            <w:pPr>
-              <w:spacing w:after="0" w:line="240" w:lineRule="auto"/>
-            </w:pPr>
-            <w:r>
-              <w:rPr>
-                <w:sz w:val="20"/>
-                <w:szCs w:val="20"/>
-              </w:rPr>
-              <w:t>Paul Gregutt</w:t>
-            </w:r>
-          </w:p>
-        </w:tc>
-        <w:tc>
-          <w:tcPr>
-            <w:tcW w:w="1591" w:type="dxa"/>
-            <w:tcMar>
-              <w:top w:w="40" w:type="dxa"/>
-              <w:left w:w="100" w:type="dxa"/>
-              <w:bottom w:w="40" w:type="dxa"/>
-              <w:right w:w="100" w:type="dxa"/>
-            </w:tcMar>
-            <w:vAlign w:val="center"/>
-          </w:tcPr>
-          <w:p>
-            <w:pPr>
-              <w:spacing w:after="0" w:line="240" w:lineRule="auto"/>
-              <w:jc w:val="right"/>
-            </w:pPr>
-            <w:r>
-              <w:rPr>
-                <w:sz w:val="20"/>
-                <w:szCs w:val="20"/>
-              </w:rPr>
-              <w:t>8.868</w:t>
-            </w:r>
-          </w:p>
-        </w:tc>
-        <w:tc>
-          <w:tcPr>
-            <w:tcW w:w="1750" w:type="dxa"/>
-            <w:tcMar>
-              <w:top w:w="40" w:type="dxa"/>
-              <w:left w:w="100" w:type="dxa"/>
-              <w:bottom w:w="40" w:type="dxa"/>
-              <w:right w:w="100" w:type="dxa"/>
-            </w:tcMar>
-            <w:vAlign w:val="center"/>
-          </w:tcPr>
-          <w:p>
-            <w:pPr>
-              <w:spacing w:after="0" w:line="240" w:lineRule="auto"/>
-              <w:jc w:val="right"/>
-            </w:pPr>
-            <w:r>
-              <w:rPr>
-                <w:sz w:val="20"/>
-                <w:szCs w:val="20"/>
-              </w:rPr>
-              <w:t>89,09</w:t>
-            </w:r>
-          </w:p>
-        </w:tc>
-        <w:tc>
-          <w:tcPr>
-            <w:tcW w:w="2227" w:type="dxa"/>
-            <w:tcMar>
-              <w:top w:w="40" w:type="dxa"/>
-              <w:left w:w="100" w:type="dxa"/>
-              <w:bottom w:w="40" w:type="dxa"/>
-              <w:right w:w="100" w:type="dxa"/>
-            </w:tcMar>
-            <w:vAlign w:val="center"/>
-          </w:tcPr>
-          <w:p>
-            <w:pPr>
-              <w:spacing w:after="0" w:line="240" w:lineRule="auto"/>
-              <w:jc w:val="right"/>
-            </w:pPr>
-            <w:r>
-              <w:rPr>
-                <w:sz w:val="20"/>
-                <w:szCs w:val="20"/>
-              </w:rPr>
-              <w:t>0,00</w:t>
-            </w:r>
-          </w:p>
-        </w:tc>
-      </w:tr>
-      <w:tr>
-        <w:trPr>
-          <w:cantSplit/>
-          <w:jc w:val="center"/>
-        </w:trPr>
-        <w:tc>
-          <w:tcPr>
-            <w:tcW w:w="3500" w:type="dxa"/>
-            <w:tcMar>
-              <w:top w:w="40" w:type="dxa"/>
-              <w:left w:w="100" w:type="dxa"/>
-              <w:bottom w:w="40" w:type="dxa"/>
-              <w:right w:w="100" w:type="dxa"/>
-            </w:tcMar>
-            <w:vAlign w:val="center"/>
-          </w:tcPr>
-          <w:p>
-            <w:pPr>
-              <w:spacing w:after="0" w:line="240" w:lineRule="auto"/>
-            </w:pPr>
-            <w:r>
-              <w:rPr>
-                <w:sz w:val="20"/>
-                <w:szCs w:val="20"/>
-              </w:rPr>
-              <w:t>Kerin O'Keefe</w:t>
-            </w:r>
-          </w:p>
-        </w:tc>
-        <w:tc>
-          <w:tcPr>
-            <w:tcW w:w="1591" w:type="dxa"/>
-            <w:tcMar>
-              <w:top w:w="40" w:type="dxa"/>
-              <w:left w:w="100" w:type="dxa"/>
-              <w:bottom w:w="40" w:type="dxa"/>
-              <w:right w:w="100" w:type="dxa"/>
-            </w:tcMar>
-            <w:vAlign w:val="center"/>
-          </w:tcPr>
-          <w:p>
-            <w:pPr>
-              <w:spacing w:after="0" w:line="240" w:lineRule="auto"/>
-              <w:jc w:val="right"/>
-            </w:pPr>
-            <w:r>
-              <w:rPr>
-                <w:sz w:val="20"/>
-                <w:szCs w:val="20"/>
-              </w:rPr>
-              <w:t>9.697</w:t>
-            </w:r>
-          </w:p>
-        </w:tc>
-        <w:tc>
-          <w:tcPr>
-            <w:tcW w:w="1750" w:type="dxa"/>
-            <w:tcMar>
-              <w:top w:w="40" w:type="dxa"/>
-              <w:left w:w="100" w:type="dxa"/>
-              <w:bottom w:w="40" w:type="dxa"/>
-              <w:right w:w="100" w:type="dxa"/>
-            </w:tcMar>
-            <w:vAlign w:val="center"/>
-          </w:tcPr>
-          <w:p>
-            <w:pPr>
-              <w:spacing w:after="0" w:line="240" w:lineRule="auto"/>
-              <w:jc w:val="right"/>
-            </w:pPr>
-            <w:r>
-              <w:rPr>
-                <w:sz w:val="20"/>
-                <w:szCs w:val="20"/>
-              </w:rPr>
-              <w:t>88,90</w:t>
-            </w:r>
-          </w:p>
-        </w:tc>
-        <w:tc>
-          <w:tcPr>
-            <w:tcW w:w="2227" w:type="dxa"/>
-            <w:tcMar>
-              <w:top w:w="40" w:type="dxa"/>
-              <w:left w:w="100" w:type="dxa"/>
-              <w:bottom w:w="40" w:type="dxa"/>
-              <w:right w:w="100" w:type="dxa"/>
-            </w:tcMar>
-            <w:vAlign w:val="center"/>
-          </w:tcPr>
-          <w:p>
-            <w:pPr>
-              <w:spacing w:after="0" w:line="240" w:lineRule="auto"/>
-              <w:jc w:val="right"/>
-            </w:pPr>
-            <w:r>
-              <w:rPr>
-                <w:sz w:val="20"/>
-                <w:szCs w:val="20"/>
-              </w:rPr>
-              <w:t>+0,01</w:t>
-            </w:r>
-          </w:p>
-        </w:tc>
-      </w:tr>
-      <w:tr>
-        <w:trPr>
-          <w:cantSplit/>
-          <w:jc w:val="center"/>
-        </w:trPr>
-        <w:tc>
-          <w:tcPr>
-            <w:tcW w:w="3500" w:type="dxa"/>
-            <w:tcMar>
-              <w:top w:w="40" w:type="dxa"/>
-              <w:left w:w="100" w:type="dxa"/>
-              <w:bottom w:w="40" w:type="dxa"/>
-              <w:right w:w="100" w:type="dxa"/>
-            </w:tcMar>
-            <w:vAlign w:val="center"/>
-          </w:tcPr>
-          <w:p>
-            <w:pPr>
-              <w:spacing w:after="0" w:line="240" w:lineRule="auto"/>
-            </w:pPr>
-            <w:r>
-              <w:rPr>
-                <w:sz w:val="20"/>
-                <w:szCs w:val="20"/>
-              </w:rPr>
-              <w:t>Sean P. Sullivan</w:t>
-            </w:r>
-          </w:p>
-        </w:tc>
-        <w:tc>
-          <w:tcPr>
-            <w:tcW w:w="1591" w:type="dxa"/>
-            <w:tcMar>
-              <w:top w:w="40" w:type="dxa"/>
-              <w:left w:w="100" w:type="dxa"/>
-              <w:bottom w:w="40" w:type="dxa"/>
-              <w:right w:w="100" w:type="dxa"/>
-            </w:tcMar>
-            <w:vAlign w:val="center"/>
-          </w:tcPr>
-          <w:p>
-            <w:pPr>
-              <w:spacing w:after="0" w:line="240" w:lineRule="auto"/>
-              <w:jc w:val="right"/>
-            </w:pPr>
-            <w:r>
-              <w:rPr>
-                <w:sz w:val="20"/>
-                <w:szCs w:val="20"/>
-              </w:rPr>
-              <w:t>4.461</w:t>
-            </w:r>
-          </w:p>
-        </w:tc>
-        <w:tc>
-          <w:tcPr>
-            <w:tcW w:w="1750" w:type="dxa"/>
-            <w:tcMar>
-              <w:top w:w="40" w:type="dxa"/>
-              <w:left w:w="100" w:type="dxa"/>
-              <w:bottom w:w="40" w:type="dxa"/>
-              <w:right w:w="100" w:type="dxa"/>
-            </w:tcMar>
-            <w:vAlign w:val="center"/>
-          </w:tcPr>
-          <w:p>
-            <w:pPr>
-              <w:spacing w:after="0" w:line="240" w:lineRule="auto"/>
-              <w:jc w:val="right"/>
-            </w:pPr>
-            <w:r>
-              <w:rPr>
-                <w:sz w:val="20"/>
-                <w:szCs w:val="20"/>
-              </w:rPr>
-              <w:t>88,75</w:t>
-            </w:r>
-          </w:p>
-        </w:tc>
-        <w:tc>
-          <w:tcPr>
-            <w:tcW w:w="2227" w:type="dxa"/>
-            <w:tcMar>
-              <w:top w:w="40" w:type="dxa"/>
-              <w:left w:w="100" w:type="dxa"/>
-              <w:bottom w:w="40" w:type="dxa"/>
-              <w:right w:w="100" w:type="dxa"/>
-            </w:tcMar>
-            <w:vAlign w:val="center"/>
-          </w:tcPr>
-          <w:p>
-            <w:pPr>
-              <w:spacing w:after="0" w:line="240" w:lineRule="auto"/>
-              <w:jc w:val="right"/>
-            </w:pPr>
-            <w:r>
-              <w:rPr>
-                <w:sz w:val="20"/>
-                <w:szCs w:val="20"/>
-              </w:rPr>
-              <w:t>-0,17</w:t>
-            </w:r>
-          </w:p>
-        </w:tc>
-      </w:tr>
-      <w:tr>
-        <w:trPr>
-          <w:cantSplit/>
-          <w:jc w:val="center"/>
-        </w:trPr>
-        <w:tc>
-          <w:tcPr>
-            <w:tcW w:w="3500" w:type="dxa"/>
-            <w:tcMar>
-              <w:top w:w="40" w:type="dxa"/>
-              <w:left w:w="100" w:type="dxa"/>
-              <w:bottom w:w="40" w:type="dxa"/>
-              <w:right w:w="100" w:type="dxa"/>
-            </w:tcMar>
-            <w:vAlign w:val="center"/>
-          </w:tcPr>
-          <w:p>
-            <w:pPr>
-              <w:spacing w:after="0" w:line="240" w:lineRule="auto"/>
-            </w:pPr>
-            <w:r>
-              <w:rPr>
-                <w:sz w:val="20"/>
-                <w:szCs w:val="20"/>
-              </w:rPr>
-              <w:t>Roger Voss</w:t>
-            </w:r>
-          </w:p>
-        </w:tc>
-        <w:tc>
-          <w:tcPr>
-            <w:tcW w:w="1591" w:type="dxa"/>
-            <w:tcMar>
-              <w:top w:w="40" w:type="dxa"/>
-              <w:left w:w="100" w:type="dxa"/>
-              <w:bottom w:w="40" w:type="dxa"/>
-              <w:right w:w="100" w:type="dxa"/>
-            </w:tcMar>
-            <w:vAlign w:val="center"/>
-          </w:tcPr>
-          <w:p>
-            <w:pPr>
-              <w:spacing w:after="0" w:line="240" w:lineRule="auto"/>
-              <w:jc w:val="right"/>
-            </w:pPr>
-            <w:r>
-              <w:rPr>
-                <w:sz w:val="20"/>
-                <w:szCs w:val="20"/>
-              </w:rPr>
-              <w:t>23.560</w:t>
-            </w:r>
-          </w:p>
-        </w:tc>
-        <w:tc>
-          <w:tcPr>
-            <w:tcW w:w="1750" w:type="dxa"/>
-            <w:tcMar>
-              <w:top w:w="40" w:type="dxa"/>
-              <w:left w:w="100" w:type="dxa"/>
-              <w:bottom w:w="40" w:type="dxa"/>
-              <w:right w:w="100" w:type="dxa"/>
-            </w:tcMar>
-            <w:vAlign w:val="center"/>
-          </w:tcPr>
-          <w:p>
-            <w:pPr>
-              <w:spacing w:after="0" w:line="240" w:lineRule="auto"/>
-              <w:jc w:val="right"/>
-            </w:pPr>
-            <w:r>
-              <w:rPr>
-                <w:sz w:val="20"/>
-                <w:szCs w:val="20"/>
-              </w:rPr>
-              <w:t>88,73</w:t>
-            </w:r>
-          </w:p>
-        </w:tc>
-        <w:tc>
-          <w:tcPr>
-            <w:tcW w:w="2227" w:type="dxa"/>
-            <w:tcMar>
-              <w:top w:w="40" w:type="dxa"/>
-              <w:left w:w="100" w:type="dxa"/>
-              <w:bottom w:w="40" w:type="dxa"/>
-              <w:right w:w="100" w:type="dxa"/>
-            </w:tcMar>
-            <w:vAlign w:val="center"/>
-          </w:tcPr>
-          <w:p>
-            <w:pPr>
-              <w:spacing w:after="0" w:line="240" w:lineRule="auto"/>
-              <w:jc w:val="right"/>
-            </w:pPr>
-            <w:r>
-              <w:rPr>
-                <w:sz w:val="20"/>
-                <w:szCs w:val="20"/>
-              </w:rPr>
-              <w:t>-0,04</w:t>
-            </w:r>
-          </w:p>
-        </w:tc>
-      </w:tr>
-      <w:tr>
-        <w:trPr>
-          <w:cantSplit/>
-          <w:jc w:val="center"/>
-        </w:trPr>
-        <w:tc>
-          <w:tcPr>
-            <w:tcW w:w="3500" w:type="dxa"/>
-            <w:tcMar>
-              <w:top w:w="40" w:type="dxa"/>
-              <w:left w:w="100" w:type="dxa"/>
-              <w:bottom w:w="40" w:type="dxa"/>
-              <w:right w:w="100" w:type="dxa"/>
-            </w:tcMar>
-            <w:vAlign w:val="center"/>
-          </w:tcPr>
-          <w:p>
-            <w:pPr>
-              <w:spacing w:after="0" w:line="240" w:lineRule="auto"/>
-            </w:pPr>
-            <w:r>
-              <w:rPr>
-                <w:sz w:val="20"/>
-                <w:szCs w:val="20"/>
-              </w:rPr>
-              <w:t>Jim Gordon</w:t>
-            </w:r>
-          </w:p>
-        </w:tc>
-        <w:tc>
-          <w:tcPr>
-            <w:tcW w:w="1591" w:type="dxa"/>
-            <w:tcMar>
-              <w:top w:w="40" w:type="dxa"/>
-              <w:left w:w="100" w:type="dxa"/>
-              <w:bottom w:w="40" w:type="dxa"/>
-              <w:right w:w="100" w:type="dxa"/>
-            </w:tcMar>
-            <w:vAlign w:val="center"/>
-          </w:tcPr>
-          <w:p>
-            <w:pPr>
-              <w:spacing w:after="0" w:line="240" w:lineRule="auto"/>
-              <w:jc w:val="right"/>
-            </w:pPr>
-            <w:r>
-              <w:rPr>
-                <w:sz w:val="20"/>
-                <w:szCs w:val="20"/>
-              </w:rPr>
-              <w:t>3.766</w:t>
-            </w:r>
-          </w:p>
-        </w:tc>
-        <w:tc>
-          <w:tcPr>
-            <w:tcW w:w="1750" w:type="dxa"/>
-            <w:tcMar>
-              <w:top w:w="40" w:type="dxa"/>
-              <w:left w:w="100" w:type="dxa"/>
-              <w:bottom w:w="40" w:type="dxa"/>
-              <w:right w:w="100" w:type="dxa"/>
-            </w:tcMar>
-            <w:vAlign w:val="center"/>
-          </w:tcPr>
-          <w:p>
-            <w:pPr>
-              <w:spacing w:after="0" w:line="240" w:lineRule="auto"/>
-              <w:jc w:val="right"/>
-            </w:pPr>
-            <w:r>
-              <w:rPr>
-                <w:sz w:val="20"/>
-                <w:szCs w:val="20"/>
-              </w:rPr>
-              <w:t>88,60</w:t>
-            </w:r>
-          </w:p>
-        </w:tc>
-        <w:tc>
-          <w:tcPr>
-            <w:tcW w:w="2227" w:type="dxa"/>
-            <w:tcMar>
-              <w:top w:w="40" w:type="dxa"/>
-              <w:left w:w="100" w:type="dxa"/>
-              <w:bottom w:w="40" w:type="dxa"/>
-              <w:right w:w="100" w:type="dxa"/>
-            </w:tcMar>
-            <w:vAlign w:val="center"/>
-          </w:tcPr>
-          <w:p>
-            <w:pPr>
-              <w:spacing w:after="0" w:line="240" w:lineRule="auto"/>
-              <w:jc w:val="right"/>
-            </w:pPr>
-            <w:r>
-              <w:rPr>
-                <w:sz w:val="20"/>
-                <w:szCs w:val="20"/>
-              </w:rPr>
-              <w:t>-0,24</w:t>
-            </w:r>
-          </w:p>
-        </w:tc>
-      </w:tr>
-      <w:tr>
-        <w:trPr>
-          <w:cantSplit/>
-          <w:jc w:val="center"/>
-        </w:trPr>
-        <w:tc>
-          <w:tcPr>
-            <w:tcW w:w="3500" w:type="dxa"/>
-            <w:tcMar>
-              <w:top w:w="40" w:type="dxa"/>
-              <w:left w:w="100" w:type="dxa"/>
-              <w:bottom w:w="40" w:type="dxa"/>
-              <w:right w:w="100" w:type="dxa"/>
-            </w:tcMar>
-            <w:vAlign w:val="center"/>
-          </w:tcPr>
-          <w:p>
-            <w:pPr>
-              <w:spacing w:after="0" w:line="240" w:lineRule="auto"/>
-            </w:pPr>
-            <w:r>
-              <w:rPr>
-                <w:sz w:val="20"/>
-                <w:szCs w:val="20"/>
-              </w:rPr>
-              <w:t>Joe Czerwinski</w:t>
-            </w:r>
-          </w:p>
-        </w:tc>
-        <w:tc>
-          <w:tcPr>
-            <w:tcW w:w="1591" w:type="dxa"/>
-            <w:tcMar>
-              <w:top w:w="40" w:type="dxa"/>
-              <w:left w:w="100" w:type="dxa"/>
-              <w:bottom w:w="40" w:type="dxa"/>
-              <w:right w:w="100" w:type="dxa"/>
-            </w:tcMar>
-            <w:vAlign w:val="center"/>
-          </w:tcPr>
-          <w:p>
-            <w:pPr>
-              <w:spacing w:after="0" w:line="240" w:lineRule="auto"/>
-              <w:jc w:val="right"/>
-            </w:pPr>
-            <w:r>
-              <w:rPr>
-                <w:sz w:val="20"/>
-                <w:szCs w:val="20"/>
-              </w:rPr>
-              <w:t>4.766</w:t>
-            </w:r>
-          </w:p>
-        </w:tc>
-        <w:tc>
-          <w:tcPr>
-            <w:tcW w:w="1750" w:type="dxa"/>
-            <w:tcMar>
-              <w:top w:w="40" w:type="dxa"/>
-              <w:left w:w="100" w:type="dxa"/>
-              <w:bottom w:w="40" w:type="dxa"/>
-              <w:right w:w="100" w:type="dxa"/>
-            </w:tcMar>
-            <w:vAlign w:val="center"/>
-          </w:tcPr>
-          <w:p>
-            <w:pPr>
-              <w:spacing w:after="0" w:line="240" w:lineRule="auto"/>
-              <w:jc w:val="right"/>
-            </w:pPr>
-            <w:r>
-              <w:rPr>
-                <w:sz w:val="20"/>
-                <w:szCs w:val="20"/>
-              </w:rPr>
-              <w:t>88,52</w:t>
-            </w:r>
-          </w:p>
-        </w:tc>
-        <w:tc>
-          <w:tcPr>
-            <w:tcW w:w="2227" w:type="dxa"/>
-            <w:tcMar>
-              <w:top w:w="40" w:type="dxa"/>
-              <w:left w:w="100" w:type="dxa"/>
-              <w:bottom w:w="40" w:type="dxa"/>
-              <w:right w:w="100" w:type="dxa"/>
-            </w:tcMar>
-            <w:vAlign w:val="center"/>
-          </w:tcPr>
-          <w:p>
-            <w:pPr>
-              <w:spacing w:after="0" w:line="240" w:lineRule="auto"/>
-              <w:jc w:val="right"/>
-            </w:pPr>
-            <w:r>
-              <w:rPr>
-                <w:sz w:val="20"/>
-                <w:szCs w:val="20"/>
-              </w:rPr>
-              <w:t>-0,22</w:t>
-            </w:r>
-          </w:p>
-        </w:tc>
-      </w:tr>
-      <w:tr>
-        <w:trPr>
-          <w:cantSplit/>
-          <w:jc w:val="center"/>
-        </w:trPr>
-        <w:tc>
-          <w:tcPr>
-            <w:tcW w:w="3500" w:type="dxa"/>
-            <w:tcMar>
-              <w:top w:w="40" w:type="dxa"/>
-              <w:left w:w="100" w:type="dxa"/>
-              <w:bottom w:w="40" w:type="dxa"/>
-              <w:right w:w="100" w:type="dxa"/>
-            </w:tcMar>
-            <w:vAlign w:val="center"/>
-          </w:tcPr>
-          <w:p>
-            <w:pPr>
-              <w:spacing w:after="0" w:line="240" w:lineRule="auto"/>
-            </w:pPr>
-            <w:r>
-              <w:rPr>
-                <w:sz w:val="20"/>
-                <w:szCs w:val="20"/>
-              </w:rPr>
-              <w:t>Anna Lee C. Iijima</w:t>
-            </w:r>
-          </w:p>
-        </w:tc>
-        <w:tc>
-          <w:tcPr>
-            <w:tcW w:w="1591" w:type="dxa"/>
-            <w:tcMar>
-              <w:top w:w="40" w:type="dxa"/>
-              <w:left w:w="100" w:type="dxa"/>
-              <w:bottom w:w="40" w:type="dxa"/>
-              <w:right w:w="100" w:type="dxa"/>
-            </w:tcMar>
-            <w:vAlign w:val="center"/>
-          </w:tcPr>
-          <w:p>
-            <w:pPr>
-              <w:spacing w:after="0" w:line="240" w:lineRule="auto"/>
-              <w:jc w:val="right"/>
-            </w:pPr>
-            <w:r>
-              <w:rPr>
-                <w:sz w:val="20"/>
-                <w:szCs w:val="20"/>
-              </w:rPr>
-              <w:t>4.017</w:t>
-            </w:r>
-          </w:p>
-        </w:tc>
-        <w:tc>
-          <w:tcPr>
-            <w:tcW w:w="1750" w:type="dxa"/>
-            <w:tcMar>
-              <w:top w:w="40" w:type="dxa"/>
-              <w:left w:w="100" w:type="dxa"/>
-              <w:bottom w:w="40" w:type="dxa"/>
-              <w:right w:w="100" w:type="dxa"/>
-            </w:tcMar>
-            <w:vAlign w:val="center"/>
-          </w:tcPr>
-          <w:p>
-            <w:pPr>
-              <w:spacing w:after="0" w:line="240" w:lineRule="auto"/>
-              <w:jc w:val="right"/>
-            </w:pPr>
-            <w:r>
-              <w:rPr>
-                <w:sz w:val="20"/>
-                <w:szCs w:val="20"/>
-              </w:rPr>
-              <w:t>88,42</w:t>
-            </w:r>
-          </w:p>
-        </w:tc>
-        <w:tc>
-          <w:tcPr>
-            <w:tcW w:w="2227" w:type="dxa"/>
-            <w:tcMar>
-              <w:top w:w="40" w:type="dxa"/>
-              <w:left w:w="100" w:type="dxa"/>
-              <w:bottom w:w="40" w:type="dxa"/>
-              <w:right w:w="100" w:type="dxa"/>
-            </w:tcMar>
-            <w:vAlign w:val="center"/>
-          </w:tcPr>
-          <w:p>
-            <w:pPr>
-              <w:spacing w:after="0" w:line="240" w:lineRule="auto"/>
-              <w:jc w:val="right"/>
-            </w:pPr>
-            <w:r>
-              <w:rPr>
-                <w:sz w:val="20"/>
-                <w:szCs w:val="20"/>
-              </w:rPr>
-              <w:t>-0,55</w:t>
-            </w:r>
-          </w:p>
-        </w:tc>
-      </w:tr>
-      <w:tr>
-        <w:trPr>
-          <w:cantSplit/>
-          <w:jc w:val="center"/>
-        </w:trPr>
-        <w:tc>
-          <w:tcPr>
-            <w:tcW w:w="3500" w:type="dxa"/>
-            <w:tcMar>
-              <w:top w:w="40" w:type="dxa"/>
-              <w:left w:w="100" w:type="dxa"/>
-              <w:bottom w:w="40" w:type="dxa"/>
-              <w:right w:w="100" w:type="dxa"/>
-            </w:tcMar>
-            <w:vAlign w:val="center"/>
-          </w:tcPr>
-          <w:p>
-            <w:pPr>
-              <w:spacing w:after="0" w:line="240" w:lineRule="auto"/>
-            </w:pPr>
-            <w:r>
-              <w:rPr>
-                <w:sz w:val="20"/>
-                <w:szCs w:val="20"/>
-              </w:rPr>
-              <w:t>Lauren Buzzeo</w:t>
-            </w:r>
-          </w:p>
-        </w:tc>
-        <w:tc>
-          <w:tcPr>
-            <w:tcW w:w="1591" w:type="dxa"/>
-            <w:tcMar>
-              <w:top w:w="40" w:type="dxa"/>
-              <w:left w:w="100" w:type="dxa"/>
-              <w:bottom w:w="40" w:type="dxa"/>
-              <w:right w:w="100" w:type="dxa"/>
-            </w:tcMar>
-            <w:vAlign w:val="center"/>
-          </w:tcPr>
-          <w:p>
-            <w:pPr>
-              <w:spacing w:after="0" w:line="240" w:lineRule="auto"/>
-              <w:jc w:val="right"/>
-            </w:pPr>
-            <w:r>
-              <w:rPr>
-                <w:sz w:val="20"/>
-                <w:szCs w:val="20"/>
-              </w:rPr>
-              <w:t>1.700</w:t>
-            </w:r>
-          </w:p>
-        </w:tc>
-        <w:tc>
-          <w:tcPr>
-            <w:tcW w:w="1750" w:type="dxa"/>
-            <w:tcMar>
-              <w:top w:w="40" w:type="dxa"/>
-              <w:left w:w="100" w:type="dxa"/>
-              <w:bottom w:w="40" w:type="dxa"/>
-              <w:right w:w="100" w:type="dxa"/>
-            </w:tcMar>
-            <w:vAlign w:val="center"/>
-          </w:tcPr>
-          <w:p>
-            <w:pPr>
-              <w:spacing w:after="0" w:line="240" w:lineRule="auto"/>
-              <w:jc w:val="right"/>
-            </w:pPr>
-            <w:r>
-              <w:rPr>
-                <w:sz w:val="20"/>
-                <w:szCs w:val="20"/>
-              </w:rPr>
-              <w:t>87,69</w:t>
-            </w:r>
-          </w:p>
-        </w:tc>
-        <w:tc>
-          <w:tcPr>
-            <w:tcW w:w="2227" w:type="dxa"/>
-            <w:tcMar>
-              <w:top w:w="40" w:type="dxa"/>
-              <w:left w:w="100" w:type="dxa"/>
-              <w:bottom w:w="40" w:type="dxa"/>
-              <w:right w:w="100" w:type="dxa"/>
-            </w:tcMar>
-            <w:vAlign w:val="center"/>
-          </w:tcPr>
-          <w:p>
-            <w:pPr>
-              <w:spacing w:after="0" w:line="240" w:lineRule="auto"/>
-              <w:jc w:val="right"/>
-            </w:pPr>
-            <w:r>
-              <w:rPr>
-                <w:sz w:val="20"/>
-                <w:szCs w:val="20"/>
-              </w:rPr>
-              <w:t>-1,45</w:t>
-            </w:r>
-          </w:p>
-        </w:tc>
-      </w:tr>
-      <w:tr>
-        <w:trPr>
-          <w:cantSplit/>
-          <w:jc w:val="center"/>
-        </w:trPr>
-        <w:tc>
-          <w:tcPr>
-            <w:tcW w:w="3500" w:type="dxa"/>
+            <w:tcW w:w="3023" w:type="dxa"/>
             <w:tcMar>
               <w:top w:w="40" w:type="dxa"/>
               <w:left w:w="100" w:type="dxa"/>
@@ -13660,7 +11858,7 @@
         </w:tc>
         <w:tc>
           <w:tcPr>
-            <w:tcW w:w="1591" w:type="dxa"/>
+            <w:tcW w:w="1511" w:type="dxa"/>
             <w:tcMar>
               <w:top w:w="40" w:type="dxa"/>
               <w:left w:w="100" w:type="dxa"/>
@@ -13685,7 +11883,7 @@
         </w:tc>
         <w:tc>
           <w:tcPr>
-            <w:tcW w:w="1750" w:type="dxa"/>
+            <w:tcW w:w="1511" w:type="dxa"/>
             <w:tcMar>
               <w:top w:w="40" w:type="dxa"/>
               <w:left w:w="100" w:type="dxa"/>
@@ -13710,7 +11908,7 @@
         </w:tc>
         <w:tc>
           <w:tcPr>
-            <w:tcW w:w="2227" w:type="dxa"/>
+            <w:tcW w:w="3023" w:type="dxa"/>
             <w:tcMar>
               <w:top w:w="40" w:type="dxa"/>
               <w:left w:w="100" w:type="dxa"/>
@@ -13742,14 +11940,14 @@
         <w:jc w:val="both"/>
       </w:pPr>
       <w:r>
-        <w:t>Una vez controlado, la diferencia entre Krebiehl y Schachner baja de 3,77 a 0,78 puntos, y Schachner queda prácticamente en el promedio (-0,02). Casi todos los catadores quedan a menos de un punto del promedio. La excepción es Lauren Buzzeo (-1,45), aunque en su caso solo 439 reseñas entraron en la comparación. En general, la diferencia entre catadores se explicaba más por los vinos que les tocaban que por su criterio.</w:t>
+        <w:t>Comparados así, Krebiehl queda apenas 0,76 puntos arriba y Schachner prácticamente en el promedio. La diferencia entre los dos baja de 3,77 a 0,78 puntos, así que se explicaba más por los vinos que les tocaban que por su criterio. La Figura 8 muestra lo mismo para los doce catadores con más reseñas.</w:t>
       </w:r>
     </w:p>
     <w:p>
       <w:pPr>
         <w:pStyle w:val="Heading1"/>
       </w:pPr>
-      <w:bookmarkStart w:id="27" w:name="_Toc241487039"/>
+      <w:bookmarkStart w:id="27" w:name="_Toc241506741"/>
       <w:r>
         <w:t>8. Conclusiones</w:t>
       </w:r>
@@ -13779,7 +11977,7 @@
         <w:jc w:val="both"/>
       </w:pPr>
       <w:r>
-        <w:t>Sobre la relación entre variables: el precio crece de forma aproximadamente exponencial con el puntaje, el largo de la reseña también acompaña al puntaje, y las diferencias entre catadores casi desaparecen al controlar por país y variedad.</w:t>
+        <w:t>Sobre la relación entre variables: el precio crece de forma aproximadamente exponencial con el puntaje, el largo de la reseña también acompaña al puntaje, y las diferencias entre catadores casi desaparecen al comparar con vinos del mismo país y variedad.</w:t>
       </w:r>
     </w:p>
     <w:p>
@@ -13888,55 +12086,6 @@
         <w:szCs w:val="18"/>
       </w:rPr>
       <w:t>1</w:t>
-    </w:r>
-    <w:r>
-      <w:rPr>
-        <w:color w:val="555555"/>
-        <w:sz w:val="18"/>
-        <w:szCs w:val="18"/>
-      </w:rPr>
-      <w:fldChar w:fldCharType="end"/>
-    </w:r>
-    <w:r>
-      <w:rPr>
-        <w:color w:val="555555"/>
-        <w:sz w:val="18"/>
-        <w:szCs w:val="18"/>
-      </w:rPr>
-      <w:t xml:space="preserve"> de </w:t>
-    </w:r>
-    <w:r>
-      <w:rPr>
-        <w:color w:val="555555"/>
-        <w:sz w:val="18"/>
-        <w:szCs w:val="18"/>
-      </w:rPr>
-      <w:fldChar w:fldCharType="begin"/>
-    </w:r>
-    <w:r>
-      <w:rPr>
-        <w:color w:val="555555"/>
-        <w:sz w:val="18"/>
-        <w:szCs w:val="18"/>
-      </w:rPr>
-      <w:instrText>SECTIONPAGES</w:instrText>
-    </w:r>
-    <w:r>
-      <w:rPr>
-        <w:color w:val="555555"/>
-        <w:sz w:val="18"/>
-        <w:szCs w:val="18"/>
-      </w:rPr>
-      <w:fldChar w:fldCharType="separate"/>
-    </w:r>
-    <w:r>
-      <w:rPr>
-        <w:noProof/>
-        <w:color w:val="555555"/>
-        <w:sz w:val="18"/>
-        <w:szCs w:val="18"/>
-      </w:rPr>
-      <w:t>16</w:t>
     </w:r>
     <w:r>
       <w:rPr>

</xml_diff>